<commit_message>
docs: compare original memory functions with implemented changes
</commit_message>
<xml_diff>
--- a/docs/presentation/memory-implementation-walkthrough.docx
+++ b/docs/presentation/memory-implementation-walkthrough.docx
@@ -5041,6 +5041,3563 @@
         </w:rPr>
         <w:t>Modified kernel/trap.c, usertrap load/store-fault branch, v0.1. A failed recovery marks the process for termination. The main feature sections retain the exact sbrk, COW, swap-in, FIFO and Clock excerpts.</w:t>
       </w:r>
+    </w:p>
+    <w:p>
+      <w:pPr>
+        <w:pStyle w:val="Heading1"/>
+        <w:pageBreakBefore/>
+      </w:pPr>
+      <w:r>
+        <w:t>Function changes in allocation and mapping</w:t>
+      </w:r>
+    </w:p>
+    <w:p>
+      <w:pPr>
+        <w:spacing w:after="120" w:line="247" w:lineRule="auto"/>
+      </w:pPr>
+      <w:r>
+        <w:rPr>
+          <w:rFonts w:ascii="Calibri" w:hAnsi="Calibri"/>
+          <w:sz w:val="22"/>
+        </w:rPr>
+        <w:t>These comparisons describe the earlier v0.0 behavior and the memory changes introduced through v0.4. Each row states what the function originally did and what changed. The existing feature sections retain the corresponding code excerpts and resource numbers.</w:t>
+      </w:r>
+    </w:p>
+    <w:tbl>
+      <w:tblPr>
+        <w:tblW w:type="dxa" w:w="10166"/>
+        <w:jc w:val="center"/>
+        <w:tblLayout w:type="fixed"/>
+        <w:tblLook w:firstColumn="1" w:firstRow="1" w:lastColumn="0" w:lastRow="0" w:noHBand="0" w:noVBand="1" w:val="04A0"/>
+      </w:tblPr>
+      <w:tblGrid>
+        <w:gridCol w:w="2880"/>
+        <w:gridCol w:w="2952"/>
+        <w:gridCol w:w="4334"/>
+      </w:tblGrid>
+      <w:tr>
+        <w:trPr>
+          <w:cantSplit/>
+          <w:tblHeader/>
+        </w:trPr>
+        <w:tc>
+          <w:tcPr>
+            <w:tcW w:type="dxa" w:w="2880"/>
+            <w:vAlign w:val="top"/>
+            <w:tcMar>
+              <w:top w:w="85" w:type="dxa"/>
+              <w:bottom w:w="85" w:type="dxa"/>
+              <w:left w:w="85" w:type="dxa"/>
+              <w:right w:w="85" w:type="dxa"/>
+            </w:tcMar>
+            <w:tcBorders>
+              <w:top w:val="single" w:sz="4" w:color="D5DADD"/>
+              <w:bottom w:val="single" w:sz="4" w:color="D5DADD"/>
+              <w:left w:val="single" w:sz="4" w:color="D5DADD"/>
+              <w:right w:val="single" w:sz="4" w:color="D5DADD"/>
+            </w:tcBorders>
+            <w:shd w:fill="EDF1F4"/>
+          </w:tcPr>
+          <w:p>
+            <w:pPr>
+              <w:spacing w:after="60" w:line="245" w:lineRule="auto"/>
+            </w:pPr>
+            <w:r>
+              <w:rPr>
+                <w:rFonts w:ascii="Calibri" w:hAnsi="Calibri"/>
+                <w:b/>
+                <w:sz w:val="20"/>
+              </w:rPr>
+              <w:t>Function and location</w:t>
+            </w:r>
+          </w:p>
+        </w:tc>
+        <w:tc>
+          <w:tcPr>
+            <w:tcW w:type="dxa" w:w="2952"/>
+            <w:vAlign w:val="top"/>
+            <w:tcMar>
+              <w:top w:w="85" w:type="dxa"/>
+              <w:bottom w:w="85" w:type="dxa"/>
+              <w:left w:w="85" w:type="dxa"/>
+              <w:right w:w="85" w:type="dxa"/>
+            </w:tcMar>
+            <w:tcBorders>
+              <w:top w:val="single" w:sz="4" w:color="D5DADD"/>
+              <w:bottom w:val="single" w:sz="4" w:color="D5DADD"/>
+              <w:left w:val="single" w:sz="4" w:color="D5DADD"/>
+              <w:right w:val="single" w:sz="4" w:color="D5DADD"/>
+            </w:tcBorders>
+            <w:shd w:fill="EDF1F4"/>
+          </w:tcPr>
+          <w:p>
+            <w:pPr>
+              <w:spacing w:after="60" w:line="245" w:lineRule="auto"/>
+            </w:pPr>
+            <w:r>
+              <w:rPr>
+                <w:rFonts w:ascii="Calibri" w:hAnsi="Calibri"/>
+                <w:b/>
+                <w:sz w:val="20"/>
+              </w:rPr>
+              <w:t>Earlier behavior</w:t>
+            </w:r>
+          </w:p>
+        </w:tc>
+        <w:tc>
+          <w:tcPr>
+            <w:tcW w:type="dxa" w:w="4334"/>
+            <w:vAlign w:val="top"/>
+            <w:tcMar>
+              <w:top w:w="85" w:type="dxa"/>
+              <w:bottom w:w="85" w:type="dxa"/>
+              <w:left w:w="85" w:type="dxa"/>
+              <w:right w:w="85" w:type="dxa"/>
+            </w:tcMar>
+            <w:tcBorders>
+              <w:top w:val="single" w:sz="4" w:color="D5DADD"/>
+              <w:bottom w:val="single" w:sz="4" w:color="D5DADD"/>
+              <w:left w:val="single" w:sz="4" w:color="D5DADD"/>
+              <w:right w:val="single" w:sz="4" w:color="D5DADD"/>
+            </w:tcBorders>
+            <w:shd w:fill="EDF1F4"/>
+          </w:tcPr>
+          <w:p>
+            <w:pPr>
+              <w:spacing w:after="60" w:line="245" w:lineRule="auto"/>
+            </w:pPr>
+            <w:r>
+              <w:rPr>
+                <w:rFonts w:ascii="Calibri" w:hAnsi="Calibri"/>
+                <w:b/>
+                <w:sz w:val="20"/>
+              </w:rPr>
+              <w:t>Implemented change and consequence</w:t>
+            </w:r>
+          </w:p>
+        </w:tc>
+      </w:tr>
+      <w:tr>
+        <w:trPr>
+          <w:cantSplit/>
+        </w:trPr>
+        <w:tc>
+          <w:tcPr>
+            <w:tcW w:type="dxa" w:w="2880"/>
+            <w:vAlign w:val="top"/>
+            <w:tcMar>
+              <w:top w:w="85" w:type="dxa"/>
+              <w:bottom w:w="85" w:type="dxa"/>
+              <w:left w:w="85" w:type="dxa"/>
+              <w:right w:w="85" w:type="dxa"/>
+            </w:tcMar>
+            <w:tcBorders>
+              <w:top w:val="single" w:sz="4" w:color="D5DADD"/>
+              <w:bottom w:val="single" w:sz="4" w:color="D5DADD"/>
+              <w:left w:val="single" w:sz="4" w:color="D5DADD"/>
+              <w:right w:val="single" w:sz="4" w:color="D5DADD"/>
+            </w:tcBorders>
+          </w:tcPr>
+          <w:p>
+            <w:pPr>
+              <w:spacing w:after="60" w:line="245" w:lineRule="auto"/>
+            </w:pPr>
+            <w:r>
+              <w:rPr>
+                <w:rFonts w:ascii="Calibri" w:hAnsi="Calibri"/>
+                <w:b w:val="0"/>
+                <w:sz w:val="20"/>
+              </w:rPr>
+              <w:t>sys_sbrk</w:t>
+            </w:r>
+            <w:r>
+              <w:br/>
+            </w:r>
+            <w:r>
+              <w:rPr>
+                <w:rFonts w:ascii="Calibri" w:hAnsi="Calibri"/>
+                <w:b w:val="0"/>
+                <w:sz w:val="20"/>
+              </w:rPr>
+              <w:t>kernel/sysproc.c</w:t>
+            </w:r>
+            <w:r>
+              <w:br/>
+            </w:r>
+            <w:r>
+              <w:rPr>
+                <w:rFonts w:ascii="Calibri" w:hAnsi="Calibri"/>
+                <w:b w:val="0"/>
+                <w:sz w:val="20"/>
+              </w:rPr>
+              <w:t>Modified</w:t>
+            </w:r>
+          </w:p>
+        </w:tc>
+        <w:tc>
+          <w:tcPr>
+            <w:tcW w:type="dxa" w:w="2952"/>
+            <w:vAlign w:val="top"/>
+            <w:tcMar>
+              <w:top w:w="85" w:type="dxa"/>
+              <w:bottom w:w="85" w:type="dxa"/>
+              <w:left w:w="85" w:type="dxa"/>
+              <w:right w:w="85" w:type="dxa"/>
+            </w:tcMar>
+            <w:tcBorders>
+              <w:top w:val="single" w:sz="4" w:color="D5DADD"/>
+              <w:bottom w:val="single" w:sz="4" w:color="D5DADD"/>
+              <w:left w:val="single" w:sz="4" w:color="D5DADD"/>
+              <w:right w:val="single" w:sz="4" w:color="D5DADD"/>
+            </w:tcBorders>
+          </w:tcPr>
+          <w:p>
+            <w:pPr>
+              <w:spacing w:after="60" w:line="245" w:lineRule="auto"/>
+            </w:pPr>
+            <w:r>
+              <w:rPr>
+                <w:rFonts w:ascii="Calibri" w:hAnsi="Calibri"/>
+                <w:b w:val="0"/>
+                <w:sz w:val="20"/>
+              </w:rPr>
+              <w:t>Called growproc(n), including for positive requests, so heap growth attempted physical allocation before returning.</w:t>
+            </w:r>
+          </w:p>
+        </w:tc>
+        <w:tc>
+          <w:tcPr>
+            <w:tcW w:type="dxa" w:w="4334"/>
+            <w:vAlign w:val="top"/>
+            <w:tcMar>
+              <w:top w:w="85" w:type="dxa"/>
+              <w:bottom w:w="85" w:type="dxa"/>
+              <w:left w:w="85" w:type="dxa"/>
+              <w:right w:w="85" w:type="dxa"/>
+            </w:tcMar>
+            <w:tcBorders>
+              <w:top w:val="single" w:sz="4" w:color="D5DADD"/>
+              <w:bottom w:val="single" w:sz="4" w:color="D5DADD"/>
+              <w:left w:val="single" w:sz="4" w:color="D5DADD"/>
+              <w:right w:val="single" w:sz="4" w:color="D5DADD"/>
+            </w:tcBorders>
+          </w:tcPr>
+          <w:p>
+            <w:pPr>
+              <w:spacing w:after="60" w:line="245" w:lineRule="auto"/>
+            </w:pPr>
+            <w:r>
+              <w:rPr>
+                <w:rFonts w:ascii="Calibri" w:hAnsi="Calibri"/>
+                <w:b w:val="0"/>
+                <w:sz w:val="20"/>
+              </w:rPr>
+              <w:t>Positive requests validate the address bound and increase p-&gt;sz without allocating frames. Physical allocation moves to first access. Negative requests still use growproc.</w:t>
+            </w:r>
+          </w:p>
+        </w:tc>
+      </w:tr>
+      <w:tr>
+        <w:trPr>
+          <w:cantSplit/>
+        </w:trPr>
+        <w:tc>
+          <w:tcPr>
+            <w:tcW w:type="dxa" w:w="2880"/>
+            <w:vAlign w:val="top"/>
+            <w:tcMar>
+              <w:top w:w="85" w:type="dxa"/>
+              <w:bottom w:w="85" w:type="dxa"/>
+              <w:left w:w="85" w:type="dxa"/>
+              <w:right w:w="85" w:type="dxa"/>
+            </w:tcMar>
+            <w:tcBorders>
+              <w:top w:val="single" w:sz="4" w:color="D5DADD"/>
+              <w:bottom w:val="single" w:sz="4" w:color="D5DADD"/>
+              <w:left w:val="single" w:sz="4" w:color="D5DADD"/>
+              <w:right w:val="single" w:sz="4" w:color="D5DADD"/>
+            </w:tcBorders>
+          </w:tcPr>
+          <w:p>
+            <w:pPr>
+              <w:spacing w:after="60" w:line="245" w:lineRule="auto"/>
+            </w:pPr>
+            <w:r>
+              <w:rPr>
+                <w:rFonts w:ascii="Calibri" w:hAnsi="Calibri"/>
+                <w:b w:val="0"/>
+                <w:sz w:val="20"/>
+              </w:rPr>
+              <w:t>growproc</w:t>
+            </w:r>
+            <w:r>
+              <w:br/>
+            </w:r>
+            <w:r>
+              <w:rPr>
+                <w:rFonts w:ascii="Calibri" w:hAnsi="Calibri"/>
+                <w:b w:val="0"/>
+                <w:sz w:val="20"/>
+              </w:rPr>
+              <w:t>kernel/proc.c</w:t>
+            </w:r>
+            <w:r>
+              <w:br/>
+            </w:r>
+            <w:r>
+              <w:rPr>
+                <w:rFonts w:ascii="Calibri" w:hAnsi="Calibri"/>
+                <w:b w:val="0"/>
+                <w:sz w:val="20"/>
+              </w:rPr>
+              <w:t>Retained</w:t>
+            </w:r>
+          </w:p>
+        </w:tc>
+        <w:tc>
+          <w:tcPr>
+            <w:tcW w:type="dxa" w:w="2952"/>
+            <w:vAlign w:val="top"/>
+            <w:tcMar>
+              <w:top w:w="85" w:type="dxa"/>
+              <w:bottom w:w="85" w:type="dxa"/>
+              <w:left w:w="85" w:type="dxa"/>
+              <w:right w:w="85" w:type="dxa"/>
+            </w:tcMar>
+            <w:tcBorders>
+              <w:top w:val="single" w:sz="4" w:color="D5DADD"/>
+              <w:bottom w:val="single" w:sz="4" w:color="D5DADD"/>
+              <w:left w:val="single" w:sz="4" w:color="D5DADD"/>
+              <w:right w:val="single" w:sz="4" w:color="D5DADD"/>
+            </w:tcBorders>
+          </w:tcPr>
+          <w:p>
+            <w:pPr>
+              <w:spacing w:after="60" w:line="245" w:lineRule="auto"/>
+            </w:pPr>
+            <w:r>
+              <w:rPr>
+                <w:rFonts w:ascii="Calibri" w:hAnsi="Calibri"/>
+                <w:b w:val="0"/>
+                <w:sz w:val="20"/>
+              </w:rPr>
+              <w:t>Used uvmalloc/uvmdealloc to grow or shrink mapped memory.</w:t>
+            </w:r>
+          </w:p>
+        </w:tc>
+        <w:tc>
+          <w:tcPr>
+            <w:tcW w:type="dxa" w:w="4334"/>
+            <w:vAlign w:val="top"/>
+            <w:tcMar>
+              <w:top w:w="85" w:type="dxa"/>
+              <w:bottom w:w="85" w:type="dxa"/>
+              <w:left w:w="85" w:type="dxa"/>
+              <w:right w:w="85" w:type="dxa"/>
+            </w:tcMar>
+            <w:tcBorders>
+              <w:top w:val="single" w:sz="4" w:color="D5DADD"/>
+              <w:bottom w:val="single" w:sz="4" w:color="D5DADD"/>
+              <w:left w:val="single" w:sz="4" w:color="D5DADD"/>
+              <w:right w:val="single" w:sz="4" w:color="D5DADD"/>
+            </w:tcBorders>
+          </w:tcPr>
+          <w:p>
+            <w:pPr>
+              <w:spacing w:after="60" w:line="245" w:lineRule="auto"/>
+            </w:pPr>
+            <w:r>
+              <w:rPr>
+                <w:rFonts w:ascii="Calibri" w:hAnsi="Calibri"/>
+                <w:b w:val="0"/>
+                <w:sz w:val="20"/>
+              </w:rPr>
+              <w:t>The function body is unchanged in this comparison. sys_sbrk bypasses it for positive lazy growth and retains it for shrinking.</w:t>
+            </w:r>
+          </w:p>
+        </w:tc>
+      </w:tr>
+      <w:tr>
+        <w:trPr>
+          <w:cantSplit/>
+        </w:trPr>
+        <w:tc>
+          <w:tcPr>
+            <w:tcW w:type="dxa" w:w="2880"/>
+            <w:vAlign w:val="top"/>
+            <w:tcMar>
+              <w:top w:w="85" w:type="dxa"/>
+              <w:bottom w:w="85" w:type="dxa"/>
+              <w:left w:w="85" w:type="dxa"/>
+              <w:right w:w="85" w:type="dxa"/>
+            </w:tcMar>
+            <w:tcBorders>
+              <w:top w:val="single" w:sz="4" w:color="D5DADD"/>
+              <w:bottom w:val="single" w:sz="4" w:color="D5DADD"/>
+              <w:left w:val="single" w:sz="4" w:color="D5DADD"/>
+              <w:right w:val="single" w:sz="4" w:color="D5DADD"/>
+            </w:tcBorders>
+          </w:tcPr>
+          <w:p>
+            <w:pPr>
+              <w:spacing w:after="60" w:line="245" w:lineRule="auto"/>
+            </w:pPr>
+            <w:r>
+              <w:rPr>
+                <w:rFonts w:ascii="Calibri" w:hAnsi="Calibri"/>
+                <w:b w:val="0"/>
+                <w:sz w:val="20"/>
+              </w:rPr>
+              <w:t>usertrap</w:t>
+            </w:r>
+            <w:r>
+              <w:br/>
+            </w:r>
+            <w:r>
+              <w:rPr>
+                <w:rFonts w:ascii="Calibri" w:hAnsi="Calibri"/>
+                <w:b w:val="0"/>
+                <w:sz w:val="20"/>
+              </w:rPr>
+              <w:t>kernel/trap.c</w:t>
+            </w:r>
+            <w:r>
+              <w:br/>
+            </w:r>
+            <w:r>
+              <w:rPr>
+                <w:rFonts w:ascii="Calibri" w:hAnsi="Calibri"/>
+                <w:b w:val="0"/>
+                <w:sz w:val="20"/>
+              </w:rPr>
+              <w:t>Modified</w:t>
+            </w:r>
+          </w:p>
+        </w:tc>
+        <w:tc>
+          <w:tcPr>
+            <w:tcW w:type="dxa" w:w="2952"/>
+            <w:vAlign w:val="top"/>
+            <w:tcMar>
+              <w:top w:w="85" w:type="dxa"/>
+              <w:bottom w:w="85" w:type="dxa"/>
+              <w:left w:w="85" w:type="dxa"/>
+              <w:right w:w="85" w:type="dxa"/>
+            </w:tcMar>
+            <w:tcBorders>
+              <w:top w:val="single" w:sz="4" w:color="D5DADD"/>
+              <w:bottom w:val="single" w:sz="4" w:color="D5DADD"/>
+              <w:left w:val="single" w:sz="4" w:color="D5DADD"/>
+              <w:right w:val="single" w:sz="4" w:color="D5DADD"/>
+            </w:tcBorders>
+          </w:tcPr>
+          <w:p>
+            <w:pPr>
+              <w:spacing w:after="60" w:line="245" w:lineRule="auto"/>
+            </w:pPr>
+            <w:r>
+              <w:rPr>
+                <w:rFonts w:ascii="Calibri" w:hAnsi="Calibri"/>
+                <w:b w:val="0"/>
+                <w:sz w:val="20"/>
+              </w:rPr>
+              <w:t>An unhandled user page fault followed the unexpected-trap path and marked the process for termination.</w:t>
+            </w:r>
+          </w:p>
+        </w:tc>
+        <w:tc>
+          <w:tcPr>
+            <w:tcW w:type="dxa" w:w="4334"/>
+            <w:vAlign w:val="top"/>
+            <w:tcMar>
+              <w:top w:w="85" w:type="dxa"/>
+              <w:bottom w:w="85" w:type="dxa"/>
+              <w:left w:w="85" w:type="dxa"/>
+              <w:right w:w="85" w:type="dxa"/>
+            </w:tcMar>
+            <w:tcBorders>
+              <w:top w:val="single" w:sz="4" w:color="D5DADD"/>
+              <w:bottom w:val="single" w:sz="4" w:color="D5DADD"/>
+              <w:left w:val="single" w:sz="4" w:color="D5DADD"/>
+              <w:right w:val="single" w:sz="4" w:color="D5DADD"/>
+            </w:tcBorders>
+          </w:tcPr>
+          <w:p>
+            <w:pPr>
+              <w:spacing w:after="60" w:line="245" w:lineRule="auto"/>
+            </w:pPr>
+            <w:r>
+              <w:rPr>
+                <w:rFonts w:ascii="Calibri" w:hAnsi="Calibri"/>
+                <w:b w:val="0"/>
+                <w:sz w:val="20"/>
+              </w:rPr>
+              <w:t>The memory-fault branch calls handle_page_fault with the fault address and access information. Successful recovery resumes execution; failed recovery marks the process killed.</w:t>
+            </w:r>
+          </w:p>
+        </w:tc>
+      </w:tr>
+      <w:tr>
+        <w:trPr>
+          <w:cantSplit/>
+        </w:trPr>
+        <w:tc>
+          <w:tcPr>
+            <w:tcW w:type="dxa" w:w="2880"/>
+            <w:vAlign w:val="top"/>
+            <w:tcMar>
+              <w:top w:w="85" w:type="dxa"/>
+              <w:bottom w:w="85" w:type="dxa"/>
+              <w:left w:w="85" w:type="dxa"/>
+              <w:right w:w="85" w:type="dxa"/>
+            </w:tcMar>
+            <w:tcBorders>
+              <w:top w:val="single" w:sz="4" w:color="D5DADD"/>
+              <w:bottom w:val="single" w:sz="4" w:color="D5DADD"/>
+              <w:left w:val="single" w:sz="4" w:color="D5DADD"/>
+              <w:right w:val="single" w:sz="4" w:color="D5DADD"/>
+            </w:tcBorders>
+          </w:tcPr>
+          <w:p>
+            <w:pPr>
+              <w:spacing w:after="60" w:line="245" w:lineRule="auto"/>
+            </w:pPr>
+            <w:r>
+              <w:rPr>
+                <w:rFonts w:ascii="Calibri" w:hAnsi="Calibri"/>
+                <w:b w:val="0"/>
+                <w:sz w:val="20"/>
+              </w:rPr>
+              <w:t>uvmalloc</w:t>
+            </w:r>
+            <w:r>
+              <w:br/>
+            </w:r>
+            <w:r>
+              <w:rPr>
+                <w:rFonts w:ascii="Calibri" w:hAnsi="Calibri"/>
+                <w:b w:val="0"/>
+                <w:sz w:val="20"/>
+              </w:rPr>
+              <w:t>kernel/vm.c</w:t>
+            </w:r>
+            <w:r>
+              <w:br/>
+            </w:r>
+            <w:r>
+              <w:rPr>
+                <w:rFonts w:ascii="Calibri" w:hAnsi="Calibri"/>
+                <w:b w:val="0"/>
+                <w:sz w:val="20"/>
+              </w:rPr>
+              <w:t>Modified</w:t>
+            </w:r>
+          </w:p>
+        </w:tc>
+        <w:tc>
+          <w:tcPr>
+            <w:tcW w:type="dxa" w:w="2952"/>
+            <w:vAlign w:val="top"/>
+            <w:tcMar>
+              <w:top w:w="85" w:type="dxa"/>
+              <w:bottom w:w="85" w:type="dxa"/>
+              <w:left w:w="85" w:type="dxa"/>
+              <w:right w:w="85" w:type="dxa"/>
+            </w:tcMar>
+            <w:tcBorders>
+              <w:top w:val="single" w:sz="4" w:color="D5DADD"/>
+              <w:bottom w:val="single" w:sz="4" w:color="D5DADD"/>
+              <w:left w:val="single" w:sz="4" w:color="D5DADD"/>
+              <w:right w:val="single" w:sz="4" w:color="D5DADD"/>
+            </w:tcBorders>
+          </w:tcPr>
+          <w:p>
+            <w:pPr>
+              <w:spacing w:after="60" w:line="245" w:lineRule="auto"/>
+            </w:pPr>
+            <w:r>
+              <w:rPr>
+                <w:rFonts w:ascii="Calibri" w:hAnsi="Calibri"/>
+                <w:b w:val="0"/>
+                <w:sz w:val="20"/>
+              </w:rPr>
+              <w:t>Allocated frames using kalloc, zeroed them and installed mappings.</w:t>
+            </w:r>
+          </w:p>
+        </w:tc>
+        <w:tc>
+          <w:tcPr>
+            <w:tcW w:type="dxa" w:w="4334"/>
+            <w:vAlign w:val="top"/>
+            <w:tcMar>
+              <w:top w:w="85" w:type="dxa"/>
+              <w:bottom w:w="85" w:type="dxa"/>
+              <w:left w:w="85" w:type="dxa"/>
+              <w:right w:w="85" w:type="dxa"/>
+            </w:tcMar>
+            <w:tcBorders>
+              <w:top w:val="single" w:sz="4" w:color="D5DADD"/>
+              <w:bottom w:val="single" w:sz="4" w:color="D5DADD"/>
+              <w:left w:val="single" w:sz="4" w:color="D5DADD"/>
+              <w:right w:val="single" w:sz="4" w:color="D5DADD"/>
+            </w:tcBorders>
+          </w:tcPr>
+          <w:p>
+            <w:pPr>
+              <w:spacing w:after="60" w:line="245" w:lineRule="auto"/>
+            </w:pPr>
+            <w:r>
+              <w:rPr>
+                <w:rFonts w:ascii="Calibri" w:hAnsi="Calibri"/>
+                <w:b w:val="0"/>
+                <w:sz w:val="20"/>
+              </w:rPr>
+              <w:t>Uses kalloc_user and tracks each new user frame for eviction. Zeroing, mapping and allocation-failure cleanup remain necessary.</w:t>
+            </w:r>
+          </w:p>
+        </w:tc>
+      </w:tr>
+      <w:tr>
+        <w:trPr>
+          <w:cantSplit/>
+        </w:trPr>
+        <w:tc>
+          <w:tcPr>
+            <w:tcW w:type="dxa" w:w="2880"/>
+            <w:vAlign w:val="top"/>
+            <w:tcMar>
+              <w:top w:w="85" w:type="dxa"/>
+              <w:bottom w:w="85" w:type="dxa"/>
+              <w:left w:w="85" w:type="dxa"/>
+              <w:right w:w="85" w:type="dxa"/>
+            </w:tcMar>
+            <w:tcBorders>
+              <w:top w:val="single" w:sz="4" w:color="D5DADD"/>
+              <w:bottom w:val="single" w:sz="4" w:color="D5DADD"/>
+              <w:left w:val="single" w:sz="4" w:color="D5DADD"/>
+              <w:right w:val="single" w:sz="4" w:color="D5DADD"/>
+            </w:tcBorders>
+          </w:tcPr>
+          <w:p>
+            <w:pPr>
+              <w:spacing w:after="60" w:line="245" w:lineRule="auto"/>
+            </w:pPr>
+            <w:r>
+              <w:rPr>
+                <w:rFonts w:ascii="Calibri" w:hAnsi="Calibri"/>
+                <w:b w:val="0"/>
+                <w:sz w:val="20"/>
+              </w:rPr>
+              <w:t>uvmcopy</w:t>
+            </w:r>
+            <w:r>
+              <w:br/>
+            </w:r>
+            <w:r>
+              <w:rPr>
+                <w:rFonts w:ascii="Calibri" w:hAnsi="Calibri"/>
+                <w:b w:val="0"/>
+                <w:sz w:val="20"/>
+              </w:rPr>
+              <w:t>kernel/vm.c</w:t>
+            </w:r>
+            <w:r>
+              <w:br/>
+            </w:r>
+            <w:r>
+              <w:rPr>
+                <w:rFonts w:ascii="Calibri" w:hAnsi="Calibri"/>
+                <w:b w:val="0"/>
+                <w:sz w:val="20"/>
+              </w:rPr>
+              <w:t>Modified</w:t>
+            </w:r>
+          </w:p>
+        </w:tc>
+        <w:tc>
+          <w:tcPr>
+            <w:tcW w:type="dxa" w:w="2952"/>
+            <w:vAlign w:val="top"/>
+            <w:tcMar>
+              <w:top w:w="85" w:type="dxa"/>
+              <w:bottom w:w="85" w:type="dxa"/>
+              <w:left w:w="85" w:type="dxa"/>
+              <w:right w:w="85" w:type="dxa"/>
+            </w:tcMar>
+            <w:tcBorders>
+              <w:top w:val="single" w:sz="4" w:color="D5DADD"/>
+              <w:bottom w:val="single" w:sz="4" w:color="D5DADD"/>
+              <w:left w:val="single" w:sz="4" w:color="D5DADD"/>
+              <w:right w:val="single" w:sz="4" w:color="D5DADD"/>
+            </w:tcBorders>
+          </w:tcPr>
+          <w:p>
+            <w:pPr>
+              <w:spacing w:after="60" w:line="245" w:lineRule="auto"/>
+            </w:pPr>
+            <w:r>
+              <w:rPr>
+                <w:rFonts w:ascii="Calibri" w:hAnsi="Calibri"/>
+                <w:b w:val="0"/>
+                <w:sz w:val="20"/>
+              </w:rPr>
+              <w:t>Allocated a separate physical frame and copied each resident parent page into the child.</w:t>
+            </w:r>
+          </w:p>
+        </w:tc>
+        <w:tc>
+          <w:tcPr>
+            <w:tcW w:type="dxa" w:w="4334"/>
+            <w:vAlign w:val="top"/>
+            <w:tcMar>
+              <w:top w:w="85" w:type="dxa"/>
+              <w:bottom w:w="85" w:type="dxa"/>
+              <w:left w:w="85" w:type="dxa"/>
+              <w:right w:w="85" w:type="dxa"/>
+            </w:tcMar>
+            <w:tcBorders>
+              <w:top w:val="single" w:sz="4" w:color="D5DADD"/>
+              <w:bottom w:val="single" w:sz="4" w:color="D5DADD"/>
+              <w:left w:val="single" w:sz="4" w:color="D5DADD"/>
+              <w:right w:val="single" w:sz="4" w:color="D5DADD"/>
+            </w:tcBorders>
+          </w:tcPr>
+          <w:p>
+            <w:pPr>
+              <w:spacing w:after="60" w:line="245" w:lineRule="auto"/>
+            </w:pPr>
+            <w:r>
+              <w:rPr>
+                <w:rFonts w:ascii="Calibri" w:hAnsi="Calibri"/>
+                <w:b w:val="0"/>
+                <w:sz w:val="20"/>
+              </w:rPr>
+              <w:t>Skips lazy holes, resolves saved parent pages as needed, maps shared frames into the child, protects writable mappings with COW and increments references.</w:t>
+            </w:r>
+          </w:p>
+        </w:tc>
+      </w:tr>
+      <w:tr>
+        <w:trPr>
+          <w:cantSplit/>
+        </w:trPr>
+        <w:tc>
+          <w:tcPr>
+            <w:tcW w:type="dxa" w:w="2880"/>
+            <w:vAlign w:val="top"/>
+            <w:tcMar>
+              <w:top w:w="85" w:type="dxa"/>
+              <w:bottom w:w="85" w:type="dxa"/>
+              <w:left w:w="85" w:type="dxa"/>
+              <w:right w:w="85" w:type="dxa"/>
+            </w:tcMar>
+            <w:tcBorders>
+              <w:top w:val="single" w:sz="4" w:color="D5DADD"/>
+              <w:bottom w:val="single" w:sz="4" w:color="D5DADD"/>
+              <w:left w:val="single" w:sz="4" w:color="D5DADD"/>
+              <w:right w:val="single" w:sz="4" w:color="D5DADD"/>
+            </w:tcBorders>
+          </w:tcPr>
+          <w:p>
+            <w:pPr>
+              <w:spacing w:after="60" w:line="245" w:lineRule="auto"/>
+            </w:pPr>
+            <w:r>
+              <w:rPr>
+                <w:rFonts w:ascii="Calibri" w:hAnsi="Calibri"/>
+                <w:b w:val="0"/>
+                <w:sz w:val="20"/>
+              </w:rPr>
+              <w:t>uvmunmap</w:t>
+            </w:r>
+            <w:r>
+              <w:br/>
+            </w:r>
+            <w:r>
+              <w:rPr>
+                <w:rFonts w:ascii="Calibri" w:hAnsi="Calibri"/>
+                <w:b w:val="0"/>
+                <w:sz w:val="20"/>
+              </w:rPr>
+              <w:t>kernel/vm.c</w:t>
+            </w:r>
+            <w:r>
+              <w:br/>
+            </w:r>
+            <w:r>
+              <w:rPr>
+                <w:rFonts w:ascii="Calibri" w:hAnsi="Calibri"/>
+                <w:b w:val="0"/>
+                <w:sz w:val="20"/>
+              </w:rPr>
+              <w:t>Modified</w:t>
+            </w:r>
+          </w:p>
+        </w:tc>
+        <w:tc>
+          <w:tcPr>
+            <w:tcW w:type="dxa" w:w="2952"/>
+            <w:vAlign w:val="top"/>
+            <w:tcMar>
+              <w:top w:w="85" w:type="dxa"/>
+              <w:bottom w:w="85" w:type="dxa"/>
+              <w:left w:w="85" w:type="dxa"/>
+              <w:right w:w="85" w:type="dxa"/>
+            </w:tcMar>
+            <w:tcBorders>
+              <w:top w:val="single" w:sz="4" w:color="D5DADD"/>
+              <w:bottom w:val="single" w:sz="4" w:color="D5DADD"/>
+              <w:left w:val="single" w:sz="4" w:color="D5DADD"/>
+              <w:right w:val="single" w:sz="4" w:color="D5DADD"/>
+            </w:tcBorders>
+          </w:tcPr>
+          <w:p>
+            <w:pPr>
+              <w:spacing w:after="60" w:line="245" w:lineRule="auto"/>
+            </w:pPr>
+            <w:r>
+              <w:rPr>
+                <w:rFonts w:ascii="Calibri" w:hAnsi="Calibri"/>
+                <w:b w:val="0"/>
+                <w:sz w:val="20"/>
+              </w:rPr>
+              <w:t>Expected mapped pages; missing/invalid entries could panic. Released mapped physical frames when requested.</w:t>
+            </w:r>
+          </w:p>
+        </w:tc>
+        <w:tc>
+          <w:tcPr>
+            <w:tcW w:type="dxa" w:w="4334"/>
+            <w:vAlign w:val="top"/>
+            <w:tcMar>
+              <w:top w:w="85" w:type="dxa"/>
+              <w:bottom w:w="85" w:type="dxa"/>
+              <w:left w:w="85" w:type="dxa"/>
+              <w:right w:w="85" w:type="dxa"/>
+            </w:tcMar>
+            <w:tcBorders>
+              <w:top w:val="single" w:sz="4" w:color="D5DADD"/>
+              <w:bottom w:val="single" w:sz="4" w:color="D5DADD"/>
+              <w:left w:val="single" w:sz="4" w:color="D5DADD"/>
+              <w:right w:val="single" w:sz="4" w:color="D5DADD"/>
+            </w:tcBorders>
+          </w:tcPr>
+          <w:p>
+            <w:pPr>
+              <w:spacing w:after="60" w:line="245" w:lineRule="auto"/>
+            </w:pPr>
+            <w:r>
+              <w:rPr>
+                <w:rFonts w:ascii="Calibri" w:hAnsi="Calibri"/>
+                <w:b w:val="0"/>
+                <w:sz w:val="20"/>
+              </w:rPr>
+              <w:t>Tolerates lazy holes. A swapped mapping releases its slot; a resident mapping releases its frame reference and tracking metadata.</w:t>
+            </w:r>
+          </w:p>
+        </w:tc>
+      </w:tr>
+      <w:tr>
+        <w:trPr>
+          <w:cantSplit/>
+        </w:trPr>
+        <w:tc>
+          <w:tcPr>
+            <w:tcW w:type="dxa" w:w="2880"/>
+            <w:vAlign w:val="top"/>
+            <w:tcMar>
+              <w:top w:w="85" w:type="dxa"/>
+              <w:bottom w:w="85" w:type="dxa"/>
+              <w:left w:w="85" w:type="dxa"/>
+              <w:right w:w="85" w:type="dxa"/>
+            </w:tcMar>
+            <w:tcBorders>
+              <w:top w:val="single" w:sz="4" w:color="D5DADD"/>
+              <w:bottom w:val="single" w:sz="4" w:color="D5DADD"/>
+              <w:left w:val="single" w:sz="4" w:color="D5DADD"/>
+              <w:right w:val="single" w:sz="4" w:color="D5DADD"/>
+            </w:tcBorders>
+          </w:tcPr>
+          <w:p>
+            <w:pPr>
+              <w:spacing w:after="60" w:line="245" w:lineRule="auto"/>
+            </w:pPr>
+            <w:r>
+              <w:rPr>
+                <w:rFonts w:ascii="Calibri" w:hAnsi="Calibri"/>
+                <w:b w:val="0"/>
+                <w:sz w:val="20"/>
+              </w:rPr>
+              <w:t>copyin and copyinstr</w:t>
+            </w:r>
+            <w:r>
+              <w:br/>
+            </w:r>
+            <w:r>
+              <w:rPr>
+                <w:rFonts w:ascii="Calibri" w:hAnsi="Calibri"/>
+                <w:b w:val="0"/>
+                <w:sz w:val="20"/>
+              </w:rPr>
+              <w:t>kernel/vm.c</w:t>
+            </w:r>
+            <w:r>
+              <w:br/>
+            </w:r>
+            <w:r>
+              <w:rPr>
+                <w:rFonts w:ascii="Calibri" w:hAnsi="Calibri"/>
+                <w:b w:val="0"/>
+                <w:sz w:val="20"/>
+              </w:rPr>
+              <w:t>Modified</w:t>
+            </w:r>
+          </w:p>
+        </w:tc>
+        <w:tc>
+          <w:tcPr>
+            <w:tcW w:type="dxa" w:w="2952"/>
+            <w:vAlign w:val="top"/>
+            <w:tcMar>
+              <w:top w:w="85" w:type="dxa"/>
+              <w:bottom w:w="85" w:type="dxa"/>
+              <w:left w:w="85" w:type="dxa"/>
+              <w:right w:w="85" w:type="dxa"/>
+            </w:tcMar>
+            <w:tcBorders>
+              <w:top w:val="single" w:sz="4" w:color="D5DADD"/>
+              <w:bottom w:val="single" w:sz="4" w:color="D5DADD"/>
+              <w:left w:val="single" w:sz="4" w:color="D5DADD"/>
+              <w:right w:val="single" w:sz="4" w:color="D5DADD"/>
+            </w:tcBorders>
+          </w:tcPr>
+          <w:p>
+            <w:pPr>
+              <w:spacing w:after="60" w:line="245" w:lineRule="auto"/>
+            </w:pPr>
+            <w:r>
+              <w:rPr>
+                <w:rFonts w:ascii="Calibri" w:hAnsi="Calibri"/>
+                <w:b w:val="0"/>
+                <w:sz w:val="20"/>
+              </w:rPr>
+              <w:t>Translated user addresses through the existing mapping; missing mappings caused copy failure.</w:t>
+            </w:r>
+          </w:p>
+        </w:tc>
+        <w:tc>
+          <w:tcPr>
+            <w:tcW w:type="dxa" w:w="4334"/>
+            <w:vAlign w:val="top"/>
+            <w:tcMar>
+              <w:top w:w="85" w:type="dxa"/>
+              <w:bottom w:w="85" w:type="dxa"/>
+              <w:left w:w="85" w:type="dxa"/>
+              <w:right w:w="85" w:type="dxa"/>
+            </w:tcMar>
+            <w:tcBorders>
+              <w:top w:val="single" w:sz="4" w:color="D5DADD"/>
+              <w:bottom w:val="single" w:sz="4" w:color="D5DADD"/>
+              <w:left w:val="single" w:sz="4" w:color="D5DADD"/>
+              <w:right w:val="single" w:sz="4" w:color="D5DADD"/>
+            </w:tcBorders>
+          </w:tcPr>
+          <w:p>
+            <w:pPr>
+              <w:spacing w:after="60" w:line="245" w:lineRule="auto"/>
+            </w:pPr>
+            <w:r>
+              <w:rPr>
+                <w:rFonts w:ascii="Calibri" w:hAnsi="Calibri"/>
+                <w:b w:val="0"/>
+                <w:sz w:val="20"/>
+              </w:rPr>
+              <w:t>Use fault-aware page access to supply valid lazy or swapped pages before copying. Short copy windows protect the resolved mapping in the one-CPU memory design.</w:t>
+            </w:r>
+          </w:p>
+        </w:tc>
+      </w:tr>
+      <w:tr>
+        <w:trPr>
+          <w:cantSplit/>
+        </w:trPr>
+        <w:tc>
+          <w:tcPr>
+            <w:tcW w:type="dxa" w:w="2880"/>
+            <w:vAlign w:val="top"/>
+            <w:tcMar>
+              <w:top w:w="85" w:type="dxa"/>
+              <w:bottom w:w="85" w:type="dxa"/>
+              <w:left w:w="85" w:type="dxa"/>
+              <w:right w:w="85" w:type="dxa"/>
+            </w:tcMar>
+            <w:tcBorders>
+              <w:top w:val="single" w:sz="4" w:color="D5DADD"/>
+              <w:bottom w:val="single" w:sz="4" w:color="D5DADD"/>
+              <w:left w:val="single" w:sz="4" w:color="D5DADD"/>
+              <w:right w:val="single" w:sz="4" w:color="D5DADD"/>
+            </w:tcBorders>
+          </w:tcPr>
+          <w:p>
+            <w:pPr>
+              <w:spacing w:after="60" w:line="245" w:lineRule="auto"/>
+            </w:pPr>
+            <w:r>
+              <w:rPr>
+                <w:rFonts w:ascii="Calibri" w:hAnsi="Calibri"/>
+                <w:b w:val="0"/>
+                <w:sz w:val="20"/>
+              </w:rPr>
+              <w:t>copyout</w:t>
+            </w:r>
+            <w:r>
+              <w:br/>
+            </w:r>
+            <w:r>
+              <w:rPr>
+                <w:rFonts w:ascii="Calibri" w:hAnsi="Calibri"/>
+                <w:b w:val="0"/>
+                <w:sz w:val="20"/>
+              </w:rPr>
+              <w:t>kernel/vm.c</w:t>
+            </w:r>
+            <w:r>
+              <w:br/>
+            </w:r>
+            <w:r>
+              <w:rPr>
+                <w:rFonts w:ascii="Calibri" w:hAnsi="Calibri"/>
+                <w:b w:val="0"/>
+                <w:sz w:val="20"/>
+              </w:rPr>
+              <w:t>Modified</w:t>
+            </w:r>
+          </w:p>
+        </w:tc>
+        <w:tc>
+          <w:tcPr>
+            <w:tcW w:type="dxa" w:w="2952"/>
+            <w:vAlign w:val="top"/>
+            <w:tcMar>
+              <w:top w:w="85" w:type="dxa"/>
+              <w:bottom w:w="85" w:type="dxa"/>
+              <w:left w:w="85" w:type="dxa"/>
+              <w:right w:w="85" w:type="dxa"/>
+            </w:tcMar>
+            <w:tcBorders>
+              <w:top w:val="single" w:sz="4" w:color="D5DADD"/>
+              <w:bottom w:val="single" w:sz="4" w:color="D5DADD"/>
+              <w:left w:val="single" w:sz="4" w:color="D5DADD"/>
+              <w:right w:val="single" w:sz="4" w:color="D5DADD"/>
+            </w:tcBorders>
+          </w:tcPr>
+          <w:p>
+            <w:pPr>
+              <w:spacing w:after="60" w:line="245" w:lineRule="auto"/>
+            </w:pPr>
+            <w:r>
+              <w:rPr>
+                <w:rFonts w:ascii="Calibri" w:hAnsi="Calibri"/>
+                <w:b w:val="0"/>
+                <w:sz w:val="20"/>
+              </w:rPr>
+              <w:t>Copied through the physical address returned by translation; there was no COW ownership decision.</w:t>
+            </w:r>
+          </w:p>
+        </w:tc>
+        <w:tc>
+          <w:tcPr>
+            <w:tcW w:type="dxa" w:w="4334"/>
+            <w:vAlign w:val="top"/>
+            <w:tcMar>
+              <w:top w:w="85" w:type="dxa"/>
+              <w:bottom w:w="85" w:type="dxa"/>
+              <w:left w:w="85" w:type="dxa"/>
+              <w:right w:w="85" w:type="dxa"/>
+            </w:tcMar>
+            <w:tcBorders>
+              <w:top w:val="single" w:sz="4" w:color="D5DADD"/>
+              <w:bottom w:val="single" w:sz="4" w:color="D5DADD"/>
+              <w:left w:val="single" w:sz="4" w:color="D5DADD"/>
+              <w:right w:val="single" w:sz="4" w:color="D5DADD"/>
+            </w:tcBorders>
+          </w:tcPr>
+          <w:p>
+            <w:pPr>
+              <w:spacing w:after="60" w:line="245" w:lineRule="auto"/>
+            </w:pPr>
+            <w:r>
+              <w:rPr>
+                <w:rFonts w:ascii="Calibri" w:hAnsi="Calibri"/>
+                <w:b w:val="0"/>
+                <w:sz w:val="20"/>
+              </w:rPr>
+              <w:t>Requests writable user access, invoking lazy/swap recovery or a private COW copy before the kernel writes the buffer.</w:t>
+            </w:r>
+          </w:p>
+        </w:tc>
+      </w:tr>
+      <w:tr>
+        <w:trPr>
+          <w:cantSplit/>
+        </w:trPr>
+        <w:tc>
+          <w:tcPr>
+            <w:tcW w:type="dxa" w:w="2880"/>
+            <w:vAlign w:val="top"/>
+            <w:tcMar>
+              <w:top w:w="85" w:type="dxa"/>
+              <w:bottom w:w="85" w:type="dxa"/>
+              <w:left w:w="85" w:type="dxa"/>
+              <w:right w:w="85" w:type="dxa"/>
+            </w:tcMar>
+            <w:tcBorders>
+              <w:top w:val="single" w:sz="4" w:color="D5DADD"/>
+              <w:bottom w:val="single" w:sz="4" w:color="D5DADD"/>
+              <w:left w:val="single" w:sz="4" w:color="D5DADD"/>
+              <w:right w:val="single" w:sz="4" w:color="D5DADD"/>
+            </w:tcBorders>
+          </w:tcPr>
+          <w:p>
+            <w:pPr>
+              <w:spacing w:after="60" w:line="245" w:lineRule="auto"/>
+            </w:pPr>
+            <w:r>
+              <w:rPr>
+                <w:rFonts w:ascii="Calibri" w:hAnsi="Calibri"/>
+                <w:b w:val="0"/>
+                <w:sz w:val="20"/>
+              </w:rPr>
+              <w:t>kalloc and kfree</w:t>
+            </w:r>
+            <w:r>
+              <w:br/>
+            </w:r>
+            <w:r>
+              <w:rPr>
+                <w:rFonts w:ascii="Calibri" w:hAnsi="Calibri"/>
+                <w:b w:val="0"/>
+                <w:sz w:val="20"/>
+              </w:rPr>
+              <w:t>kernel/kalloc.c</w:t>
+            </w:r>
+            <w:r>
+              <w:br/>
+            </w:r>
+            <w:r>
+              <w:rPr>
+                <w:rFonts w:ascii="Calibri" w:hAnsi="Calibri"/>
+                <w:b w:val="0"/>
+                <w:sz w:val="20"/>
+              </w:rPr>
+              <w:t>Modified</w:t>
+            </w:r>
+          </w:p>
+        </w:tc>
+        <w:tc>
+          <w:tcPr>
+            <w:tcW w:type="dxa" w:w="2952"/>
+            <w:vAlign w:val="top"/>
+            <w:tcMar>
+              <w:top w:w="85" w:type="dxa"/>
+              <w:bottom w:w="85" w:type="dxa"/>
+              <w:left w:w="85" w:type="dxa"/>
+              <w:right w:w="85" w:type="dxa"/>
+            </w:tcMar>
+            <w:tcBorders>
+              <w:top w:val="single" w:sz="4" w:color="D5DADD"/>
+              <w:bottom w:val="single" w:sz="4" w:color="D5DADD"/>
+              <w:left w:val="single" w:sz="4" w:color="D5DADD"/>
+              <w:right w:val="single" w:sz="4" w:color="D5DADD"/>
+            </w:tcBorders>
+          </w:tcPr>
+          <w:p>
+            <w:pPr>
+              <w:spacing w:after="60" w:line="245" w:lineRule="auto"/>
+            </w:pPr>
+            <w:r>
+              <w:rPr>
+                <w:rFonts w:ascii="Calibri" w:hAnsi="Calibri"/>
+                <w:b w:val="0"/>
+                <w:sz w:val="20"/>
+              </w:rPr>
+              <w:t>Removed/inserted frames in a free list without shared-frame reference accounting.</w:t>
+            </w:r>
+          </w:p>
+        </w:tc>
+        <w:tc>
+          <w:tcPr>
+            <w:tcW w:type="dxa" w:w="4334"/>
+            <w:vAlign w:val="top"/>
+            <w:tcMar>
+              <w:top w:w="85" w:type="dxa"/>
+              <w:bottom w:w="85" w:type="dxa"/>
+              <w:left w:w="85" w:type="dxa"/>
+              <w:right w:w="85" w:type="dxa"/>
+            </w:tcMar>
+            <w:tcBorders>
+              <w:top w:val="single" w:sz="4" w:color="D5DADD"/>
+              <w:bottom w:val="single" w:sz="4" w:color="D5DADD"/>
+              <w:left w:val="single" w:sz="4" w:color="D5DADD"/>
+              <w:right w:val="single" w:sz="4" w:color="D5DADD"/>
+            </w:tcBorders>
+          </w:tcPr>
+          <w:p>
+            <w:pPr>
+              <w:spacing w:after="60" w:line="245" w:lineRule="auto"/>
+            </w:pPr>
+            <w:r>
+              <w:rPr>
+                <w:rFonts w:ascii="Calibri" w:hAnsi="Calibri"/>
+                <w:b w:val="0"/>
+                <w:sz w:val="20"/>
+              </w:rPr>
+              <w:t>Allocation initializes an ownership count and updates free-page statistics. kfree decrements the reference count and returns the frame only when it reaches zero.</w:t>
+            </w:r>
+          </w:p>
+        </w:tc>
+      </w:tr>
+    </w:tbl>
+    <w:p>
+      <w:pPr>
+        <w:spacing w:after="60" w:line="20" w:lineRule="exact"/>
+      </w:pPr>
+    </w:p>
+    <w:p>
+      <w:pPr>
+        <w:spacing w:after="120" w:line="247" w:lineRule="auto"/>
+      </w:pPr>
+      <w:r>
+        <w:rPr>
+          <w:rFonts w:ascii="Calibri" w:hAnsi="Calibri"/>
+          <w:sz w:val="22"/>
+        </w:rPr>
+        <w:t>This distinction is important for the baseline result: sys_sbrk changes the address-space reservation policy, while the fault handler supplies physical pages later. A successful reservation does not remove the finite backing-capacity limit.</w:t>
+      </w:r>
+    </w:p>
+    <w:p>
+      <w:pPr>
+        <w:pStyle w:val="Heading1"/>
+        <w:pageBreakBefore/>
+      </w:pPr>
+      <w:r>
+        <w:t>Function changes in recovery and integration</w:t>
+      </w:r>
+    </w:p>
+    <w:p>
+      <w:pPr>
+        <w:spacing w:after="120" w:line="247" w:lineRule="auto"/>
+      </w:pPr>
+      <w:r>
+        <w:rPr>
+          <w:rFonts w:ascii="Calibri" w:hAnsi="Calibri"/>
+          <w:sz w:val="22"/>
+        </w:rPr>
+        <w:t>New functions are identified as additions rather than described as replacements for nonexistent earlier code. The swap.c statistics stub at v0.3 was subsequently extended into the paging engine.</w:t>
+      </w:r>
+    </w:p>
+    <w:tbl>
+      <w:tblPr>
+        <w:tblW w:type="dxa" w:w="10166"/>
+        <w:jc w:val="center"/>
+        <w:tblLayout w:type="fixed"/>
+        <w:tblLook w:firstColumn="1" w:firstRow="1" w:lastColumn="0" w:lastRow="0" w:noHBand="0" w:noVBand="1" w:val="04A0"/>
+      </w:tblPr>
+      <w:tblGrid>
+        <w:gridCol w:w="2880"/>
+        <w:gridCol w:w="2952"/>
+        <w:gridCol w:w="4334"/>
+      </w:tblGrid>
+      <w:tr>
+        <w:trPr>
+          <w:cantSplit/>
+          <w:tblHeader/>
+        </w:trPr>
+        <w:tc>
+          <w:tcPr>
+            <w:tcW w:type="dxa" w:w="2880"/>
+            <w:vAlign w:val="top"/>
+            <w:tcMar>
+              <w:top w:w="85" w:type="dxa"/>
+              <w:bottom w:w="85" w:type="dxa"/>
+              <w:left w:w="85" w:type="dxa"/>
+              <w:right w:w="85" w:type="dxa"/>
+            </w:tcMar>
+            <w:tcBorders>
+              <w:top w:val="single" w:sz="4" w:color="D5DADD"/>
+              <w:bottom w:val="single" w:sz="4" w:color="D5DADD"/>
+              <w:left w:val="single" w:sz="4" w:color="D5DADD"/>
+              <w:right w:val="single" w:sz="4" w:color="D5DADD"/>
+            </w:tcBorders>
+            <w:shd w:fill="EDF1F4"/>
+          </w:tcPr>
+          <w:p>
+            <w:pPr>
+              <w:spacing w:after="60" w:line="245" w:lineRule="auto"/>
+            </w:pPr>
+            <w:r>
+              <w:rPr>
+                <w:rFonts w:ascii="Calibri" w:hAnsi="Calibri"/>
+                <w:b/>
+                <w:sz w:val="20"/>
+              </w:rPr>
+              <w:t>Function and location</w:t>
+            </w:r>
+          </w:p>
+        </w:tc>
+        <w:tc>
+          <w:tcPr>
+            <w:tcW w:type="dxa" w:w="2952"/>
+            <w:vAlign w:val="top"/>
+            <w:tcMar>
+              <w:top w:w="85" w:type="dxa"/>
+              <w:bottom w:w="85" w:type="dxa"/>
+              <w:left w:w="85" w:type="dxa"/>
+              <w:right w:w="85" w:type="dxa"/>
+            </w:tcMar>
+            <w:tcBorders>
+              <w:top w:val="single" w:sz="4" w:color="D5DADD"/>
+              <w:bottom w:val="single" w:sz="4" w:color="D5DADD"/>
+              <w:left w:val="single" w:sz="4" w:color="D5DADD"/>
+              <w:right w:val="single" w:sz="4" w:color="D5DADD"/>
+            </w:tcBorders>
+            <w:shd w:fill="EDF1F4"/>
+          </w:tcPr>
+          <w:p>
+            <w:pPr>
+              <w:spacing w:after="60" w:line="245" w:lineRule="auto"/>
+            </w:pPr>
+            <w:r>
+              <w:rPr>
+                <w:rFonts w:ascii="Calibri" w:hAnsi="Calibri"/>
+                <w:b/>
+                <w:sz w:val="20"/>
+              </w:rPr>
+              <w:t>Earlier behavior or interface</w:t>
+            </w:r>
+          </w:p>
+        </w:tc>
+        <w:tc>
+          <w:tcPr>
+            <w:tcW w:type="dxa" w:w="4334"/>
+            <w:vAlign w:val="top"/>
+            <w:tcMar>
+              <w:top w:w="85" w:type="dxa"/>
+              <w:bottom w:w="85" w:type="dxa"/>
+              <w:left w:w="85" w:type="dxa"/>
+              <w:right w:w="85" w:type="dxa"/>
+            </w:tcMar>
+            <w:tcBorders>
+              <w:top w:val="single" w:sz="4" w:color="D5DADD"/>
+              <w:bottom w:val="single" w:sz="4" w:color="D5DADD"/>
+              <w:left w:val="single" w:sz="4" w:color="D5DADD"/>
+              <w:right w:val="single" w:sz="4" w:color="D5DADD"/>
+            </w:tcBorders>
+            <w:shd w:fill="EDF1F4"/>
+          </w:tcPr>
+          <w:p>
+            <w:pPr>
+              <w:spacing w:after="60" w:line="245" w:lineRule="auto"/>
+            </w:pPr>
+            <w:r>
+              <w:rPr>
+                <w:rFonts w:ascii="Calibri" w:hAnsi="Calibri"/>
+                <w:b/>
+                <w:sz w:val="20"/>
+              </w:rPr>
+              <w:t>Implemented change and purpose</w:t>
+            </w:r>
+          </w:p>
+        </w:tc>
+      </w:tr>
+      <w:tr>
+        <w:trPr>
+          <w:cantSplit/>
+        </w:trPr>
+        <w:tc>
+          <w:tcPr>
+            <w:tcW w:type="dxa" w:w="2880"/>
+            <w:vAlign w:val="top"/>
+            <w:tcMar>
+              <w:top w:w="85" w:type="dxa"/>
+              <w:bottom w:w="85" w:type="dxa"/>
+              <w:left w:w="85" w:type="dxa"/>
+              <w:right w:w="85" w:type="dxa"/>
+            </w:tcMar>
+            <w:tcBorders>
+              <w:top w:val="single" w:sz="4" w:color="D5DADD"/>
+              <w:bottom w:val="single" w:sz="4" w:color="D5DADD"/>
+              <w:left w:val="single" w:sz="4" w:color="D5DADD"/>
+              <w:right w:val="single" w:sz="4" w:color="D5DADD"/>
+            </w:tcBorders>
+          </w:tcPr>
+          <w:p>
+            <w:pPr>
+              <w:spacing w:after="60" w:line="245" w:lineRule="auto"/>
+            </w:pPr>
+            <w:r>
+              <w:rPr>
+                <w:rFonts w:ascii="Calibri" w:hAnsi="Calibri"/>
+                <w:b w:val="0"/>
+                <w:sz w:val="20"/>
+              </w:rPr>
+              <w:t>handle_page_fault</w:t>
+            </w:r>
+            <w:r>
+              <w:br/>
+            </w:r>
+            <w:r>
+              <w:rPr>
+                <w:rFonts w:ascii="Calibri" w:hAnsi="Calibri"/>
+                <w:b w:val="0"/>
+                <w:sz w:val="20"/>
+              </w:rPr>
+              <w:t>kernel/pgfault.c</w:t>
+            </w:r>
+            <w:r>
+              <w:br/>
+            </w:r>
+            <w:r>
+              <w:rPr>
+                <w:rFonts w:ascii="Calibri" w:hAnsi="Calibri"/>
+                <w:b w:val="0"/>
+                <w:sz w:val="20"/>
+              </w:rPr>
+              <w:t>Added</w:t>
+            </w:r>
+          </w:p>
+        </w:tc>
+        <w:tc>
+          <w:tcPr>
+            <w:tcW w:type="dxa" w:w="2952"/>
+            <w:vAlign w:val="top"/>
+            <w:tcMar>
+              <w:top w:w="85" w:type="dxa"/>
+              <w:bottom w:w="85" w:type="dxa"/>
+              <w:left w:w="85" w:type="dxa"/>
+              <w:right w:w="85" w:type="dxa"/>
+            </w:tcMar>
+            <w:tcBorders>
+              <w:top w:val="single" w:sz="4" w:color="D5DADD"/>
+              <w:bottom w:val="single" w:sz="4" w:color="D5DADD"/>
+              <w:left w:val="single" w:sz="4" w:color="D5DADD"/>
+              <w:right w:val="single" w:sz="4" w:color="D5DADD"/>
+            </w:tcBorders>
+          </w:tcPr>
+          <w:p>
+            <w:pPr>
+              <w:spacing w:after="60" w:line="245" w:lineRule="auto"/>
+            </w:pPr>
+            <w:r>
+              <w:rPr>
+                <w:rFonts w:ascii="Calibri" w:hAnsi="Calibri"/>
+                <w:b w:val="0"/>
+                <w:sz w:val="20"/>
+              </w:rPr>
+              <w:t>No combined lazy, COW and swap recovery helper existed at v0.0.</w:t>
+            </w:r>
+          </w:p>
+        </w:tc>
+        <w:tc>
+          <w:tcPr>
+            <w:tcW w:type="dxa" w:w="4334"/>
+            <w:vAlign w:val="top"/>
+            <w:tcMar>
+              <w:top w:w="85" w:type="dxa"/>
+              <w:bottom w:w="85" w:type="dxa"/>
+              <w:left w:w="85" w:type="dxa"/>
+              <w:right w:w="85" w:type="dxa"/>
+            </w:tcMar>
+            <w:tcBorders>
+              <w:top w:val="single" w:sz="4" w:color="D5DADD"/>
+              <w:bottom w:val="single" w:sz="4" w:color="D5DADD"/>
+              <w:left w:val="single" w:sz="4" w:color="D5DADD"/>
+              <w:right w:val="single" w:sz="4" w:color="D5DADD"/>
+            </w:tcBorders>
+          </w:tcPr>
+          <w:p>
+            <w:pPr>
+              <w:spacing w:after="60" w:line="245" w:lineRule="auto"/>
+            </w:pPr>
+            <w:r>
+              <w:rPr>
+                <w:rFonts w:ascii="Calibri" w:hAnsi="Calibri"/>
+                <w:b w:val="0"/>
+                <w:sz w:val="20"/>
+              </w:rPr>
+              <w:t>Classifies the mapping and access, allocates zero-filled lazy pages, recovers COW writes or restores saved pages. Invalid accesses and unrecoverable allocation failures return an error.</w:t>
+            </w:r>
+          </w:p>
+        </w:tc>
+      </w:tr>
+      <w:tr>
+        <w:trPr>
+          <w:cantSplit/>
+        </w:trPr>
+        <w:tc>
+          <w:tcPr>
+            <w:tcW w:type="dxa" w:w="2880"/>
+            <w:vAlign w:val="top"/>
+            <w:tcMar>
+              <w:top w:w="85" w:type="dxa"/>
+              <w:bottom w:w="85" w:type="dxa"/>
+              <w:left w:w="85" w:type="dxa"/>
+              <w:right w:w="85" w:type="dxa"/>
+            </w:tcMar>
+            <w:tcBorders>
+              <w:top w:val="single" w:sz="4" w:color="D5DADD"/>
+              <w:bottom w:val="single" w:sz="4" w:color="D5DADD"/>
+              <w:left w:val="single" w:sz="4" w:color="D5DADD"/>
+              <w:right w:val="single" w:sz="4" w:color="D5DADD"/>
+            </w:tcBorders>
+          </w:tcPr>
+          <w:p>
+            <w:pPr>
+              <w:spacing w:after="60" w:line="245" w:lineRule="auto"/>
+            </w:pPr>
+            <w:r>
+              <w:rPr>
+                <w:rFonts w:ascii="Calibri" w:hAnsi="Calibri"/>
+                <w:b w:val="0"/>
+                <w:sz w:val="20"/>
+              </w:rPr>
+              <w:t>pin_user_page and prefault</w:t>
+            </w:r>
+            <w:r>
+              <w:br/>
+            </w:r>
+            <w:r>
+              <w:rPr>
+                <w:rFonts w:ascii="Calibri" w:hAnsi="Calibri"/>
+                <w:b w:val="0"/>
+                <w:sz w:val="20"/>
+              </w:rPr>
+              <w:t>kernel/vm.c</w:t>
+            </w:r>
+            <w:r>
+              <w:br/>
+            </w:r>
+            <w:r>
+              <w:rPr>
+                <w:rFonts w:ascii="Calibri" w:hAnsi="Calibri"/>
+                <w:b w:val="0"/>
+                <w:sz w:val="20"/>
+              </w:rPr>
+              <w:t>Added</w:t>
+            </w:r>
+          </w:p>
+        </w:tc>
+        <w:tc>
+          <w:tcPr>
+            <w:tcW w:type="dxa" w:w="2952"/>
+            <w:vAlign w:val="top"/>
+            <w:tcMar>
+              <w:top w:w="85" w:type="dxa"/>
+              <w:bottom w:w="85" w:type="dxa"/>
+              <w:left w:w="85" w:type="dxa"/>
+              <w:right w:w="85" w:type="dxa"/>
+            </w:tcMar>
+            <w:tcBorders>
+              <w:top w:val="single" w:sz="4" w:color="D5DADD"/>
+              <w:bottom w:val="single" w:sz="4" w:color="D5DADD"/>
+              <w:left w:val="single" w:sz="4" w:color="D5DADD"/>
+              <w:right w:val="single" w:sz="4" w:color="D5DADD"/>
+            </w:tcBorders>
+          </w:tcPr>
+          <w:p>
+            <w:pPr>
+              <w:spacing w:after="60" w:line="245" w:lineRule="auto"/>
+            </w:pPr>
+            <w:r>
+              <w:rPr>
+                <w:rFonts w:ascii="Calibri" w:hAnsi="Calibri"/>
+                <w:b w:val="0"/>
+                <w:sz w:val="20"/>
+              </w:rPr>
+              <w:t>User-copy paths relied on already valid translations; file syscalls did not prepare buffers through these helpers.</w:t>
+            </w:r>
+          </w:p>
+        </w:tc>
+        <w:tc>
+          <w:tcPr>
+            <w:tcW w:type="dxa" w:w="4334"/>
+            <w:vAlign w:val="top"/>
+            <w:tcMar>
+              <w:top w:w="85" w:type="dxa"/>
+              <w:bottom w:w="85" w:type="dxa"/>
+              <w:left w:w="85" w:type="dxa"/>
+              <w:right w:w="85" w:type="dxa"/>
+            </w:tcMar>
+            <w:tcBorders>
+              <w:top w:val="single" w:sz="4" w:color="D5DADD"/>
+              <w:bottom w:val="single" w:sz="4" w:color="D5DADD"/>
+              <w:left w:val="single" w:sz="4" w:color="D5DADD"/>
+              <w:right w:val="single" w:sz="4" w:color="D5DADD"/>
+            </w:tcBorders>
+          </w:tcPr>
+          <w:p>
+            <w:pPr>
+              <w:spacing w:after="60" w:line="245" w:lineRule="auto"/>
+            </w:pPr>
+            <w:r>
+              <w:rPr>
+                <w:rFonts w:ascii="Calibri" w:hAnsi="Calibri"/>
+                <w:b w:val="0"/>
+                <w:sz w:val="20"/>
+              </w:rPr>
+              <w:t>Recheck a mapping after fault recovery. prefault attempts buffer preparation before file I/O; it does not guarantee a page cannot later be evicted.</w:t>
+            </w:r>
+          </w:p>
+        </w:tc>
+      </w:tr>
+      <w:tr>
+        <w:trPr>
+          <w:cantSplit/>
+        </w:trPr>
+        <w:tc>
+          <w:tcPr>
+            <w:tcW w:type="dxa" w:w="2880"/>
+            <w:vAlign w:val="top"/>
+            <w:tcMar>
+              <w:top w:w="85" w:type="dxa"/>
+              <w:bottom w:w="85" w:type="dxa"/>
+              <w:left w:w="85" w:type="dxa"/>
+              <w:right w:w="85" w:type="dxa"/>
+            </w:tcMar>
+            <w:tcBorders>
+              <w:top w:val="single" w:sz="4" w:color="D5DADD"/>
+              <w:bottom w:val="single" w:sz="4" w:color="D5DADD"/>
+              <w:left w:val="single" w:sz="4" w:color="D5DADD"/>
+              <w:right w:val="single" w:sz="4" w:color="D5DADD"/>
+            </w:tcBorders>
+          </w:tcPr>
+          <w:p>
+            <w:pPr>
+              <w:spacing w:after="60" w:line="245" w:lineRule="auto"/>
+            </w:pPr>
+            <w:r>
+              <w:rPr>
+                <w:rFonts w:ascii="Calibri" w:hAnsi="Calibri"/>
+                <w:b w:val="0"/>
+                <w:sz w:val="20"/>
+              </w:rPr>
+              <w:t>kref_inc, kref_get and kfreepages</w:t>
+            </w:r>
+            <w:r>
+              <w:br/>
+            </w:r>
+            <w:r>
+              <w:rPr>
+                <w:rFonts w:ascii="Calibri" w:hAnsi="Calibri"/>
+                <w:b w:val="0"/>
+                <w:sz w:val="20"/>
+              </w:rPr>
+              <w:t>kernel/kalloc.c</w:t>
+            </w:r>
+            <w:r>
+              <w:br/>
+            </w:r>
+            <w:r>
+              <w:rPr>
+                <w:rFonts w:ascii="Calibri" w:hAnsi="Calibri"/>
+                <w:b w:val="0"/>
+                <w:sz w:val="20"/>
+              </w:rPr>
+              <w:t>Added</w:t>
+            </w:r>
+          </w:p>
+        </w:tc>
+        <w:tc>
+          <w:tcPr>
+            <w:tcW w:type="dxa" w:w="2952"/>
+            <w:vAlign w:val="top"/>
+            <w:tcMar>
+              <w:top w:w="85" w:type="dxa"/>
+              <w:bottom w:w="85" w:type="dxa"/>
+              <w:left w:w="85" w:type="dxa"/>
+              <w:right w:w="85" w:type="dxa"/>
+            </w:tcMar>
+            <w:tcBorders>
+              <w:top w:val="single" w:sz="4" w:color="D5DADD"/>
+              <w:bottom w:val="single" w:sz="4" w:color="D5DADD"/>
+              <w:left w:val="single" w:sz="4" w:color="D5DADD"/>
+              <w:right w:val="single" w:sz="4" w:color="D5DADD"/>
+            </w:tcBorders>
+          </w:tcPr>
+          <w:p>
+            <w:pPr>
+              <w:spacing w:after="60" w:line="245" w:lineRule="auto"/>
+            </w:pPr>
+            <w:r>
+              <w:rPr>
+                <w:rFonts w:ascii="Calibri" w:hAnsi="Calibri"/>
+                <w:b w:val="0"/>
+                <w:sz w:val="20"/>
+              </w:rPr>
+              <w:t>No interface exposed shared-frame references or the maintained free-page count.</w:t>
+            </w:r>
+          </w:p>
+        </w:tc>
+        <w:tc>
+          <w:tcPr>
+            <w:tcW w:type="dxa" w:w="4334"/>
+            <w:vAlign w:val="top"/>
+            <w:tcMar>
+              <w:top w:w="85" w:type="dxa"/>
+              <w:bottom w:w="85" w:type="dxa"/>
+              <w:left w:w="85" w:type="dxa"/>
+              <w:right w:w="85" w:type="dxa"/>
+            </w:tcMar>
+            <w:tcBorders>
+              <w:top w:val="single" w:sz="4" w:color="D5DADD"/>
+              <w:bottom w:val="single" w:sz="4" w:color="D5DADD"/>
+              <w:left w:val="single" w:sz="4" w:color="D5DADD"/>
+              <w:right w:val="single" w:sz="4" w:color="D5DADD"/>
+            </w:tcBorders>
+          </w:tcPr>
+          <w:p>
+            <w:pPr>
+              <w:spacing w:after="60" w:line="245" w:lineRule="auto"/>
+            </w:pPr>
+            <w:r>
+              <w:rPr>
+                <w:rFonts w:ascii="Calibri" w:hAnsi="Calibri"/>
+                <w:b w:val="0"/>
+                <w:sz w:val="20"/>
+              </w:rPr>
+              <w:t>Support fork ownership, COW decisions, eviction eligibility and memory statistics.</w:t>
+            </w:r>
+          </w:p>
+        </w:tc>
+      </w:tr>
+      <w:tr>
+        <w:trPr>
+          <w:cantSplit/>
+        </w:trPr>
+        <w:tc>
+          <w:tcPr>
+            <w:tcW w:type="dxa" w:w="2880"/>
+            <w:vAlign w:val="top"/>
+            <w:tcMar>
+              <w:top w:w="85" w:type="dxa"/>
+              <w:bottom w:w="85" w:type="dxa"/>
+              <w:left w:w="85" w:type="dxa"/>
+              <w:right w:w="85" w:type="dxa"/>
+            </w:tcMar>
+            <w:tcBorders>
+              <w:top w:val="single" w:sz="4" w:color="D5DADD"/>
+              <w:bottom w:val="single" w:sz="4" w:color="D5DADD"/>
+              <w:left w:val="single" w:sz="4" w:color="D5DADD"/>
+              <w:right w:val="single" w:sz="4" w:color="D5DADD"/>
+            </w:tcBorders>
+          </w:tcPr>
+          <w:p>
+            <w:pPr>
+              <w:spacing w:after="60" w:line="245" w:lineRule="auto"/>
+            </w:pPr>
+            <w:r>
+              <w:rPr>
+                <w:rFonts w:ascii="Calibri" w:hAnsi="Calibri"/>
+                <w:b w:val="0"/>
+                <w:sz w:val="20"/>
+              </w:rPr>
+              <w:t>kalloc_user</w:t>
+            </w:r>
+            <w:r>
+              <w:br/>
+            </w:r>
+            <w:r>
+              <w:rPr>
+                <w:rFonts w:ascii="Calibri" w:hAnsi="Calibri"/>
+                <w:b w:val="0"/>
+                <w:sz w:val="20"/>
+              </w:rPr>
+              <w:t>kernel/swap.c</w:t>
+            </w:r>
+            <w:r>
+              <w:br/>
+            </w:r>
+            <w:r>
+              <w:rPr>
+                <w:rFonts w:ascii="Calibri" w:hAnsi="Calibri"/>
+                <w:b w:val="0"/>
+                <w:sz w:val="20"/>
+              </w:rPr>
+              <w:t>Added</w:t>
+            </w:r>
+          </w:p>
+        </w:tc>
+        <w:tc>
+          <w:tcPr>
+            <w:tcW w:type="dxa" w:w="2952"/>
+            <w:vAlign w:val="top"/>
+            <w:tcMar>
+              <w:top w:w="85" w:type="dxa"/>
+              <w:bottom w:w="85" w:type="dxa"/>
+              <w:left w:w="85" w:type="dxa"/>
+              <w:right w:w="85" w:type="dxa"/>
+            </w:tcMar>
+            <w:tcBorders>
+              <w:top w:val="single" w:sz="4" w:color="D5DADD"/>
+              <w:bottom w:val="single" w:sz="4" w:color="D5DADD"/>
+              <w:left w:val="single" w:sz="4" w:color="D5DADD"/>
+              <w:right w:val="single" w:sz="4" w:color="D5DADD"/>
+            </w:tcBorders>
+          </w:tcPr>
+          <w:p>
+            <w:pPr>
+              <w:spacing w:after="60" w:line="245" w:lineRule="auto"/>
+            </w:pPr>
+            <w:r>
+              <w:rPr>
+                <w:rFonts w:ascii="Calibri" w:hAnsi="Calibri"/>
+                <w:b w:val="0"/>
+                <w:sz w:val="20"/>
+              </w:rPr>
+              <w:t>Direct allocation returned failure when no free frame was available; no swap reclaim wrapper existed.</w:t>
+            </w:r>
+          </w:p>
+        </w:tc>
+        <w:tc>
+          <w:tcPr>
+            <w:tcW w:type="dxa" w:w="4334"/>
+            <w:vAlign w:val="top"/>
+            <w:tcMar>
+              <w:top w:w="85" w:type="dxa"/>
+              <w:bottom w:w="85" w:type="dxa"/>
+              <w:left w:w="85" w:type="dxa"/>
+              <w:right w:w="85" w:type="dxa"/>
+            </w:tcMar>
+            <w:tcBorders>
+              <w:top w:val="single" w:sz="4" w:color="D5DADD"/>
+              <w:bottom w:val="single" w:sz="4" w:color="D5DADD"/>
+              <w:left w:val="single" w:sz="4" w:color="D5DADD"/>
+              <w:right w:val="single" w:sz="4" w:color="D5DADD"/>
+            </w:tcBorders>
+          </w:tcPr>
+          <w:p>
+            <w:pPr>
+              <w:spacing w:after="60" w:line="245" w:lineRule="auto"/>
+            </w:pPr>
+            <w:r>
+              <w:rPr>
+                <w:rFonts w:ascii="Calibri" w:hAnsi="Calibri"/>
+                <w:b w:val="0"/>
+                <w:sz w:val="20"/>
+              </w:rPr>
+              <w:t>When free pages are low and no spinlock is held, attempt eviction of eligible frames before calling kalloc. Reclamation can still fail.</w:t>
+            </w:r>
+          </w:p>
+        </w:tc>
+      </w:tr>
+      <w:tr>
+        <w:trPr>
+          <w:cantSplit/>
+        </w:trPr>
+        <w:tc>
+          <w:tcPr>
+            <w:tcW w:type="dxa" w:w="2880"/>
+            <w:vAlign w:val="top"/>
+            <w:tcMar>
+              <w:top w:w="85" w:type="dxa"/>
+              <w:bottom w:w="85" w:type="dxa"/>
+              <w:left w:w="85" w:type="dxa"/>
+              <w:right w:w="85" w:type="dxa"/>
+            </w:tcMar>
+            <w:tcBorders>
+              <w:top w:val="single" w:sz="4" w:color="D5DADD"/>
+              <w:bottom w:val="single" w:sz="4" w:color="D5DADD"/>
+              <w:left w:val="single" w:sz="4" w:color="D5DADD"/>
+              <w:right w:val="single" w:sz="4" w:color="D5DADD"/>
+            </w:tcBorders>
+          </w:tcPr>
+          <w:p>
+            <w:pPr>
+              <w:spacing w:after="60" w:line="245" w:lineRule="auto"/>
+            </w:pPr>
+            <w:r>
+              <w:rPr>
+                <w:rFonts w:ascii="Calibri" w:hAnsi="Calibri"/>
+                <w:b w:val="0"/>
+                <w:sz w:val="20"/>
+              </w:rPr>
+              <w:t>swap_out_one, swap_in and tracking/slot helpers</w:t>
+            </w:r>
+            <w:r>
+              <w:br/>
+            </w:r>
+            <w:r>
+              <w:rPr>
+                <w:rFonts w:ascii="Calibri" w:hAnsi="Calibri"/>
+                <w:b w:val="0"/>
+                <w:sz w:val="20"/>
+              </w:rPr>
+              <w:t>kernel/swap.c</w:t>
+            </w:r>
+            <w:r>
+              <w:br/>
+            </w:r>
+            <w:r>
+              <w:rPr>
+                <w:rFonts w:ascii="Calibri" w:hAnsi="Calibri"/>
+                <w:b w:val="0"/>
+                <w:sz w:val="20"/>
+              </w:rPr>
+              <w:t>Added</w:t>
+            </w:r>
+          </w:p>
+        </w:tc>
+        <w:tc>
+          <w:tcPr>
+            <w:tcW w:type="dxa" w:w="2952"/>
+            <w:vAlign w:val="top"/>
+            <w:tcMar>
+              <w:top w:w="85" w:type="dxa"/>
+              <w:bottom w:w="85" w:type="dxa"/>
+              <w:left w:w="85" w:type="dxa"/>
+              <w:right w:w="85" w:type="dxa"/>
+            </w:tcMar>
+            <w:tcBorders>
+              <w:top w:val="single" w:sz="4" w:color="D5DADD"/>
+              <w:bottom w:val="single" w:sz="4" w:color="D5DADD"/>
+              <w:left w:val="single" w:sz="4" w:color="D5DADD"/>
+              <w:right w:val="single" w:sz="4" w:color="D5DADD"/>
+            </w:tcBorders>
+          </w:tcPr>
+          <w:p>
+            <w:pPr>
+              <w:spacing w:after="60" w:line="245" w:lineRule="auto"/>
+            </w:pPr>
+            <w:r>
+              <w:rPr>
+                <w:rFonts w:ascii="Calibri" w:hAnsi="Calibri"/>
+                <w:b w:val="0"/>
+                <w:sz w:val="20"/>
+              </w:rPr>
+              <w:t>The earlier statistics stub did not move page contents to disk or retain swap entries.</w:t>
+            </w:r>
+          </w:p>
+        </w:tc>
+        <w:tc>
+          <w:tcPr>
+            <w:tcW w:type="dxa" w:w="4334"/>
+            <w:vAlign w:val="top"/>
+            <w:tcMar>
+              <w:top w:w="85" w:type="dxa"/>
+              <w:bottom w:w="85" w:type="dxa"/>
+              <w:left w:w="85" w:type="dxa"/>
+              <w:right w:w="85" w:type="dxa"/>
+            </w:tcMar>
+            <w:tcBorders>
+              <w:top w:val="single" w:sz="4" w:color="D5DADD"/>
+              <w:bottom w:val="single" w:sz="4" w:color="D5DADD"/>
+              <w:left w:val="single" w:sz="4" w:color="D5DADD"/>
+              <w:right w:val="single" w:sz="4" w:color="D5DADD"/>
+            </w:tcBorders>
+          </w:tcPr>
+          <w:p>
+            <w:pPr>
+              <w:spacing w:after="60" w:line="245" w:lineRule="auto"/>
+            </w:pPr>
+            <w:r>
+              <w:rPr>
+                <w:rFonts w:ascii="Calibri" w:hAnsi="Calibri"/>
+                <w:b w:val="0"/>
+                <w:sz w:val="20"/>
+              </w:rPr>
+              <w:t>Track owners and slots, save eligible frames, encode nonresident mappings, restore contents/permissions and release slots during cleanup.</w:t>
+            </w:r>
+          </w:p>
+        </w:tc>
+      </w:tr>
+      <w:tr>
+        <w:trPr>
+          <w:cantSplit/>
+        </w:trPr>
+        <w:tc>
+          <w:tcPr>
+            <w:tcW w:type="dxa" w:w="2880"/>
+            <w:vAlign w:val="top"/>
+            <w:tcMar>
+              <w:top w:w="85" w:type="dxa"/>
+              <w:bottom w:w="85" w:type="dxa"/>
+              <w:left w:w="85" w:type="dxa"/>
+              <w:right w:w="85" w:type="dxa"/>
+            </w:tcMar>
+            <w:tcBorders>
+              <w:top w:val="single" w:sz="4" w:color="D5DADD"/>
+              <w:bottom w:val="single" w:sz="4" w:color="D5DADD"/>
+              <w:left w:val="single" w:sz="4" w:color="D5DADD"/>
+              <w:right w:val="single" w:sz="4" w:color="D5DADD"/>
+            </w:tcBorders>
+          </w:tcPr>
+          <w:p>
+            <w:pPr>
+              <w:spacing w:after="60" w:line="245" w:lineRule="auto"/>
+            </w:pPr>
+            <w:r>
+              <w:rPr>
+                <w:rFonts w:ascii="Calibri" w:hAnsi="Calibri"/>
+                <w:b w:val="0"/>
+                <w:sz w:val="20"/>
+              </w:rPr>
+              <w:t>pick_victim</w:t>
+            </w:r>
+            <w:r>
+              <w:br/>
+            </w:r>
+            <w:r>
+              <w:rPr>
+                <w:rFonts w:ascii="Calibri" w:hAnsi="Calibri"/>
+                <w:b w:val="0"/>
+                <w:sz w:val="20"/>
+              </w:rPr>
+              <w:t>kernel/swap.c</w:t>
+            </w:r>
+            <w:r>
+              <w:br/>
+            </w:r>
+            <w:r>
+              <w:rPr>
+                <w:rFonts w:ascii="Calibri" w:hAnsi="Calibri"/>
+                <w:b w:val="0"/>
+                <w:sz w:val="20"/>
+              </w:rPr>
+              <w:t>Added</w:t>
+            </w:r>
+          </w:p>
+        </w:tc>
+        <w:tc>
+          <w:tcPr>
+            <w:tcW w:type="dxa" w:w="2952"/>
+            <w:vAlign w:val="top"/>
+            <w:tcMar>
+              <w:top w:w="85" w:type="dxa"/>
+              <w:bottom w:w="85" w:type="dxa"/>
+              <w:left w:w="85" w:type="dxa"/>
+              <w:right w:w="85" w:type="dxa"/>
+            </w:tcMar>
+            <w:tcBorders>
+              <w:top w:val="single" w:sz="4" w:color="D5DADD"/>
+              <w:bottom w:val="single" w:sz="4" w:color="D5DADD"/>
+              <w:left w:val="single" w:sz="4" w:color="D5DADD"/>
+              <w:right w:val="single" w:sz="4" w:color="D5DADD"/>
+            </w:tcBorders>
+          </w:tcPr>
+          <w:p>
+            <w:pPr>
+              <w:spacing w:after="60" w:line="245" w:lineRule="auto"/>
+            </w:pPr>
+            <w:r>
+              <w:rPr>
+                <w:rFonts w:ascii="Calibri" w:hAnsi="Calibri"/>
+                <w:b w:val="0"/>
+                <w:sz w:val="20"/>
+              </w:rPr>
+              <w:t>No swap victim-selection engine existed.</w:t>
+            </w:r>
+          </w:p>
+        </w:tc>
+        <w:tc>
+          <w:tcPr>
+            <w:tcW w:type="dxa" w:w="4334"/>
+            <w:vAlign w:val="top"/>
+            <w:tcMar>
+              <w:top w:w="85" w:type="dxa"/>
+              <w:bottom w:w="85" w:type="dxa"/>
+              <w:left w:w="85" w:type="dxa"/>
+              <w:right w:w="85" w:type="dxa"/>
+            </w:tcMar>
+            <w:tcBorders>
+              <w:top w:val="single" w:sz="4" w:color="D5DADD"/>
+              <w:bottom w:val="single" w:sz="4" w:color="D5DADD"/>
+              <w:left w:val="single" w:sz="4" w:color="D5DADD"/>
+              <w:right w:val="single" w:sz="4" w:color="D5DADD"/>
+            </w:tcBorders>
+          </w:tcPr>
+          <w:p>
+            <w:pPr>
+              <w:spacing w:after="60" w:line="245" w:lineRule="auto"/>
+            </w:pPr>
+            <w:r>
+              <w:rPr>
+                <w:rFonts w:ascii="Calibri" w:hAnsi="Calibri"/>
+                <w:b w:val="0"/>
+                <w:sz w:val="20"/>
+              </w:rPr>
+              <w:t>FIFO selects the oldest tracked eligible frame. Clock clears accessed indications and grants another chance while advancing a circular hand.</w:t>
+            </w:r>
+          </w:p>
+        </w:tc>
+      </w:tr>
+      <w:tr>
+        <w:trPr>
+          <w:cantSplit/>
+        </w:trPr>
+        <w:tc>
+          <w:tcPr>
+            <w:tcW w:type="dxa" w:w="2880"/>
+            <w:vAlign w:val="top"/>
+            <w:tcMar>
+              <w:top w:w="85" w:type="dxa"/>
+              <w:bottom w:w="85" w:type="dxa"/>
+              <w:left w:w="85" w:type="dxa"/>
+              <w:right w:w="85" w:type="dxa"/>
+            </w:tcMar>
+            <w:tcBorders>
+              <w:top w:val="single" w:sz="4" w:color="D5DADD"/>
+              <w:bottom w:val="single" w:sz="4" w:color="D5DADD"/>
+              <w:left w:val="single" w:sz="4" w:color="D5DADD"/>
+              <w:right w:val="single" w:sz="4" w:color="D5DADD"/>
+            </w:tcBorders>
+          </w:tcPr>
+          <w:p>
+            <w:pPr>
+              <w:spacing w:after="60" w:line="245" w:lineRule="auto"/>
+            </w:pPr>
+            <w:r>
+              <w:rPr>
+                <w:rFonts w:ascii="Calibri" w:hAnsi="Calibri"/>
+                <w:b w:val="0"/>
+                <w:sz w:val="20"/>
+              </w:rPr>
+              <w:t>sys_memstat and memstat_fill</w:t>
+            </w:r>
+            <w:r>
+              <w:br/>
+            </w:r>
+            <w:r>
+              <w:rPr>
+                <w:rFonts w:ascii="Calibri" w:hAnsi="Calibri"/>
+                <w:b w:val="0"/>
+                <w:sz w:val="20"/>
+              </w:rPr>
+              <w:t>sysproc.c and swap.c</w:t>
+            </w:r>
+            <w:r>
+              <w:br/>
+            </w:r>
+            <w:r>
+              <w:rPr>
+                <w:rFonts w:ascii="Calibri" w:hAnsi="Calibri"/>
+                <w:b w:val="0"/>
+                <w:sz w:val="20"/>
+              </w:rPr>
+              <w:t>Added</w:t>
+            </w:r>
+          </w:p>
+        </w:tc>
+        <w:tc>
+          <w:tcPr>
+            <w:tcW w:type="dxa" w:w="2952"/>
+            <w:vAlign w:val="top"/>
+            <w:tcMar>
+              <w:top w:w="85" w:type="dxa"/>
+              <w:bottom w:w="85" w:type="dxa"/>
+              <w:left w:w="85" w:type="dxa"/>
+              <w:right w:w="85" w:type="dxa"/>
+            </w:tcMar>
+            <w:tcBorders>
+              <w:top w:val="single" w:sz="4" w:color="D5DADD"/>
+              <w:bottom w:val="single" w:sz="4" w:color="D5DADD"/>
+              <w:left w:val="single" w:sz="4" w:color="D5DADD"/>
+              <w:right w:val="single" w:sz="4" w:color="D5DADD"/>
+            </w:tcBorders>
+          </w:tcPr>
+          <w:p>
+            <w:pPr>
+              <w:spacing w:after="60" w:line="245" w:lineRule="auto"/>
+            </w:pPr>
+            <w:r>
+              <w:rPr>
+                <w:rFonts w:ascii="Calibri" w:hAnsi="Calibri"/>
+                <w:b w:val="0"/>
+                <w:sz w:val="20"/>
+              </w:rPr>
+              <w:t>No project memstat system call or seven-field user interface existed at v0.0.</w:t>
+            </w:r>
+          </w:p>
+        </w:tc>
+        <w:tc>
+          <w:tcPr>
+            <w:tcW w:type="dxa" w:w="4334"/>
+            <w:vAlign w:val="top"/>
+            <w:tcMar>
+              <w:top w:w="85" w:type="dxa"/>
+              <w:bottom w:w="85" w:type="dxa"/>
+              <w:left w:w="85" w:type="dxa"/>
+              <w:right w:w="85" w:type="dxa"/>
+            </w:tcMar>
+            <w:tcBorders>
+              <w:top w:val="single" w:sz="4" w:color="D5DADD"/>
+              <w:bottom w:val="single" w:sz="4" w:color="D5DADD"/>
+              <w:left w:val="single" w:sz="4" w:color="D5DADD"/>
+              <w:right w:val="single" w:sz="4" w:color="D5DADD"/>
+            </w:tcBorders>
+          </w:tcPr>
+          <w:p>
+            <w:pPr>
+              <w:spacing w:after="60" w:line="245" w:lineRule="auto"/>
+            </w:pPr>
+            <w:r>
+              <w:rPr>
+                <w:rFonts w:ascii="Calibri" w:hAnsi="Calibri"/>
+                <w:b w:val="0"/>
+                <w:sz w:val="20"/>
+              </w:rPr>
+              <w:t>Collect event/resource counts and copy the structure to the user buffer through syscall 22. The command prints the returned fields.</w:t>
+            </w:r>
+          </w:p>
+        </w:tc>
+      </w:tr>
+      <w:tr>
+        <w:trPr>
+          <w:cantSplit/>
+        </w:trPr>
+        <w:tc>
+          <w:tcPr>
+            <w:tcW w:type="dxa" w:w="2880"/>
+            <w:vAlign w:val="top"/>
+            <w:tcMar>
+              <w:top w:w="85" w:type="dxa"/>
+              <w:bottom w:w="85" w:type="dxa"/>
+              <w:left w:w="85" w:type="dxa"/>
+              <w:right w:w="85" w:type="dxa"/>
+            </w:tcMar>
+            <w:tcBorders>
+              <w:top w:val="single" w:sz="4" w:color="D5DADD"/>
+              <w:bottom w:val="single" w:sz="4" w:color="D5DADD"/>
+              <w:left w:val="single" w:sz="4" w:color="D5DADD"/>
+              <w:right w:val="single" w:sz="4" w:color="D5DADD"/>
+            </w:tcBorders>
+          </w:tcPr>
+          <w:p>
+            <w:pPr>
+              <w:spacing w:after="60" w:line="245" w:lineRule="auto"/>
+            </w:pPr>
+            <w:r>
+              <w:rPr>
+                <w:rFonts w:ascii="Calibri" w:hAnsi="Calibri"/>
+                <w:b w:val="0"/>
+                <w:sz w:val="20"/>
+              </w:rPr>
+              <w:t>wait</w:t>
+            </w:r>
+            <w:r>
+              <w:br/>
+            </w:r>
+            <w:r>
+              <w:rPr>
+                <w:rFonts w:ascii="Calibri" w:hAnsi="Calibri"/>
+                <w:b w:val="0"/>
+                <w:sz w:val="20"/>
+              </w:rPr>
+              <w:t>kernel/proc.c</w:t>
+            </w:r>
+            <w:r>
+              <w:br/>
+            </w:r>
+            <w:r>
+              <w:rPr>
+                <w:rFonts w:ascii="Calibri" w:hAnsi="Calibri"/>
+                <w:b w:val="0"/>
+                <w:sz w:val="20"/>
+              </w:rPr>
+              <w:t>Modified</w:t>
+            </w:r>
+          </w:p>
+        </w:tc>
+        <w:tc>
+          <w:tcPr>
+            <w:tcW w:type="dxa" w:w="2952"/>
+            <w:vAlign w:val="top"/>
+            <w:tcMar>
+              <w:top w:w="85" w:type="dxa"/>
+              <w:bottom w:w="85" w:type="dxa"/>
+              <w:left w:w="85" w:type="dxa"/>
+              <w:right w:w="85" w:type="dxa"/>
+            </w:tcMar>
+            <w:tcBorders>
+              <w:top w:val="single" w:sz="4" w:color="D5DADD"/>
+              <w:bottom w:val="single" w:sz="4" w:color="D5DADD"/>
+              <w:left w:val="single" w:sz="4" w:color="D5DADD"/>
+              <w:right w:val="single" w:sz="4" w:color="D5DADD"/>
+            </w:tcBorders>
+          </w:tcPr>
+          <w:p>
+            <w:pPr>
+              <w:spacing w:after="60" w:line="245" w:lineRule="auto"/>
+            </w:pPr>
+            <w:r>
+              <w:rPr>
+                <w:rFonts w:ascii="Calibri" w:hAnsi="Calibri"/>
+                <w:b w:val="0"/>
+                <w:sz w:val="20"/>
+              </w:rPr>
+              <w:t>Copied child status while child resources and process locks were still held, then reaped the child.</w:t>
+            </w:r>
+          </w:p>
+        </w:tc>
+        <w:tc>
+          <w:tcPr>
+            <w:tcW w:type="dxa" w:w="4334"/>
+            <w:vAlign w:val="top"/>
+            <w:tcMar>
+              <w:top w:w="85" w:type="dxa"/>
+              <w:bottom w:w="85" w:type="dxa"/>
+              <w:left w:w="85" w:type="dxa"/>
+              <w:right w:w="85" w:type="dxa"/>
+            </w:tcMar>
+            <w:tcBorders>
+              <w:top w:val="single" w:sz="4" w:color="D5DADD"/>
+              <w:bottom w:val="single" w:sz="4" w:color="D5DADD"/>
+              <w:left w:val="single" w:sz="4" w:color="D5DADD"/>
+              <w:right w:val="single" w:sz="4" w:color="D5DADD"/>
+            </w:tcBorders>
+          </w:tcPr>
+          <w:p>
+            <w:pPr>
+              <w:spacing w:after="60" w:line="245" w:lineRule="auto"/>
+            </w:pPr>
+            <w:r>
+              <w:rPr>
+                <w:rFonts w:ascii="Calibri" w:hAnsi="Calibri"/>
+                <w:b w:val="0"/>
+                <w:sz w:val="20"/>
+              </w:rPr>
+              <w:t>Save status locally, reap the child and release locks before copyout, which may itself need COW allocation. A later copy failure can return -1 after reaping.</w:t>
+            </w:r>
+          </w:p>
+        </w:tc>
+      </w:tr>
+      <w:tr>
+        <w:trPr>
+          <w:cantSplit/>
+        </w:trPr>
+        <w:tc>
+          <w:tcPr>
+            <w:tcW w:type="dxa" w:w="2880"/>
+            <w:vAlign w:val="top"/>
+            <w:tcMar>
+              <w:top w:w="85" w:type="dxa"/>
+              <w:bottom w:w="85" w:type="dxa"/>
+              <w:left w:w="85" w:type="dxa"/>
+              <w:right w:w="85" w:type="dxa"/>
+            </w:tcMar>
+            <w:tcBorders>
+              <w:top w:val="single" w:sz="4" w:color="D5DADD"/>
+              <w:bottom w:val="single" w:sz="4" w:color="D5DADD"/>
+              <w:left w:val="single" w:sz="4" w:color="D5DADD"/>
+              <w:right w:val="single" w:sz="4" w:color="D5DADD"/>
+            </w:tcBorders>
+          </w:tcPr>
+          <w:p>
+            <w:pPr>
+              <w:spacing w:after="60" w:line="245" w:lineRule="auto"/>
+            </w:pPr>
+            <w:r>
+              <w:rPr>
+                <w:rFonts w:ascii="Calibri" w:hAnsi="Calibri"/>
+                <w:b w:val="0"/>
+                <w:sz w:val="20"/>
+              </w:rPr>
+              <w:t>pipewrite and piperead</w:t>
+            </w:r>
+            <w:r>
+              <w:br/>
+            </w:r>
+            <w:r>
+              <w:rPr>
+                <w:rFonts w:ascii="Calibri" w:hAnsi="Calibri"/>
+                <w:b w:val="0"/>
+                <w:sz w:val="20"/>
+              </w:rPr>
+              <w:t>kernel/pipe.c</w:t>
+            </w:r>
+            <w:r>
+              <w:br/>
+            </w:r>
+            <w:r>
+              <w:rPr>
+                <w:rFonts w:ascii="Calibri" w:hAnsi="Calibri"/>
+                <w:b w:val="0"/>
+                <w:sz w:val="20"/>
+              </w:rPr>
+              <w:t>Modified</w:t>
+            </w:r>
+          </w:p>
+        </w:tc>
+        <w:tc>
+          <w:tcPr>
+            <w:tcW w:type="dxa" w:w="2952"/>
+            <w:vAlign w:val="top"/>
+            <w:tcMar>
+              <w:top w:w="85" w:type="dxa"/>
+              <w:bottom w:w="85" w:type="dxa"/>
+              <w:left w:w="85" w:type="dxa"/>
+              <w:right w:w="85" w:type="dxa"/>
+            </w:tcMar>
+            <w:tcBorders>
+              <w:top w:val="single" w:sz="4" w:color="D5DADD"/>
+              <w:bottom w:val="single" w:sz="4" w:color="D5DADD"/>
+              <w:left w:val="single" w:sz="4" w:color="D5DADD"/>
+              <w:right w:val="single" w:sz="4" w:color="D5DADD"/>
+            </w:tcBorders>
+          </w:tcPr>
+          <w:p>
+            <w:pPr>
+              <w:spacing w:after="60" w:line="245" w:lineRule="auto"/>
+            </w:pPr>
+            <w:r>
+              <w:rPr>
+                <w:rFonts w:ascii="Calibri" w:hAnsi="Calibri"/>
+                <w:b w:val="0"/>
+                <w:sz w:val="20"/>
+              </w:rPr>
+              <w:t>User-memory copying occurred while the pipe spinlock was held.</w:t>
+            </w:r>
+          </w:p>
+        </w:tc>
+        <w:tc>
+          <w:tcPr>
+            <w:tcW w:type="dxa" w:w="4334"/>
+            <w:vAlign w:val="top"/>
+            <w:tcMar>
+              <w:top w:w="85" w:type="dxa"/>
+              <w:bottom w:w="85" w:type="dxa"/>
+              <w:left w:w="85" w:type="dxa"/>
+              <w:right w:w="85" w:type="dxa"/>
+            </w:tcMar>
+            <w:tcBorders>
+              <w:top w:val="single" w:sz="4" w:color="D5DADD"/>
+              <w:bottom w:val="single" w:sz="4" w:color="D5DADD"/>
+              <w:left w:val="single" w:sz="4" w:color="D5DADD"/>
+              <w:right w:val="single" w:sz="4" w:color="D5DADD"/>
+            </w:tcBorders>
+          </w:tcPr>
+          <w:p>
+            <w:pPr>
+              <w:spacing w:after="60" w:line="245" w:lineRule="auto"/>
+            </w:pPr>
+            <w:r>
+              <w:rPr>
+                <w:rFonts w:ascii="Calibri" w:hAnsi="Calibri"/>
+                <w:b w:val="0"/>
+                <w:sz w:val="20"/>
+              </w:rPr>
+              <w:t>Stage writes through a kernel buffer and perform user copies outside the pipe lock, allowing allocation and sleeping recovery safely.</w:t>
+            </w:r>
+          </w:p>
+        </w:tc>
+      </w:tr>
+      <w:tr>
+        <w:trPr>
+          <w:cantSplit/>
+        </w:trPr>
+        <w:tc>
+          <w:tcPr>
+            <w:tcW w:type="dxa" w:w="2880"/>
+            <w:vAlign w:val="top"/>
+            <w:tcMar>
+              <w:top w:w="85" w:type="dxa"/>
+              <w:bottom w:w="85" w:type="dxa"/>
+              <w:left w:w="85" w:type="dxa"/>
+              <w:right w:w="85" w:type="dxa"/>
+            </w:tcMar>
+            <w:tcBorders>
+              <w:top w:val="single" w:sz="4" w:color="D5DADD"/>
+              <w:bottom w:val="single" w:sz="4" w:color="D5DADD"/>
+              <w:left w:val="single" w:sz="4" w:color="D5DADD"/>
+              <w:right w:val="single" w:sz="4" w:color="D5DADD"/>
+            </w:tcBorders>
+          </w:tcPr>
+          <w:p>
+            <w:pPr>
+              <w:spacing w:after="60" w:line="245" w:lineRule="auto"/>
+            </w:pPr>
+            <w:r>
+              <w:rPr>
+                <w:rFonts w:ascii="Calibri" w:hAnsi="Calibri"/>
+                <w:b w:val="0"/>
+                <w:sz w:val="20"/>
+              </w:rPr>
+              <w:t>sys_read and sys_write</w:t>
+            </w:r>
+            <w:r>
+              <w:br/>
+            </w:r>
+            <w:r>
+              <w:rPr>
+                <w:rFonts w:ascii="Calibri" w:hAnsi="Calibri"/>
+                <w:b w:val="0"/>
+                <w:sz w:val="20"/>
+              </w:rPr>
+              <w:t>kernel/sysfile.c</w:t>
+            </w:r>
+            <w:r>
+              <w:br/>
+            </w:r>
+            <w:r>
+              <w:rPr>
+                <w:rFonts w:ascii="Calibri" w:hAnsi="Calibri"/>
+                <w:b w:val="0"/>
+                <w:sz w:val="20"/>
+              </w:rPr>
+              <w:t>Modified</w:t>
+            </w:r>
+          </w:p>
+        </w:tc>
+        <w:tc>
+          <w:tcPr>
+            <w:tcW w:type="dxa" w:w="2952"/>
+            <w:vAlign w:val="top"/>
+            <w:tcMar>
+              <w:top w:w="85" w:type="dxa"/>
+              <w:bottom w:w="85" w:type="dxa"/>
+              <w:left w:w="85" w:type="dxa"/>
+              <w:right w:w="85" w:type="dxa"/>
+            </w:tcMar>
+            <w:tcBorders>
+              <w:top w:val="single" w:sz="4" w:color="D5DADD"/>
+              <w:bottom w:val="single" w:sz="4" w:color="D5DADD"/>
+              <w:left w:val="single" w:sz="4" w:color="D5DADD"/>
+              <w:right w:val="single" w:sz="4" w:color="D5DADD"/>
+            </w:tcBorders>
+          </w:tcPr>
+          <w:p>
+            <w:pPr>
+              <w:spacing w:after="60" w:line="245" w:lineRule="auto"/>
+            </w:pPr>
+            <w:r>
+              <w:rPr>
+                <w:rFonts w:ascii="Calibri" w:hAnsi="Calibri"/>
+                <w:b w:val="0"/>
+                <w:sz w:val="20"/>
+              </w:rPr>
+              <w:t>Passed the user buffer directly to fileread/filewrite without the added preparation step.</w:t>
+            </w:r>
+          </w:p>
+        </w:tc>
+        <w:tc>
+          <w:tcPr>
+            <w:tcW w:type="dxa" w:w="4334"/>
+            <w:vAlign w:val="top"/>
+            <w:tcMar>
+              <w:top w:w="85" w:type="dxa"/>
+              <w:bottom w:w="85" w:type="dxa"/>
+              <w:left w:w="85" w:type="dxa"/>
+              <w:right w:w="85" w:type="dxa"/>
+            </w:tcMar>
+            <w:tcBorders>
+              <w:top w:val="single" w:sz="4" w:color="D5DADD"/>
+              <w:bottom w:val="single" w:sz="4" w:color="D5DADD"/>
+              <w:left w:val="single" w:sz="4" w:color="D5DADD"/>
+              <w:right w:val="single" w:sz="4" w:color="D5DADD"/>
+            </w:tcBorders>
+          </w:tcPr>
+          <w:p>
+            <w:pPr>
+              <w:spacing w:after="60" w:line="245" w:lineRule="auto"/>
+            </w:pPr>
+            <w:r>
+              <w:rPr>
+                <w:rFonts w:ascii="Calibri" w:hAnsi="Calibri"/>
+                <w:b w:val="0"/>
+                <w:sz w:val="20"/>
+              </w:rPr>
+              <w:t>Attempt prefault preparation before file I/O. Fault-aware copy helpers remain necessary because preparation alone does not pin every page for the entire syscall.</w:t>
+            </w:r>
+          </w:p>
+        </w:tc>
+      </w:tr>
+    </w:tbl>
+    <w:p>
+      <w:pPr>
+        <w:spacing w:after="60" w:line="20" w:lineRule="exact"/>
+      </w:pPr>
+    </w:p>
+    <w:p>
+      <w:pPr>
+        <w:pStyle w:val="Heading1"/>
+        <w:pageBreakBefore/>
+      </w:pPr>
+      <w:r>
+        <w:t>Memory limits and test program behaviour</w:t>
+      </w:r>
+    </w:p>
+    <w:p>
+      <w:pPr>
+        <w:spacing w:after="120" w:line="247" w:lineRule="auto"/>
+      </w:pPr>
+      <w:r>
+        <w:rPr>
+          <w:rFonts w:ascii="Calibri" w:hAnsi="Calibri"/>
+          <w:sz w:val="22"/>
+        </w:rPr>
+        <w:t>The earlier PHYSTOP was fixed at KERNBASE + 128 * 1024 * 1024. We introduced the RAM_MB build parameter and changed the upper managed-memory boundary to:</w:t>
+      </w:r>
+    </w:p>
+    <w:p>
+      <w:pPr>
+        <w:spacing w:after="120" w:line="245" w:lineRule="auto"/>
+      </w:pPr>
+      <w:r>
+        <w:rPr>
+          <w:rFonts w:ascii="Consolas" w:hAnsi="Consolas"/>
+          <w:sz w:val="19"/>
+        </w:rPr>
+        <w:t>#define PHYSTOP (KERNBASE + RAM_MB * 1024 * 1024)</w:t>
+      </w:r>
+    </w:p>
+    <w:p>
+      <w:pPr>
+        <w:spacing w:after="120" w:line="247" w:lineRule="auto"/>
+      </w:pPr>
+      <w:r>
+        <w:rPr>
+          <w:rFonts w:ascii="Calibri" w:hAnsi="Calibri"/>
+          <w:sz w:val="22"/>
+        </w:rPr>
+        <w:t>Makefile compilation passes RAM_MB as a C preprocessor definition. This build restricts the kernel-managed range to 8 MiB, including kernel overhead; QEMU still exposes 128 MiB physically:</w:t>
+      </w:r>
+    </w:p>
+    <w:p>
+      <w:pPr>
+        <w:spacing w:after="120" w:line="245" w:lineRule="auto"/>
+      </w:pPr>
+      <w:r>
+        <w:rPr>
+          <w:rFonts w:ascii="Consolas" w:hAnsi="Consolas"/>
+          <w:sz w:val="19"/>
+        </w:rPr>
+        <w:t>make clean</w:t>
+      </w:r>
+      <w:r>
+        <w:br/>
+      </w:r>
+      <w:r>
+        <w:rPr>
+          <w:rFonts w:ascii="Consolas" w:hAnsi="Consolas"/>
+          <w:sz w:val="19"/>
+        </w:rPr>
+        <w:t>make qemu CPUS=1 RAM_MB=8 SWAP_POLICY=1</w:t>
+      </w:r>
+    </w:p>
+    <w:p>
+      <w:pPr>
+        <w:spacing w:after="120" w:line="247" w:lineRule="auto"/>
+      </w:pPr>
+      <w:r>
+        <w:rPr>
+          <w:rFonts w:ascii="Calibri" w:hAnsi="Calibri"/>
+          <w:sz w:val="22"/>
+        </w:rPr>
+        <w:t>Policy 1 selects FIFO; policy 2 selects Clock. Clean rebuilding is required when changing these compilation settings. The commands below are user programs, except that memstat also has a newly added kernel syscall behind its command.</w:t>
+      </w:r>
+    </w:p>
+    <w:tbl>
+      <w:tblPr>
+        <w:tblW w:type="dxa" w:w="10166"/>
+        <w:jc w:val="center"/>
+        <w:tblLayout w:type="fixed"/>
+        <w:tblLook w:firstColumn="1" w:firstRow="1" w:lastColumn="0" w:lastRow="0" w:noHBand="0" w:noVBand="1" w:val="04A0"/>
+      </w:tblPr>
+      <w:tblGrid>
+        <w:gridCol w:w="1440"/>
+        <w:gridCol w:w="1512"/>
+        <w:gridCol w:w="7214"/>
+      </w:tblGrid>
+      <w:tr>
+        <w:trPr>
+          <w:cantSplit/>
+          <w:tblHeader/>
+        </w:trPr>
+        <w:tc>
+          <w:tcPr>
+            <w:tcW w:type="dxa" w:w="1440"/>
+            <w:vAlign w:val="top"/>
+            <w:tcMar>
+              <w:top w:w="85" w:type="dxa"/>
+              <w:bottom w:w="85" w:type="dxa"/>
+              <w:left w:w="85" w:type="dxa"/>
+              <w:right w:w="85" w:type="dxa"/>
+            </w:tcMar>
+            <w:tcBorders>
+              <w:top w:val="single" w:sz="4" w:color="D5DADD"/>
+              <w:bottom w:val="single" w:sz="4" w:color="D5DADD"/>
+              <w:left w:val="single" w:sz="4" w:color="D5DADD"/>
+              <w:right w:val="single" w:sz="4" w:color="D5DADD"/>
+            </w:tcBorders>
+            <w:shd w:fill="EDF1F4"/>
+          </w:tcPr>
+          <w:p>
+            <w:pPr>
+              <w:spacing w:after="60" w:line="245" w:lineRule="auto"/>
+            </w:pPr>
+            <w:r>
+              <w:rPr>
+                <w:rFonts w:ascii="Calibri" w:hAnsi="Calibri"/>
+                <w:b/>
+                <w:sz w:val="20"/>
+              </w:rPr>
+              <w:t>Program</w:t>
+            </w:r>
+          </w:p>
+        </w:tc>
+        <w:tc>
+          <w:tcPr>
+            <w:tcW w:type="dxa" w:w="1512"/>
+            <w:vAlign w:val="top"/>
+            <w:tcMar>
+              <w:top w:w="85" w:type="dxa"/>
+              <w:bottom w:w="85" w:type="dxa"/>
+              <w:left w:w="85" w:type="dxa"/>
+              <w:right w:w="85" w:type="dxa"/>
+            </w:tcMar>
+            <w:tcBorders>
+              <w:top w:val="single" w:sz="4" w:color="D5DADD"/>
+              <w:bottom w:val="single" w:sz="4" w:color="D5DADD"/>
+              <w:left w:val="single" w:sz="4" w:color="D5DADD"/>
+              <w:right w:val="single" w:sz="4" w:color="D5DADD"/>
+            </w:tcBorders>
+            <w:shd w:fill="EDF1F4"/>
+          </w:tcPr>
+          <w:p>
+            <w:pPr>
+              <w:spacing w:after="60" w:line="245" w:lineRule="auto"/>
+            </w:pPr>
+            <w:r>
+              <w:rPr>
+                <w:rFonts w:ascii="Calibri" w:hAnsi="Calibri"/>
+                <w:b/>
+                <w:sz w:val="20"/>
+              </w:rPr>
+              <w:t>Origin</w:t>
+            </w:r>
+          </w:p>
+        </w:tc>
+        <w:tc>
+          <w:tcPr>
+            <w:tcW w:type="dxa" w:w="7214"/>
+            <w:vAlign w:val="top"/>
+            <w:tcMar>
+              <w:top w:w="85" w:type="dxa"/>
+              <w:bottom w:w="85" w:type="dxa"/>
+              <w:left w:w="85" w:type="dxa"/>
+              <w:right w:w="85" w:type="dxa"/>
+            </w:tcMar>
+            <w:tcBorders>
+              <w:top w:val="single" w:sz="4" w:color="D5DADD"/>
+              <w:bottom w:val="single" w:sz="4" w:color="D5DADD"/>
+              <w:left w:val="single" w:sz="4" w:color="D5DADD"/>
+              <w:right w:val="single" w:sz="4" w:color="D5DADD"/>
+            </w:tcBorders>
+            <w:shd w:fill="EDF1F4"/>
+          </w:tcPr>
+          <w:p>
+            <w:pPr>
+              <w:spacing w:after="60" w:line="245" w:lineRule="auto"/>
+            </w:pPr>
+            <w:r>
+              <w:rPr>
+                <w:rFonts w:ascii="Calibri" w:hAnsi="Calibri"/>
+                <w:b/>
+                <w:sz w:val="20"/>
+              </w:rPr>
+              <w:t>Actual code behavior and interpretation</w:t>
+            </w:r>
+          </w:p>
+        </w:tc>
+      </w:tr>
+      <w:tr>
+        <w:trPr>
+          <w:cantSplit/>
+        </w:trPr>
+        <w:tc>
+          <w:tcPr>
+            <w:tcW w:type="dxa" w:w="1440"/>
+            <w:vAlign w:val="top"/>
+            <w:tcMar>
+              <w:top w:w="85" w:type="dxa"/>
+              <w:bottom w:w="85" w:type="dxa"/>
+              <w:left w:w="85" w:type="dxa"/>
+              <w:right w:w="85" w:type="dxa"/>
+            </w:tcMar>
+            <w:tcBorders>
+              <w:top w:val="single" w:sz="4" w:color="D5DADD"/>
+              <w:bottom w:val="single" w:sz="4" w:color="D5DADD"/>
+              <w:left w:val="single" w:sz="4" w:color="D5DADD"/>
+              <w:right w:val="single" w:sz="4" w:color="D5DADD"/>
+            </w:tcBorders>
+          </w:tcPr>
+          <w:p>
+            <w:pPr>
+              <w:spacing w:after="60" w:line="245" w:lineRule="auto"/>
+            </w:pPr>
+            <w:r>
+              <w:rPr>
+                <w:rFonts w:ascii="Calibri" w:hAnsi="Calibri"/>
+                <w:b w:val="0"/>
+                <w:sz w:val="20"/>
+              </w:rPr>
+              <w:t>baseline</w:t>
+            </w:r>
+          </w:p>
+        </w:tc>
+        <w:tc>
+          <w:tcPr>
+            <w:tcW w:type="dxa" w:w="1512"/>
+            <w:vAlign w:val="top"/>
+            <w:tcMar>
+              <w:top w:w="85" w:type="dxa"/>
+              <w:bottom w:w="85" w:type="dxa"/>
+              <w:left w:w="85" w:type="dxa"/>
+              <w:right w:w="85" w:type="dxa"/>
+            </w:tcMar>
+            <w:tcBorders>
+              <w:top w:val="single" w:sz="4" w:color="D5DADD"/>
+              <w:bottom w:val="single" w:sz="4" w:color="D5DADD"/>
+              <w:left w:val="single" w:sz="4" w:color="D5DADD"/>
+              <w:right w:val="single" w:sz="4" w:color="D5DADD"/>
+            </w:tcBorders>
+          </w:tcPr>
+          <w:p>
+            <w:pPr>
+              <w:spacing w:after="60" w:line="245" w:lineRule="auto"/>
+            </w:pPr>
+            <w:r>
+              <w:rPr>
+                <w:rFonts w:ascii="Calibri" w:hAnsi="Calibri"/>
+                <w:b w:val="0"/>
+                <w:sz w:val="20"/>
+              </w:rPr>
+              <w:t>Project baseline test</w:t>
+            </w:r>
+          </w:p>
+        </w:tc>
+        <w:tc>
+          <w:tcPr>
+            <w:tcW w:type="dxa" w:w="7214"/>
+            <w:vAlign w:val="top"/>
+            <w:tcMar>
+              <w:top w:w="85" w:type="dxa"/>
+              <w:bottom w:w="85" w:type="dxa"/>
+              <w:left w:w="85" w:type="dxa"/>
+              <w:right w:w="85" w:type="dxa"/>
+            </w:tcMar>
+            <w:tcBorders>
+              <w:top w:val="single" w:sz="4" w:color="D5DADD"/>
+              <w:bottom w:val="single" w:sz="4" w:color="D5DADD"/>
+              <w:left w:val="single" w:sz="4" w:color="D5DADD"/>
+              <w:right w:val="single" w:sz="4" w:color="D5DADD"/>
+            </w:tcBorders>
+          </w:tcPr>
+          <w:p>
+            <w:pPr>
+              <w:spacing w:after="60" w:line="245" w:lineRule="auto"/>
+            </w:pPr>
+            <w:r>
+              <w:rPr>
+                <w:rFonts w:ascii="Calibri" w:hAnsi="Calibri"/>
+                <w:b w:val="0"/>
+                <w:sz w:val="20"/>
+              </w:rPr>
+              <w:t>Calls sbrk(200 * 1024 * 1024), checks the return value and exits without populating the range. It compares reservation behavior, not 200 MiB residency.</w:t>
+            </w:r>
+          </w:p>
+        </w:tc>
+      </w:tr>
+      <w:tr>
+        <w:trPr>
+          <w:cantSplit/>
+        </w:trPr>
+        <w:tc>
+          <w:tcPr>
+            <w:tcW w:type="dxa" w:w="1440"/>
+            <w:vAlign w:val="top"/>
+            <w:tcMar>
+              <w:top w:w="85" w:type="dxa"/>
+              <w:bottom w:w="85" w:type="dxa"/>
+              <w:left w:w="85" w:type="dxa"/>
+              <w:right w:w="85" w:type="dxa"/>
+            </w:tcMar>
+            <w:tcBorders>
+              <w:top w:val="single" w:sz="4" w:color="D5DADD"/>
+              <w:bottom w:val="single" w:sz="4" w:color="D5DADD"/>
+              <w:left w:val="single" w:sz="4" w:color="D5DADD"/>
+              <w:right w:val="single" w:sz="4" w:color="D5DADD"/>
+            </w:tcBorders>
+          </w:tcPr>
+          <w:p>
+            <w:pPr>
+              <w:spacing w:after="60" w:line="245" w:lineRule="auto"/>
+            </w:pPr>
+            <w:r>
+              <w:rPr>
+                <w:rFonts w:ascii="Calibri" w:hAnsi="Calibri"/>
+                <w:b w:val="0"/>
+                <w:sz w:val="20"/>
+              </w:rPr>
+              <w:t>cowtest</w:t>
+            </w:r>
+          </w:p>
+        </w:tc>
+        <w:tc>
+          <w:tcPr>
+            <w:tcW w:type="dxa" w:w="1512"/>
+            <w:vAlign w:val="top"/>
+            <w:tcMar>
+              <w:top w:w="85" w:type="dxa"/>
+              <w:bottom w:w="85" w:type="dxa"/>
+              <w:left w:w="85" w:type="dxa"/>
+              <w:right w:w="85" w:type="dxa"/>
+            </w:tcMar>
+            <w:tcBorders>
+              <w:top w:val="single" w:sz="4" w:color="D5DADD"/>
+              <w:bottom w:val="single" w:sz="4" w:color="D5DADD"/>
+              <w:left w:val="single" w:sz="4" w:color="D5DADD"/>
+              <w:right w:val="single" w:sz="4" w:color="D5DADD"/>
+            </w:tcBorders>
+          </w:tcPr>
+          <w:p>
+            <w:pPr>
+              <w:spacing w:after="60" w:line="245" w:lineRule="auto"/>
+            </w:pPr>
+            <w:r>
+              <w:rPr>
+                <w:rFonts w:ascii="Calibri" w:hAnsi="Calibri"/>
+                <w:b w:val="0"/>
+                <w:sz w:val="20"/>
+              </w:rPr>
+              <w:t>Added test</w:t>
+            </w:r>
+          </w:p>
+        </w:tc>
+        <w:tc>
+          <w:tcPr>
+            <w:tcW w:type="dxa" w:w="7214"/>
+            <w:vAlign w:val="top"/>
+            <w:tcMar>
+              <w:top w:w="85" w:type="dxa"/>
+              <w:bottom w:w="85" w:type="dxa"/>
+              <w:left w:w="85" w:type="dxa"/>
+              <w:right w:w="85" w:type="dxa"/>
+            </w:tcMar>
+            <w:tcBorders>
+              <w:top w:val="single" w:sz="4" w:color="D5DADD"/>
+              <w:bottom w:val="single" w:sz="4" w:color="D5DADD"/>
+              <w:left w:val="single" w:sz="4" w:color="D5DADD"/>
+              <w:right w:val="single" w:sz="4" w:color="D5DADD"/>
+            </w:tcBorders>
+          </w:tcPr>
+          <w:p>
+            <w:pPr>
+              <w:spacing w:after="60" w:line="245" w:lineRule="auto"/>
+            </w:pPr>
+            <w:r>
+              <w:rPr>
+                <w:rFonts w:ascii="Calibri" w:hAnsi="Calibri"/>
+                <w:b w:val="0"/>
+                <w:sz w:val="20"/>
+              </w:rPr>
+              <w:t>Allocates and touches 80 MiB, forks, verifies inherited values, changes every thousandth page in the child, and checks that parent contents remain unchanged.</w:t>
+            </w:r>
+          </w:p>
+        </w:tc>
+      </w:tr>
+      <w:tr>
+        <w:trPr>
+          <w:cantSplit/>
+        </w:trPr>
+        <w:tc>
+          <w:tcPr>
+            <w:tcW w:type="dxa" w:w="1440"/>
+            <w:vAlign w:val="top"/>
+            <w:tcMar>
+              <w:top w:w="85" w:type="dxa"/>
+              <w:bottom w:w="85" w:type="dxa"/>
+              <w:left w:w="85" w:type="dxa"/>
+              <w:right w:w="85" w:type="dxa"/>
+            </w:tcMar>
+            <w:tcBorders>
+              <w:top w:val="single" w:sz="4" w:color="D5DADD"/>
+              <w:bottom w:val="single" w:sz="4" w:color="D5DADD"/>
+              <w:left w:val="single" w:sz="4" w:color="D5DADD"/>
+              <w:right w:val="single" w:sz="4" w:color="D5DADD"/>
+            </w:tcBorders>
+          </w:tcPr>
+          <w:p>
+            <w:pPr>
+              <w:spacing w:after="60" w:line="245" w:lineRule="auto"/>
+            </w:pPr>
+            <w:r>
+              <w:rPr>
+                <w:rFonts w:ascii="Calibri" w:hAnsi="Calibri"/>
+                <w:b w:val="0"/>
+                <w:sz w:val="20"/>
+              </w:rPr>
+              <w:t>forkbench</w:t>
+            </w:r>
+          </w:p>
+        </w:tc>
+        <w:tc>
+          <w:tcPr>
+            <w:tcW w:type="dxa" w:w="1512"/>
+            <w:vAlign w:val="top"/>
+            <w:tcMar>
+              <w:top w:w="85" w:type="dxa"/>
+              <w:bottom w:w="85" w:type="dxa"/>
+              <w:left w:w="85" w:type="dxa"/>
+              <w:right w:w="85" w:type="dxa"/>
+            </w:tcMar>
+            <w:tcBorders>
+              <w:top w:val="single" w:sz="4" w:color="D5DADD"/>
+              <w:bottom w:val="single" w:sz="4" w:color="D5DADD"/>
+              <w:left w:val="single" w:sz="4" w:color="D5DADD"/>
+              <w:right w:val="single" w:sz="4" w:color="D5DADD"/>
+            </w:tcBorders>
+          </w:tcPr>
+          <w:p>
+            <w:pPr>
+              <w:spacing w:after="60" w:line="245" w:lineRule="auto"/>
+            </w:pPr>
+            <w:r>
+              <w:rPr>
+                <w:rFonts w:ascii="Calibri" w:hAnsi="Calibri"/>
+                <w:b w:val="0"/>
+                <w:sz w:val="20"/>
+              </w:rPr>
+              <w:t>Added benchmark</w:t>
+            </w:r>
+          </w:p>
+        </w:tc>
+        <w:tc>
+          <w:tcPr>
+            <w:tcW w:type="dxa" w:w="7214"/>
+            <w:vAlign w:val="top"/>
+            <w:tcMar>
+              <w:top w:w="85" w:type="dxa"/>
+              <w:bottom w:w="85" w:type="dxa"/>
+              <w:left w:w="85" w:type="dxa"/>
+              <w:right w:w="85" w:type="dxa"/>
+            </w:tcMar>
+            <w:tcBorders>
+              <w:top w:val="single" w:sz="4" w:color="D5DADD"/>
+              <w:bottom w:val="single" w:sz="4" w:color="D5DADD"/>
+              <w:left w:val="single" w:sz="4" w:color="D5DADD"/>
+              <w:right w:val="single" w:sz="4" w:color="D5DADD"/>
+            </w:tcBorders>
+          </w:tcPr>
+          <w:p>
+            <w:pPr>
+              <w:spacing w:after="60" w:line="245" w:lineRule="auto"/>
+            </w:pPr>
+            <w:r>
+              <w:rPr>
+                <w:rFonts w:ascii="Calibri" w:hAnsi="Calibri"/>
+                <w:b w:val="0"/>
+                <w:sz w:val="20"/>
+              </w:rPr>
+              <w:t>Touches 20 MiB, times 50 sequential fork/wait cycles with uptime ticks, and checks child status. It measures a complete loop rather than an isolated kernel instruction.</w:t>
+            </w:r>
+          </w:p>
+        </w:tc>
+      </w:tr>
+      <w:tr>
+        <w:trPr>
+          <w:cantSplit/>
+        </w:trPr>
+        <w:tc>
+          <w:tcPr>
+            <w:tcW w:type="dxa" w:w="1440"/>
+            <w:vAlign w:val="top"/>
+            <w:tcMar>
+              <w:top w:w="85" w:type="dxa"/>
+              <w:bottom w:w="85" w:type="dxa"/>
+              <w:left w:w="85" w:type="dxa"/>
+              <w:right w:w="85" w:type="dxa"/>
+            </w:tcMar>
+            <w:tcBorders>
+              <w:top w:val="single" w:sz="4" w:color="D5DADD"/>
+              <w:bottom w:val="single" w:sz="4" w:color="D5DADD"/>
+              <w:left w:val="single" w:sz="4" w:color="D5DADD"/>
+              <w:right w:val="single" w:sz="4" w:color="D5DADD"/>
+            </w:tcBorders>
+          </w:tcPr>
+          <w:p>
+            <w:pPr>
+              <w:spacing w:after="60" w:line="245" w:lineRule="auto"/>
+            </w:pPr>
+            <w:r>
+              <w:rPr>
+                <w:rFonts w:ascii="Calibri" w:hAnsi="Calibri"/>
+                <w:b w:val="0"/>
+                <w:sz w:val="20"/>
+              </w:rPr>
+              <w:t>memstat</w:t>
+            </w:r>
+          </w:p>
+        </w:tc>
+        <w:tc>
+          <w:tcPr>
+            <w:tcW w:type="dxa" w:w="1512"/>
+            <w:vAlign w:val="top"/>
+            <w:tcMar>
+              <w:top w:w="85" w:type="dxa"/>
+              <w:bottom w:w="85" w:type="dxa"/>
+              <w:left w:w="85" w:type="dxa"/>
+              <w:right w:w="85" w:type="dxa"/>
+            </w:tcMar>
+            <w:tcBorders>
+              <w:top w:val="single" w:sz="4" w:color="D5DADD"/>
+              <w:bottom w:val="single" w:sz="4" w:color="D5DADD"/>
+              <w:left w:val="single" w:sz="4" w:color="D5DADD"/>
+              <w:right w:val="single" w:sz="4" w:color="D5DADD"/>
+            </w:tcBorders>
+          </w:tcPr>
+          <w:p>
+            <w:pPr>
+              <w:spacing w:after="60" w:line="245" w:lineRule="auto"/>
+            </w:pPr>
+            <w:r>
+              <w:rPr>
+                <w:rFonts w:ascii="Calibri" w:hAnsi="Calibri"/>
+                <w:b w:val="0"/>
+                <w:sz w:val="20"/>
+              </w:rPr>
+              <w:t>Added command and syscall</w:t>
+            </w:r>
+          </w:p>
+        </w:tc>
+        <w:tc>
+          <w:tcPr>
+            <w:tcW w:type="dxa" w:w="7214"/>
+            <w:vAlign w:val="top"/>
+            <w:tcMar>
+              <w:top w:w="85" w:type="dxa"/>
+              <w:bottom w:w="85" w:type="dxa"/>
+              <w:left w:w="85" w:type="dxa"/>
+              <w:right w:w="85" w:type="dxa"/>
+            </w:tcMar>
+            <w:tcBorders>
+              <w:top w:val="single" w:sz="4" w:color="D5DADD"/>
+              <w:bottom w:val="single" w:sz="4" w:color="D5DADD"/>
+              <w:left w:val="single" w:sz="4" w:color="D5DADD"/>
+              <w:right w:val="single" w:sz="4" w:color="D5DADD"/>
+            </w:tcBorders>
+          </w:tcPr>
+          <w:p>
+            <w:pPr>
+              <w:spacing w:after="60" w:line="245" w:lineRule="auto"/>
+            </w:pPr>
+            <w:r>
+              <w:rPr>
+                <w:rFonts w:ascii="Calibri" w:hAnsi="Calibri"/>
+                <w:b w:val="0"/>
+                <w:sz w:val="20"/>
+              </w:rPr>
+              <w:t>Requests the seven-field kernel structure and prints it. It observes counters/resources; it does not allocate the test workload or reset counters.</w:t>
+            </w:r>
+          </w:p>
+        </w:tc>
+      </w:tr>
+      <w:tr>
+        <w:trPr>
+          <w:cantSplit/>
+        </w:trPr>
+        <w:tc>
+          <w:tcPr>
+            <w:tcW w:type="dxa" w:w="1440"/>
+            <w:vAlign w:val="top"/>
+            <w:tcMar>
+              <w:top w:w="85" w:type="dxa"/>
+              <w:bottom w:w="85" w:type="dxa"/>
+              <w:left w:w="85" w:type="dxa"/>
+              <w:right w:w="85" w:type="dxa"/>
+            </w:tcMar>
+            <w:tcBorders>
+              <w:top w:val="single" w:sz="4" w:color="D5DADD"/>
+              <w:bottom w:val="single" w:sz="4" w:color="D5DADD"/>
+              <w:left w:val="single" w:sz="4" w:color="D5DADD"/>
+              <w:right w:val="single" w:sz="4" w:color="D5DADD"/>
+            </w:tcBorders>
+          </w:tcPr>
+          <w:p>
+            <w:pPr>
+              <w:spacing w:after="60" w:line="245" w:lineRule="auto"/>
+            </w:pPr>
+            <w:r>
+              <w:rPr>
+                <w:rFonts w:ascii="Calibri" w:hAnsi="Calibri"/>
+                <w:b w:val="0"/>
+                <w:sz w:val="20"/>
+              </w:rPr>
+              <w:t>memhog</w:t>
+            </w:r>
+          </w:p>
+        </w:tc>
+        <w:tc>
+          <w:tcPr>
+            <w:tcW w:type="dxa" w:w="1512"/>
+            <w:vAlign w:val="top"/>
+            <w:tcMar>
+              <w:top w:w="85" w:type="dxa"/>
+              <w:bottom w:w="85" w:type="dxa"/>
+              <w:left w:w="85" w:type="dxa"/>
+              <w:right w:w="85" w:type="dxa"/>
+            </w:tcMar>
+            <w:tcBorders>
+              <w:top w:val="single" w:sz="4" w:color="D5DADD"/>
+              <w:bottom w:val="single" w:sz="4" w:color="D5DADD"/>
+              <w:left w:val="single" w:sz="4" w:color="D5DADD"/>
+              <w:right w:val="single" w:sz="4" w:color="D5DADD"/>
+            </w:tcBorders>
+          </w:tcPr>
+          <w:p>
+            <w:pPr>
+              <w:spacing w:after="60" w:line="245" w:lineRule="auto"/>
+            </w:pPr>
+            <w:r>
+              <w:rPr>
+                <w:rFonts w:ascii="Calibri" w:hAnsi="Calibri"/>
+                <w:b w:val="0"/>
+                <w:sz w:val="20"/>
+              </w:rPr>
+              <w:t>Added pressure test</w:t>
+            </w:r>
+          </w:p>
+        </w:tc>
+        <w:tc>
+          <w:tcPr>
+            <w:tcW w:type="dxa" w:w="7214"/>
+            <w:vAlign w:val="top"/>
+            <w:tcMar>
+              <w:top w:w="85" w:type="dxa"/>
+              <w:bottom w:w="85" w:type="dxa"/>
+              <w:left w:w="85" w:type="dxa"/>
+              <w:right w:w="85" w:type="dxa"/>
+            </w:tcMar>
+            <w:tcBorders>
+              <w:top w:val="single" w:sz="4" w:color="D5DADD"/>
+              <w:bottom w:val="single" w:sz="4" w:color="D5DADD"/>
+              <w:left w:val="single" w:sz="4" w:color="D5DADD"/>
+              <w:right w:val="single" w:sz="4" w:color="D5DADD"/>
+            </w:tcBorders>
+          </w:tcPr>
+          <w:p>
+            <w:pPr>
+              <w:spacing w:after="60" w:line="245" w:lineRule="auto"/>
+            </w:pPr>
+            <w:r>
+              <w:rPr>
+                <w:rFonts w:ascii="Calibri" w:hAnsi="Calibri"/>
+                <w:b w:val="0"/>
+                <w:sz w:val="20"/>
+              </w:rPr>
+              <w:t>Runs the requested MiB workload in a child. Writes and verifies the first and last byte of each page, prints swap counters, and reports child exit status. Zero bad pages means those positions matched.</w:t>
+            </w:r>
+          </w:p>
+        </w:tc>
+      </w:tr>
+      <w:tr>
+        <w:trPr>
+          <w:cantSplit/>
+        </w:trPr>
+        <w:tc>
+          <w:tcPr>
+            <w:tcW w:type="dxa" w:w="1440"/>
+            <w:vAlign w:val="top"/>
+            <w:tcMar>
+              <w:top w:w="85" w:type="dxa"/>
+              <w:bottom w:w="85" w:type="dxa"/>
+              <w:left w:w="85" w:type="dxa"/>
+              <w:right w:w="85" w:type="dxa"/>
+            </w:tcMar>
+            <w:tcBorders>
+              <w:top w:val="single" w:sz="4" w:color="D5DADD"/>
+              <w:bottom w:val="single" w:sz="4" w:color="D5DADD"/>
+              <w:left w:val="single" w:sz="4" w:color="D5DADD"/>
+              <w:right w:val="single" w:sz="4" w:color="D5DADD"/>
+            </w:tcBorders>
+          </w:tcPr>
+          <w:p>
+            <w:pPr>
+              <w:spacing w:after="60" w:line="245" w:lineRule="auto"/>
+            </w:pPr>
+            <w:r>
+              <w:rPr>
+                <w:rFonts w:ascii="Calibri" w:hAnsi="Calibri"/>
+                <w:b w:val="0"/>
+                <w:sz w:val="20"/>
+              </w:rPr>
+              <w:t>hotcold</w:t>
+            </w:r>
+          </w:p>
+        </w:tc>
+        <w:tc>
+          <w:tcPr>
+            <w:tcW w:type="dxa" w:w="1512"/>
+            <w:vAlign w:val="top"/>
+            <w:tcMar>
+              <w:top w:w="85" w:type="dxa"/>
+              <w:bottom w:w="85" w:type="dxa"/>
+              <w:left w:w="85" w:type="dxa"/>
+              <w:right w:w="85" w:type="dxa"/>
+            </w:tcMar>
+            <w:tcBorders>
+              <w:top w:val="single" w:sz="4" w:color="D5DADD"/>
+              <w:bottom w:val="single" w:sz="4" w:color="D5DADD"/>
+              <w:left w:val="single" w:sz="4" w:color="D5DADD"/>
+              <w:right w:val="single" w:sz="4" w:color="D5DADD"/>
+            </w:tcBorders>
+          </w:tcPr>
+          <w:p>
+            <w:pPr>
+              <w:spacing w:after="60" w:line="245" w:lineRule="auto"/>
+            </w:pPr>
+            <w:r>
+              <w:rPr>
+                <w:rFonts w:ascii="Calibri" w:hAnsi="Calibri"/>
+                <w:b w:val="0"/>
+                <w:sz w:val="20"/>
+              </w:rPr>
+              <w:t>Added policy workload</w:t>
+            </w:r>
+          </w:p>
+        </w:tc>
+        <w:tc>
+          <w:tcPr>
+            <w:tcW w:type="dxa" w:w="7214"/>
+            <w:vAlign w:val="top"/>
+            <w:tcMar>
+              <w:top w:w="85" w:type="dxa"/>
+              <w:bottom w:w="85" w:type="dxa"/>
+              <w:left w:w="85" w:type="dxa"/>
+              <w:right w:w="85" w:type="dxa"/>
+            </w:tcMar>
+            <w:tcBorders>
+              <w:top w:val="single" w:sz="4" w:color="D5DADD"/>
+              <w:bottom w:val="single" w:sz="4" w:color="D5DADD"/>
+              <w:left w:val="single" w:sz="4" w:color="D5DADD"/>
+              <w:right w:val="single" w:sz="4" w:color="D5DADD"/>
+            </w:tcBorders>
+          </w:tcPr>
+          <w:p>
+            <w:pPr>
+              <w:spacing w:after="60" w:line="245" w:lineRule="auto"/>
+            </w:pPr>
+            <w:r>
+              <w:rPr>
+                <w:rFonts w:ascii="Calibri" w:hAnsi="Calibri"/>
+                <w:b w:val="0"/>
+                <w:sz w:val="20"/>
+              </w:rPr>
+              <w:t>Initializes 12 MiB, then measures three rounds of cold scans with selected hot-region revisits. It prints differences between internal memstat snapshots after initialization. It is not a full data-integrity test.</w:t>
+            </w:r>
+          </w:p>
+        </w:tc>
+      </w:tr>
+      <w:tr>
+        <w:trPr>
+          <w:cantSplit/>
+        </w:trPr>
+        <w:tc>
+          <w:tcPr>
+            <w:tcW w:type="dxa" w:w="1440"/>
+            <w:vAlign w:val="top"/>
+            <w:tcMar>
+              <w:top w:w="85" w:type="dxa"/>
+              <w:bottom w:w="85" w:type="dxa"/>
+              <w:left w:w="85" w:type="dxa"/>
+              <w:right w:w="85" w:type="dxa"/>
+            </w:tcMar>
+            <w:tcBorders>
+              <w:top w:val="single" w:sz="4" w:color="D5DADD"/>
+              <w:bottom w:val="single" w:sz="4" w:color="D5DADD"/>
+              <w:left w:val="single" w:sz="4" w:color="D5DADD"/>
+              <w:right w:val="single" w:sz="4" w:color="D5DADD"/>
+            </w:tcBorders>
+          </w:tcPr>
+          <w:p>
+            <w:pPr>
+              <w:spacing w:after="60" w:line="245" w:lineRule="auto"/>
+            </w:pPr>
+            <w:r>
+              <w:rPr>
+                <w:rFonts w:ascii="Calibri" w:hAnsi="Calibri"/>
+                <w:b w:val="0"/>
+                <w:sz w:val="20"/>
+              </w:rPr>
+              <w:t>swapfork</w:t>
+            </w:r>
+          </w:p>
+        </w:tc>
+        <w:tc>
+          <w:tcPr>
+            <w:tcW w:type="dxa" w:w="1512"/>
+            <w:vAlign w:val="top"/>
+            <w:tcMar>
+              <w:top w:w="85" w:type="dxa"/>
+              <w:bottom w:w="85" w:type="dxa"/>
+              <w:left w:w="85" w:type="dxa"/>
+              <w:right w:w="85" w:type="dxa"/>
+            </w:tcMar>
+            <w:tcBorders>
+              <w:top w:val="single" w:sz="4" w:color="D5DADD"/>
+              <w:bottom w:val="single" w:sz="4" w:color="D5DADD"/>
+              <w:left w:val="single" w:sz="4" w:color="D5DADD"/>
+              <w:right w:val="single" w:sz="4" w:color="D5DADD"/>
+            </w:tcBorders>
+          </w:tcPr>
+          <w:p>
+            <w:pPr>
+              <w:spacing w:after="60" w:line="245" w:lineRule="auto"/>
+            </w:pPr>
+            <w:r>
+              <w:rPr>
+                <w:rFonts w:ascii="Calibri" w:hAnsi="Calibri"/>
+                <w:b w:val="0"/>
+                <w:sz w:val="20"/>
+              </w:rPr>
+              <w:t>Added interaction test</w:t>
+            </w:r>
+          </w:p>
+        </w:tc>
+        <w:tc>
+          <w:tcPr>
+            <w:tcW w:type="dxa" w:w="7214"/>
+            <w:vAlign w:val="top"/>
+            <w:tcMar>
+              <w:top w:w="85" w:type="dxa"/>
+              <w:bottom w:w="85" w:type="dxa"/>
+              <w:left w:w="85" w:type="dxa"/>
+              <w:right w:w="85" w:type="dxa"/>
+            </w:tcMar>
+            <w:tcBorders>
+              <w:top w:val="single" w:sz="4" w:color="D5DADD"/>
+              <w:bottom w:val="single" w:sz="4" w:color="D5DADD"/>
+              <w:left w:val="single" w:sz="4" w:color="D5DADD"/>
+              <w:right w:val="single" w:sz="4" w:color="D5DADD"/>
+            </w:tcBorders>
+          </w:tcPr>
+          <w:p>
+            <w:pPr>
+              <w:spacing w:after="60" w:line="245" w:lineRule="auto"/>
+            </w:pPr>
+            <w:r>
+              <w:rPr>
+                <w:rFonts w:ascii="Calibri" w:hAnsi="Calibri"/>
+                <w:b w:val="0"/>
+                <w:sz w:val="20"/>
+              </w:rPr>
+              <w:t>Fills 6 MiB and forks. The child verifies inherited data, writes 77 into the second byte of every page and checks its private contents. The parent verifies its own second bytes remain zero.</w:t>
+            </w:r>
+          </w:p>
+        </w:tc>
+      </w:tr>
+      <w:tr>
+        <w:trPr>
+          <w:cantSplit/>
+        </w:trPr>
+        <w:tc>
+          <w:tcPr>
+            <w:tcW w:type="dxa" w:w="1440"/>
+            <w:vAlign w:val="top"/>
+            <w:tcMar>
+              <w:top w:w="85" w:type="dxa"/>
+              <w:bottom w:w="85" w:type="dxa"/>
+              <w:left w:w="85" w:type="dxa"/>
+              <w:right w:w="85" w:type="dxa"/>
+            </w:tcMar>
+            <w:tcBorders>
+              <w:top w:val="single" w:sz="4" w:color="D5DADD"/>
+              <w:bottom w:val="single" w:sz="4" w:color="D5DADD"/>
+              <w:left w:val="single" w:sz="4" w:color="D5DADD"/>
+              <w:right w:val="single" w:sz="4" w:color="D5DADD"/>
+            </w:tcBorders>
+          </w:tcPr>
+          <w:p>
+            <w:pPr>
+              <w:spacing w:after="60" w:line="245" w:lineRule="auto"/>
+            </w:pPr>
+            <w:r>
+              <w:rPr>
+                <w:rFonts w:ascii="Calibri" w:hAnsi="Calibri"/>
+                <w:b w:val="0"/>
+                <w:sz w:val="20"/>
+              </w:rPr>
+              <w:t>usertests</w:t>
+            </w:r>
+          </w:p>
+        </w:tc>
+        <w:tc>
+          <w:tcPr>
+            <w:tcW w:type="dxa" w:w="1512"/>
+            <w:vAlign w:val="top"/>
+            <w:tcMar>
+              <w:top w:w="85" w:type="dxa"/>
+              <w:bottom w:w="85" w:type="dxa"/>
+              <w:left w:w="85" w:type="dxa"/>
+              <w:right w:w="85" w:type="dxa"/>
+            </w:tcMar>
+            <w:tcBorders>
+              <w:top w:val="single" w:sz="4" w:color="D5DADD"/>
+              <w:bottom w:val="single" w:sz="4" w:color="D5DADD"/>
+              <w:left w:val="single" w:sz="4" w:color="D5DADD"/>
+              <w:right w:val="single" w:sz="4" w:color="D5DADD"/>
+            </w:tcBorders>
+          </w:tcPr>
+          <w:p>
+            <w:pPr>
+              <w:spacing w:after="60" w:line="245" w:lineRule="auto"/>
+            </w:pPr>
+            <w:r>
+              <w:rPr>
+                <w:rFonts w:ascii="Calibri" w:hAnsi="Calibri"/>
+                <w:b w:val="0"/>
+                <w:sz w:val="20"/>
+              </w:rPr>
+              <w:t>Existing xv6 suite</w:t>
+            </w:r>
+          </w:p>
+        </w:tc>
+        <w:tc>
+          <w:tcPr>
+            <w:tcW w:type="dxa" w:w="7214"/>
+            <w:vAlign w:val="top"/>
+            <w:tcMar>
+              <w:top w:w="85" w:type="dxa"/>
+              <w:bottom w:w="85" w:type="dxa"/>
+              <w:left w:w="85" w:type="dxa"/>
+              <w:right w:w="85" w:type="dxa"/>
+            </w:tcMar>
+            <w:tcBorders>
+              <w:top w:val="single" w:sz="4" w:color="D5DADD"/>
+              <w:bottom w:val="single" w:sz="4" w:color="D5DADD"/>
+              <w:left w:val="single" w:sz="4" w:color="D5DADD"/>
+              <w:right w:val="single" w:sz="4" w:color="D5DADD"/>
+            </w:tcBorders>
+          </w:tcPr>
+          <w:p>
+            <w:pPr>
+              <w:spacing w:after="60" w:line="245" w:lineRule="auto"/>
+            </w:pPr>
+            <w:r>
+              <w:rPr>
+                <w:rFonts w:ascii="Calibri" w:hAnsi="Calibri"/>
+                <w:b w:val="0"/>
+                <w:sz w:val="20"/>
+              </w:rPr>
+              <w:t>Exercises user copies, processes, heap growth, pipes, files, invalid accesses and exhaustion. We ran the inherited suite unchanged between v0.0 and v0.4 to detect regressions.</w:t>
+            </w:r>
+          </w:p>
+        </w:tc>
+      </w:tr>
+    </w:tbl>
+    <w:p>
+      <w:pPr>
+        <w:spacing w:after="60" w:line="20" w:lineRule="exact"/>
+      </w:pPr>
     </w:p>
     <w:p>
       <w:pPr>

</xml_diff>

<commit_message>
docs: explain original code and added memory test files
</commit_message>
<xml_diff>
--- a/docs/presentation/memory-implementation-walkthrough.docx
+++ b/docs/presentation/memory-implementation-walkthrough.docx
@@ -38,7 +38,28 @@
     </w:p>
     <w:p>
       <w:r>
-        <w:t>Previously, sys_sbrk invoked growproc for heap growth, which allocated and mapped physical pages before returning. We changed positive growth to extend p-&gt;sz after bounds checks. The kernel defers physical-frame allocation and PTE creation until the reserved address is accessed.</w:t>
+        <w:rPr>
+          <w:b/>
+        </w:rPr>
+        <w:t xml:space="preserve">Earlier code. </w:t>
+      </w:r>
+      <w:r>
+        <w:rPr>
+          <w:b w:val="0"/>
+        </w:rPr>
+        <w:t xml:space="preserve">sys_sbrk called growproc(n), which used uvmalloc to allocate and map physical pages before returning. A 200 MiB request could not fit in the 128 MiB configuration. </w:t>
+      </w:r>
+      <w:r>
+        <w:rPr>
+          <w:b/>
+        </w:rPr>
+        <w:t xml:space="preserve">What we changed. </w:t>
+      </w:r>
+      <w:r>
+        <w:rPr>
+          <w:b w:val="0"/>
+        </w:rPr>
+        <w:t>For positive growth, sys_sbrk now validates the range and updates p-&gt;sz, the process address-space limit. It reserves virtual addresses; it does not create resident mappings at this point.</w:t>
       </w:r>
     </w:p>
     <w:tbl>
@@ -244,7 +265,16 @@
     </w:p>
     <w:p>
       <w:r>
-        <w:t>On a load/store page fault, trap.c invokes handle_page_fault. The handler checks the process address bound and mapping permissions, rounds the address down to a page boundary, allocates and zeroes a frame, and installs a user-readable/writable mapping. A successful return retries the faulting instruction. Allocation failure or an invalid access causes process termination.</w:t>
+        <w:rPr>
+          <w:b/>
+        </w:rPr>
+        <w:t xml:space="preserve">Added recovery code. </w:t>
+      </w:r>
+      <w:r>
+        <w:rPr>
+          <w:b w:val="0"/>
+        </w:rPr>
+        <w:t>We introduced handle_page_fault in kernel/pgfault.c and invoked it from usertrap in kernel/trap.c. On a valid first access, it checks the address and permissions, rounds down to a page boundary, allocates and zeroes a frame, and installs a user mapping. The instruction then retries. Invalid access or unrecoverable allocation failure terminates the process.</w:t>
       </w:r>
     </w:p>
     <w:p>
@@ -286,7 +316,16 @@
     </w:p>
     <w:p>
       <w:r>
-        <w:t>baseline calls sbrk(200 * 1024 * 1024) and checks the return value without populating the range. Its later success establishes virtual reservation, not 200 MiB of resident RAM. lazytest reserves 256 MiB and verifies sparse writes, demand-zero behavior and a syscall buffer. Exhausting backing capacity on later access can still terminate the process.</w:t>
+        <w:rPr>
+          <w:b/>
+        </w:rPr>
+        <w:t xml:space="preserve">Test files we added. </w:t>
+      </w:r>
+      <w:r>
+        <w:rPr>
+          <w:b w:val="0"/>
+        </w:rPr>
+        <w:t>user/baseline.c calls sbrk(200 * 1024 * 1024) and checks its return value without populating the range. Its later success establishes virtual reservation. user/lazytest.c reserves 256 MiB and checks sparse writes, zero-filled pages and a syscall buffer. Later access can still fail when available physical and swap backing are exhausted.</w:t>
       </w:r>
     </w:p>
     <w:p>
@@ -315,7 +354,73 @@
     </w:p>
     <w:p>
       <w:r>
-        <w:t>The earlier uvmcopy allocated a new frame and copied each resident user page into the child. Our COW path constructs the child page table while sharing the parent data frames. Originally writable mappings lose PTE_W and gain PTE_COW in both address spaces. Existing read-only mappings retain their protection.</w:t>
+        <w:rPr>
+          <w:b/>
+        </w:rPr>
+        <w:t xml:space="preserve">Earlier code. </w:t>
+      </w:r>
+      <w:r>
+        <w:rPr>
+          <w:b w:val="0"/>
+        </w:rPr>
+        <w:t xml:space="preserve">fork used uvmcopy to allocate a separate frame and copy each resident parent page into the child. </w:t>
+      </w:r>
+      <w:r>
+        <w:rPr>
+          <w:b/>
+        </w:rPr>
+        <w:t xml:space="preserve">What we changed. </w:t>
+      </w:r>
+      <w:r>
+        <w:rPr>
+          <w:b w:val="0"/>
+        </w:rPr>
+        <w:t>uvmcopy now shares the data frames through separate page tables. Originally writable mappings lose PTE_W and gain PTE_COW in both processes. A write then triggers private-copy recovery. Existing read-only mappings retain their protection.</w:t>
+      </w:r>
+    </w:p>
+    <w:p>
+      <w:pPr>
+        <w:spacing w:after="120" w:line="247" w:lineRule="auto"/>
+      </w:pPr>
+      <w:r>
+        <w:rPr>
+          <w:rFonts w:ascii="Calibri" w:hAnsi="Calibri"/>
+          <w:b/>
+          <w:sz w:val="19"/>
+        </w:rPr>
+        <w:t>Earlier uvmcopy allocation and copy excerpt</w:t>
+      </w:r>
+    </w:p>
+    <w:p>
+      <w:pPr>
+        <w:spacing w:after="120" w:line="247" w:lineRule="auto"/>
+      </w:pPr>
+      <w:r>
+        <w:rPr>
+          <w:rFonts w:ascii="Consolas" w:hAnsi="Consolas"/>
+          <w:sz w:val="19"/>
+        </w:rPr>
+        <w:t xml:space="preserve">    if((mem = kalloc()) == 0)</w:t>
+      </w:r>
+      <w:r>
+        <w:br/>
+      </w:r>
+      <w:r>
+        <w:rPr>
+          <w:rFonts w:ascii="Consolas" w:hAnsi="Consolas"/>
+          <w:sz w:val="19"/>
+        </w:rPr>
+        <w:t xml:space="preserve">      goto err;</w:t>
+      </w:r>
+      <w:r>
+        <w:br/>
+      </w:r>
+      <w:r>
+        <w:rPr>
+          <w:rFonts w:ascii="Consolas" w:hAnsi="Consolas"/>
+          <w:sz w:val="19"/>
+        </w:rPr>
+        <w:t xml:space="preserve">    memmove(mem, (char*)pa, PGSIZE);</w:t>
       </w:r>
     </w:p>
     <w:p>
@@ -336,94 +441,21 @@
           <w:sz w:val="19"/>
         </w:rPr>
         <w:t xml:space="preserve">    if(*pte &amp; PTE_W){</w:t>
-      </w:r>
-      <w:r>
         <w:br/>
-      </w:r>
-      <w:r>
-        <w:rPr>
-          <w:rFonts w:ascii="Consolas" w:hAnsi="Consolas"/>
-          <w:sz w:val="19"/>
-        </w:rPr>
         <w:t xml:space="preserve">      // Writable pages become COW in both processes.</w:t>
-      </w:r>
-      <w:r>
         <w:br/>
-      </w:r>
-      <w:r>
-        <w:rPr>
-          <w:rFonts w:ascii="Consolas" w:hAnsi="Consolas"/>
-          <w:sz w:val="19"/>
-        </w:rPr>
         <w:t xml:space="preserve">      *pte = (*pte &amp; ~PTE_W) | PTE_COW;</w:t>
-      </w:r>
-      <w:r>
         <w:br/>
-      </w:r>
-      <w:r>
-        <w:rPr>
-          <w:rFonts w:ascii="Consolas" w:hAnsi="Consolas"/>
-          <w:sz w:val="19"/>
-        </w:rPr>
         <w:t xml:space="preserve">    }</w:t>
-      </w:r>
-      <w:r>
         <w:br/>
-      </w:r>
-      <w:r>
+        <w:t xml:space="preserve">    flags = PTE_FLAGS(*pte);</w:t>
         <w:br/>
-      </w:r>
-      <w:r>
-        <w:rPr>
-          <w:rFonts w:ascii="Consolas" w:hAnsi="Consolas"/>
-          <w:sz w:val="19"/>
-        </w:rPr>
-        <w:t xml:space="preserve">    flags = PTE_FLAGS(*pte);</w:t>
-      </w:r>
-      <w:r>
+        <w:t xml:space="preserve">    // Map the same physical page into the child.</w:t>
         <w:br/>
-      </w:r>
-      <w:r>
+        <w:t xml:space="preserve">    if(mappages(new, i, PGSIZE, pa, flags) != 0)</w:t>
         <w:br/>
-      </w:r>
-      <w:r>
-        <w:rPr>
-          <w:rFonts w:ascii="Consolas" w:hAnsi="Consolas"/>
-          <w:sz w:val="19"/>
-        </w:rPr>
-        <w:t xml:space="preserve">    // Map the same physical page into the child.</w:t>
-      </w:r>
-      <w:r>
+        <w:t xml:space="preserve">      goto err;</w:t>
         <w:br/>
-      </w:r>
-      <w:r>
-        <w:rPr>
-          <w:rFonts w:ascii="Consolas" w:hAnsi="Consolas"/>
-          <w:sz w:val="19"/>
-        </w:rPr>
-        <w:t xml:space="preserve">    if(mappages(new, i, PGSIZE, pa, flags) != 0)</w:t>
-      </w:r>
-      <w:r>
-        <w:br/>
-      </w:r>
-      <w:r>
-        <w:rPr>
-          <w:rFonts w:ascii="Consolas" w:hAnsi="Consolas"/>
-          <w:sz w:val="19"/>
-        </w:rPr>
-        <w:t xml:space="preserve">      goto err;</w:t>
-      </w:r>
-      <w:r>
-        <w:br/>
-      </w:r>
-      <w:r>
-        <w:br/>
-      </w:r>
-      <w:r>
-        <w:rPr>
-          <w:rFonts w:ascii="Consolas" w:hAnsi="Consolas"/>
-          <w:sz w:val="19"/>
-        </w:rPr>
         <w:t xml:space="preserve">    kref_inc((void*)pa);</w:t>
       </w:r>
     </w:p>
@@ -443,7 +475,10 @@
     </w:p>
     <w:p>
       <w:r>
-        <w:t>The mapping now uses the existing physical address pa instead of an immediately allocated copy. kref_inc records the additional owner. The allocator maintains a reference count for each physical frame, and kfree returns a frame to the free list only after its final reference is released.</w:t>
+        <w:rPr>
+          <w:b w:val="0"/>
+        </w:rPr>
+        <w:t>The new mappages call uses pa rather than an allocated copy. kref_inc records the additional owner. We added per-frame reference accounting, so kfree releases a shared frame only after its final reference is dropped.</w:t>
       </w:r>
     </w:p>
     <w:p>
@@ -1063,7 +1098,28 @@
     </w:p>
     <w:p>
       <w:r>
-        <w:t>Lazy allocation defers allocation but cannot satisfy an actively populated working set after available frames are exhausted. Before the swap engine, a 12 MiB memhog workload terminated under an 8 MiB usable-RAM limit. We extended the existing statistics stub in swap.c into an eviction and restoration subsystem.</w:t>
+        <w:rPr>
+          <w:b/>
+        </w:rPr>
+        <w:t xml:space="preserve">Earlier behavior. </w:t>
+      </w:r>
+      <w:r>
+        <w:rPr>
+          <w:b w:val="0"/>
+        </w:rPr>
+        <w:t xml:space="preserve">When physical frames ran out, allocation failed; no disk paging path existed. The 12 MiB memhog workload failed under an 8 MiB managed limit. </w:t>
+      </w:r>
+      <w:r>
+        <w:rPr>
+          <w:b/>
+        </w:rPr>
+        <w:t xml:space="preserve">What we added. </w:t>
+      </w:r>
+      <w:r>
+        <w:rPr>
+          <w:b w:val="0"/>
+        </w:rPr>
+        <w:t>We extended kernel/swap.c into a paging engine and updated allocation, fault recovery, fork and cleanup to recognize swap entries.</w:t>
       </w:r>
     </w:p>
     <w:p>
@@ -1627,7 +1683,28 @@
     </w:p>
     <w:p>
       <w:r>
-        <w:t>The swap engine separates victim selection from the transfer mechanism. Both policies operate on the same eligibility predicate. SWAP_POLICY=1 selects FIFO; SWAP_POLICY=2 selects Clock. Rebuilding clean is required when changing the policy configuration.</w:t>
+        <w:rPr>
+          <w:b/>
+        </w:rPr>
+        <w:t xml:space="preserve">Earlier behavior. </w:t>
+      </w:r>
+      <w:r>
+        <w:rPr>
+          <w:b w:val="0"/>
+        </w:rPr>
+        <w:t xml:space="preserve">The original allocator had no page replacement policy because it could not evict user data to disk. </w:t>
+      </w:r>
+      <w:r>
+        <w:rPr>
+          <w:b/>
+        </w:rPr>
+        <w:t xml:space="preserve">What we added. </w:t>
+      </w:r>
+      <w:r>
+        <w:rPr>
+          <w:b w:val="0"/>
+        </w:rPr>
+        <w:t>pick_victim in kernel/swap.c selects FIFO with SWAP_POLICY=1 or Clock with SWAP_POLICY=2. Both policies use the same eligibility checks and transfer code. A clean rebuild is required when changing the setting.</w:t>
       </w:r>
     </w:p>
     <w:p>
@@ -2183,7 +2260,28 @@
     </w:p>
     <w:p>
       <w:r>
-        <w:t>We added struct memstat, syscall number 22, sys_memstat and the user/memstat command. syscall.h and syscall.c register the call; user.h and usys.pl expose the user interface. memstat_fill collects counters and resource counts, and sys_memstat copies the structure to the user buffer through copyout.</w:t>
+        <w:rPr>
+          <w:b/>
+        </w:rPr>
+        <w:t xml:space="preserve">Earlier interface. </w:t>
+      </w:r>
+      <w:r>
+        <w:rPr>
+          <w:b w:val="0"/>
+        </w:rPr>
+        <w:t xml:space="preserve">The v0.0 kernel exposed no project memstat syscall or monitoring command. </w:t>
+      </w:r>
+      <w:r>
+        <w:rPr>
+          <w:b/>
+        </w:rPr>
+        <w:t xml:space="preserve">What we added. </w:t>
+      </w:r>
+      <w:r>
+        <w:rPr>
+          <w:b w:val="0"/>
+        </w:rPr>
+        <w:t>kernel/memstat.h defines the structure; syscall 22 invokes sys_memstat. memstat_fill collects its fields, and copyout returns them to the caller. user/memstat.c calls this interface and prints the results. syscall.h, syscall.c, user.h and usys.pl provide the registration and stub.</w:t>
       </w:r>
     </w:p>
     <w:tbl>
@@ -3091,7 +3189,10 @@
     </w:p>
     <w:p>
       <w:r>
-        <w:t>The memory changes are kernel mechanisms supported by user-space test programs. baseline.c issues sbrk(200 * 1024 * 1024); lazytest, cowtest, forkbench, memhog, swapfork and hotcold exercise the added behavior. Makefile entries place these commands in the xv6 filesystem image.</w:t>
+        <w:rPr>
+          <w:b w:val="0"/>
+        </w:rPr>
+        <w:t>The kernel files implement the features. We also added seven user-space workload/test files and the user/memstat.c observation command to exercise and measure those features. user/baseline.c was created before lazy allocation so the same request could be checked at both milestones. The test-file sections identify every file, its introduction point and its verification role.</w:t>
       </w:r>
     </w:p>
     <w:tbl>
@@ -7622,7 +7723,7 @@
         <w:pageBreakBefore/>
       </w:pPr>
       <w:r>
-        <w:t>Memory limits and test program behaviour</w:t>
+        <w:t>Memory limits and build configuration</w:t>
       </w:r>
     </w:p>
     <w:p>
@@ -7689,10 +7790,141 @@
       </w:pPr>
       <w:r>
         <w:rPr>
+          <w:b w:val="0"/>
+        </w:rPr>
+        <w:t>Policy 1 selects FIFO; policy 2 selects Clock. Clean rebuilding is required when changing these compilation settings. We also changed the Makefile UPROGS list so the newly added user programs are compiled and included in fs.img. Their relevant entries are:</w:t>
+      </w:r>
+    </w:p>
+    <w:p>
+      <w:pPr>
+        <w:spacing w:after="60" w:line="20" w:lineRule="exact"/>
+      </w:pPr>
+    </w:p>
+    <w:p>
+      <w:pPr>
+        <w:spacing w:after="120" w:line="247" w:lineRule="auto"/>
+      </w:pPr>
+      <w:r>
+        <w:rPr>
+          <w:rFonts w:ascii="Consolas" w:hAnsi="Consolas"/>
+          <w:sz w:val="20"/>
+        </w:rPr>
+        <w:t>$U/_baseline\</w:t>
+      </w:r>
+      <w:r>
+        <w:br/>
+      </w:r>
+      <w:r>
+        <w:rPr>
+          <w:rFonts w:ascii="Consolas" w:hAnsi="Consolas"/>
+          <w:sz w:val="20"/>
+        </w:rPr>
+        <w:t>$U/_lazytest\</w:t>
+      </w:r>
+      <w:r>
+        <w:br/>
+      </w:r>
+      <w:r>
+        <w:rPr>
+          <w:rFonts w:ascii="Consolas" w:hAnsi="Consolas"/>
+          <w:sz w:val="20"/>
+        </w:rPr>
+        <w:t>$U/_cowtest\</w:t>
+      </w:r>
+      <w:r>
+        <w:br/>
+      </w:r>
+      <w:r>
+        <w:rPr>
+          <w:rFonts w:ascii="Consolas" w:hAnsi="Consolas"/>
+          <w:sz w:val="20"/>
+        </w:rPr>
+        <w:t>$U/_forkbench\</w:t>
+      </w:r>
+      <w:r>
+        <w:br/>
+      </w:r>
+      <w:r>
+        <w:rPr>
+          <w:rFonts w:ascii="Consolas" w:hAnsi="Consolas"/>
+          <w:sz w:val="20"/>
+        </w:rPr>
+        <w:t>$U/_memstat\</w:t>
+      </w:r>
+      <w:r>
+        <w:br/>
+      </w:r>
+      <w:r>
+        <w:rPr>
+          <w:rFonts w:ascii="Consolas" w:hAnsi="Consolas"/>
+          <w:sz w:val="20"/>
+        </w:rPr>
+        <w:t>$U/_memhog\</w:t>
+      </w:r>
+      <w:r>
+        <w:br/>
+      </w:r>
+      <w:r>
+        <w:rPr>
+          <w:rFonts w:ascii="Consolas" w:hAnsi="Consolas"/>
+          <w:sz w:val="20"/>
+        </w:rPr>
+        <w:t>$U/_hotcold\</w:t>
+      </w:r>
+      <w:r>
+        <w:br/>
+      </w:r>
+      <w:r>
+        <w:rPr>
+          <w:rFonts w:ascii="Consolas" w:hAnsi="Consolas"/>
+          <w:sz w:val="20"/>
+        </w:rPr>
+        <w:t>$U/_swapfork\</w:t>
+      </w:r>
+    </w:p>
+    <w:p>
+      <w:pPr>
+        <w:spacing w:after="120" w:line="247" w:lineRule="auto"/>
+      </w:pPr>
+      <w:r>
+        <w:rPr>
           <w:rFonts w:ascii="Calibri" w:hAnsi="Calibri"/>
           <w:sz w:val="22"/>
         </w:rPr>
-        <w:t>Policy 1 selects FIFO; policy 2 selects Clock. Clean rebuilding is required when changing these compilation settings. The commands below are user programs, except that memstat also has a newly added kernel syscall behind its command.</w:t>
+        <w:t>For example, user/baseline.c is compiled into user/_baseline on the host, then placed in the image as baseline. We run baseline at the xv6 shell, where it enters the kernel through the existing sbrk syscall. This user test does not implement lazy allocation; the changed kernel decides how to satisfy the request.</w:t>
+      </w:r>
+    </w:p>
+    <w:p>
+      <w:pPr>
+        <w:spacing w:after="120" w:line="247" w:lineRule="auto"/>
+      </w:pPr>
+      <w:r>
+        <w:rPr>
+          <w:rFonts w:ascii="Calibri" w:hAnsi="Calibri"/>
+          <w:sz w:val="22"/>
+        </w:rPr>
+        <w:t>The same separation applies to cowtest and the swap workloads. They drive fork, user-memory accesses and file/syscall buffers so that the kernel mechanisms are exercised under controlled conditions. memstat observes the results. usertests is an inherited regression suite, rather than another file created for this project.</w:t>
+      </w:r>
+    </w:p>
+    <w:p>
+      <w:pPr>
+        <w:pStyle w:val="Heading1"/>
+        <w:pageBreakBefore/>
+      </w:pPr>
+      <w:r>
+        <w:t>Test files we created for allocation and fork</w:t>
+      </w:r>
+    </w:p>
+    <w:p>
+      <w:pPr>
+        <w:spacing w:after="120" w:line="247" w:lineRule="auto"/>
+      </w:pPr>
+      <w:r>
+        <w:rPr>
+          <w:rFonts w:ascii="Calibri" w:hAnsi="Calibri"/>
+          <w:sz w:val="22"/>
+        </w:rPr>
+        <w:t>We created the following four user-space source files for this project. They were absent from the chosen historical xv6 baseline. The baseline and fork comparison programs were added before changing their respective kernel mechanisms, allowing the same workloads to be used before and after implementation.</w:t>
       </w:r>
     </w:p>
     <w:tbl>
@@ -7703,9 +7935,9 @@
         <w:tblLook w:firstColumn="1" w:firstRow="1" w:lastColumn="0" w:lastRow="0" w:noHBand="0" w:noVBand="1" w:val="04A0"/>
       </w:tblPr>
       <w:tblGrid>
-        <w:gridCol w:w="1440"/>
-        <w:gridCol w:w="1512"/>
-        <w:gridCol w:w="7214"/>
+        <w:gridCol w:w="2376"/>
+        <w:gridCol w:w="1555"/>
+        <w:gridCol w:w="6235"/>
       </w:tblGrid>
       <w:tr>
         <w:trPr>
@@ -7714,25 +7946,25 @@
         </w:trPr>
         <w:tc>
           <w:tcPr>
-            <w:tcW w:type="dxa" w:w="1440"/>
-            <w:vAlign w:val="top"/>
-            <w:tcMar>
-              <w:top w:w="85" w:type="dxa"/>
-              <w:bottom w:w="85" w:type="dxa"/>
-              <w:left w:w="85" w:type="dxa"/>
-              <w:right w:w="85" w:type="dxa"/>
-            </w:tcMar>
-            <w:tcBorders>
-              <w:top w:val="single" w:sz="4" w:color="D5DADD"/>
-              <w:bottom w:val="single" w:sz="4" w:color="D5DADD"/>
-              <w:left w:val="single" w:sz="4" w:color="D5DADD"/>
-              <w:right w:val="single" w:sz="4" w:color="D5DADD"/>
+            <w:tcW w:type="dxa" w:w="2376"/>
+            <w:vAlign w:val="center"/>
+            <w:tcMar>
+              <w:top w:w="95" w:type="dxa"/>
+              <w:bottom w:w="95" w:type="dxa"/>
+              <w:left w:w="95" w:type="dxa"/>
+              <w:right w:w="95" w:type="dxa"/>
+            </w:tcMar>
+            <w:tcBorders>
+              <w:top w:val="single" w:sz="4" w:color="D9D9D9"/>
+              <w:bottom w:val="single" w:sz="4" w:color="D9D9D9"/>
+              <w:left w:val="single" w:sz="4" w:color="D9D9D9"/>
+              <w:right w:val="single" w:sz="4" w:color="D9D9D9"/>
             </w:tcBorders>
             <w:shd w:fill="EDF1F4"/>
           </w:tcPr>
           <w:p>
             <w:pPr>
-              <w:spacing w:after="60" w:line="245" w:lineRule="auto"/>
+              <w:spacing w:after="60" w:line="247" w:lineRule="auto"/>
             </w:pPr>
             <w:r>
               <w:rPr>
@@ -7740,31 +7972,31 @@
                 <w:b/>
                 <w:sz w:val="20"/>
               </w:rPr>
-              <w:t>Program</w:t>
-            </w:r>
-          </w:p>
-        </w:tc>
-        <w:tc>
-          <w:tcPr>
-            <w:tcW w:type="dxa" w:w="1512"/>
-            <w:vAlign w:val="top"/>
-            <w:tcMar>
-              <w:top w:w="85" w:type="dxa"/>
-              <w:bottom w:w="85" w:type="dxa"/>
-              <w:left w:w="85" w:type="dxa"/>
-              <w:right w:w="85" w:type="dxa"/>
-            </w:tcMar>
-            <w:tcBorders>
-              <w:top w:val="single" w:sz="4" w:color="D5DADD"/>
-              <w:bottom w:val="single" w:sz="4" w:color="D5DADD"/>
-              <w:left w:val="single" w:sz="4" w:color="D5DADD"/>
-              <w:right w:val="single" w:sz="4" w:color="D5DADD"/>
+              <w:t>Source file we added</w:t>
+            </w:r>
+          </w:p>
+        </w:tc>
+        <w:tc>
+          <w:tcPr>
+            <w:tcW w:type="dxa" w:w="1555"/>
+            <w:vAlign w:val="center"/>
+            <w:tcMar>
+              <w:top w:w="95" w:type="dxa"/>
+              <w:bottom w:w="95" w:type="dxa"/>
+              <w:left w:w="95" w:type="dxa"/>
+              <w:right w:w="95" w:type="dxa"/>
+            </w:tcMar>
+            <w:tcBorders>
+              <w:top w:val="single" w:sz="4" w:color="D9D9D9"/>
+              <w:bottom w:val="single" w:sz="4" w:color="D9D9D9"/>
+              <w:left w:val="single" w:sz="4" w:color="D9D9D9"/>
+              <w:right w:val="single" w:sz="4" w:color="D9D9D9"/>
             </w:tcBorders>
             <w:shd w:fill="EDF1F4"/>
           </w:tcPr>
           <w:p>
             <w:pPr>
-              <w:spacing w:after="60" w:line="245" w:lineRule="auto"/>
+              <w:spacing w:after="60" w:line="247" w:lineRule="auto"/>
             </w:pPr>
             <w:r>
               <w:rPr>
@@ -7772,31 +8004,31 @@
                 <w:b/>
                 <w:sz w:val="20"/>
               </w:rPr>
-              <w:t>Origin</w:t>
-            </w:r>
-          </w:p>
-        </w:tc>
-        <w:tc>
-          <w:tcPr>
-            <w:tcW w:type="dxa" w:w="7214"/>
-            <w:vAlign w:val="top"/>
-            <w:tcMar>
-              <w:top w:w="85" w:type="dxa"/>
-              <w:bottom w:w="85" w:type="dxa"/>
-              <w:left w:w="85" w:type="dxa"/>
-              <w:right w:w="85" w:type="dxa"/>
-            </w:tcMar>
-            <w:tcBorders>
-              <w:top w:val="single" w:sz="4" w:color="D5DADD"/>
-              <w:bottom w:val="single" w:sz="4" w:color="D5DADD"/>
-              <w:left w:val="single" w:sz="4" w:color="D5DADD"/>
-              <w:right w:val="single" w:sz="4" w:color="D5DADD"/>
+              <w:t>First added</w:t>
+            </w:r>
+          </w:p>
+        </w:tc>
+        <w:tc>
+          <w:tcPr>
+            <w:tcW w:type="dxa" w:w="6235"/>
+            <w:vAlign w:val="center"/>
+            <w:tcMar>
+              <w:top w:w="95" w:type="dxa"/>
+              <w:bottom w:w="95" w:type="dxa"/>
+              <w:left w:w="95" w:type="dxa"/>
+              <w:right w:w="95" w:type="dxa"/>
+            </w:tcMar>
+            <w:tcBorders>
+              <w:top w:val="single" w:sz="4" w:color="D9D9D9"/>
+              <w:bottom w:val="single" w:sz="4" w:color="D9D9D9"/>
+              <w:left w:val="single" w:sz="4" w:color="D9D9D9"/>
+              <w:right w:val="single" w:sz="4" w:color="D9D9D9"/>
             </w:tcBorders>
             <w:shd w:fill="EDF1F4"/>
           </w:tcPr>
           <w:p>
             <w:pPr>
-              <w:spacing w:after="60" w:line="245" w:lineRule="auto"/>
+              <w:spacing w:after="60" w:line="247" w:lineRule="auto"/>
             </w:pPr>
             <w:r>
               <w:rPr>
@@ -7804,7 +8036,7 @@
                 <w:b/>
                 <w:sz w:val="20"/>
               </w:rPr>
-              <w:t>Actual code behavior and interpretation</w:t>
+              <w:t>What the test code does</w:t>
             </w:r>
           </w:p>
         </w:tc>
@@ -7815,24 +8047,24 @@
         </w:trPr>
         <w:tc>
           <w:tcPr>
-            <w:tcW w:type="dxa" w:w="1440"/>
-            <w:vAlign w:val="top"/>
-            <w:tcMar>
-              <w:top w:w="85" w:type="dxa"/>
-              <w:bottom w:w="85" w:type="dxa"/>
-              <w:left w:w="85" w:type="dxa"/>
-              <w:right w:w="85" w:type="dxa"/>
-            </w:tcMar>
-            <w:tcBorders>
-              <w:top w:val="single" w:sz="4" w:color="D5DADD"/>
-              <w:bottom w:val="single" w:sz="4" w:color="D5DADD"/>
-              <w:left w:val="single" w:sz="4" w:color="D5DADD"/>
-              <w:right w:val="single" w:sz="4" w:color="D5DADD"/>
-            </w:tcBorders>
-          </w:tcPr>
-          <w:p>
-            <w:pPr>
-              <w:spacing w:after="60" w:line="245" w:lineRule="auto"/>
+            <w:tcW w:type="dxa" w:w="2376"/>
+            <w:vAlign w:val="center"/>
+            <w:tcMar>
+              <w:top w:w="95" w:type="dxa"/>
+              <w:bottom w:w="95" w:type="dxa"/>
+              <w:left w:w="95" w:type="dxa"/>
+              <w:right w:w="95" w:type="dxa"/>
+            </w:tcMar>
+            <w:tcBorders>
+              <w:top w:val="single" w:sz="4" w:color="D9D9D9"/>
+              <w:bottom w:val="single" w:sz="4" w:color="D9D9D9"/>
+              <w:left w:val="single" w:sz="4" w:color="D9D9D9"/>
+              <w:right w:val="single" w:sz="4" w:color="D9D9D9"/>
+            </w:tcBorders>
+          </w:tcPr>
+          <w:p>
+            <w:pPr>
+              <w:spacing w:after="60" w:line="247" w:lineRule="auto"/>
             </w:pPr>
             <w:r>
               <w:rPr>
@@ -7840,30 +8072,30 @@
                 <w:b w:val="0"/>
                 <w:sz w:val="20"/>
               </w:rPr>
-              <w:t>baseline</w:t>
-            </w:r>
-          </w:p>
-        </w:tc>
-        <w:tc>
-          <w:tcPr>
-            <w:tcW w:type="dxa" w:w="1512"/>
-            <w:vAlign w:val="top"/>
-            <w:tcMar>
-              <w:top w:w="85" w:type="dxa"/>
-              <w:bottom w:w="85" w:type="dxa"/>
-              <w:left w:w="85" w:type="dxa"/>
-              <w:right w:w="85" w:type="dxa"/>
-            </w:tcMar>
-            <w:tcBorders>
-              <w:top w:val="single" w:sz="4" w:color="D5DADD"/>
-              <w:bottom w:val="single" w:sz="4" w:color="D5DADD"/>
-              <w:left w:val="single" w:sz="4" w:color="D5DADD"/>
-              <w:right w:val="single" w:sz="4" w:color="D5DADD"/>
-            </w:tcBorders>
-          </w:tcPr>
-          <w:p>
-            <w:pPr>
-              <w:spacing w:after="60" w:line="245" w:lineRule="auto"/>
+              <w:t>user/baseline.c</w:t>
+            </w:r>
+          </w:p>
+        </w:tc>
+        <w:tc>
+          <w:tcPr>
+            <w:tcW w:type="dxa" w:w="1555"/>
+            <w:vAlign w:val="center"/>
+            <w:tcMar>
+              <w:top w:w="95" w:type="dxa"/>
+              <w:bottom w:w="95" w:type="dxa"/>
+              <w:left w:w="95" w:type="dxa"/>
+              <w:right w:w="95" w:type="dxa"/>
+            </w:tcMar>
+            <w:tcBorders>
+              <w:top w:val="single" w:sz="4" w:color="D9D9D9"/>
+              <w:bottom w:val="single" w:sz="4" w:color="D9D9D9"/>
+              <w:left w:val="single" w:sz="4" w:color="D9D9D9"/>
+              <w:right w:val="single" w:sz="4" w:color="D9D9D9"/>
+            </w:tcBorders>
+          </w:tcPr>
+          <w:p>
+            <w:pPr>
+              <w:spacing w:after="60" w:line="247" w:lineRule="auto"/>
             </w:pPr>
             <w:r>
               <w:rPr>
@@ -7871,30 +8103,30 @@
                 <w:b w:val="0"/>
                 <w:sz w:val="20"/>
               </w:rPr>
-              <w:t>Project baseline test</w:t>
-            </w:r>
-          </w:p>
-        </w:tc>
-        <w:tc>
-          <w:tcPr>
-            <w:tcW w:type="dxa" w:w="7214"/>
-            <w:vAlign w:val="top"/>
-            <w:tcMar>
-              <w:top w:w="85" w:type="dxa"/>
-              <w:bottom w:w="85" w:type="dxa"/>
-              <w:left w:w="85" w:type="dxa"/>
-              <w:right w:w="85" w:type="dxa"/>
-            </w:tcMar>
-            <w:tcBorders>
-              <w:top w:val="single" w:sz="4" w:color="D5DADD"/>
-              <w:bottom w:val="single" w:sz="4" w:color="D5DADD"/>
-              <w:left w:val="single" w:sz="4" w:color="D5DADD"/>
-              <w:right w:val="single" w:sz="4" w:color="D5DADD"/>
-            </w:tcBorders>
-          </w:tcPr>
-          <w:p>
-            <w:pPr>
-              <w:spacing w:after="60" w:line="245" w:lineRule="auto"/>
+              <w:t>v0.0</w:t>
+            </w:r>
+          </w:p>
+        </w:tc>
+        <w:tc>
+          <w:tcPr>
+            <w:tcW w:type="dxa" w:w="6235"/>
+            <w:vAlign w:val="center"/>
+            <w:tcMar>
+              <w:top w:w="95" w:type="dxa"/>
+              <w:bottom w:w="95" w:type="dxa"/>
+              <w:left w:w="95" w:type="dxa"/>
+              <w:right w:w="95" w:type="dxa"/>
+            </w:tcMar>
+            <w:tcBorders>
+              <w:top w:val="single" w:sz="4" w:color="D9D9D9"/>
+              <w:bottom w:val="single" w:sz="4" w:color="D9D9D9"/>
+              <w:left w:val="single" w:sz="4" w:color="D9D9D9"/>
+              <w:right w:val="single" w:sz="4" w:color="D9D9D9"/>
+            </w:tcBorders>
+          </w:tcPr>
+          <w:p>
+            <w:pPr>
+              <w:spacing w:after="60" w:line="247" w:lineRule="auto"/>
             </w:pPr>
             <w:r>
               <w:rPr>
@@ -7902,7 +8134,7 @@
                 <w:b w:val="0"/>
                 <w:sz w:val="20"/>
               </w:rPr>
-              <w:t>Calls sbrk(200 * 1024 * 1024), checks the return value and exits without populating the range. It compares reservation behavior, not 200 MiB residency.</w:t>
+              <w:t>Requests 200 MiB through sbrk and prints whether it was accepted. It does not write into the reserved range; this is a reservation comparison.</w:t>
             </w:r>
           </w:p>
         </w:tc>
@@ -7913,24 +8145,24 @@
         </w:trPr>
         <w:tc>
           <w:tcPr>
-            <w:tcW w:type="dxa" w:w="1440"/>
-            <w:vAlign w:val="top"/>
-            <w:tcMar>
-              <w:top w:w="85" w:type="dxa"/>
-              <w:bottom w:w="85" w:type="dxa"/>
-              <w:left w:w="85" w:type="dxa"/>
-              <w:right w:w="85" w:type="dxa"/>
-            </w:tcMar>
-            <w:tcBorders>
-              <w:top w:val="single" w:sz="4" w:color="D5DADD"/>
-              <w:bottom w:val="single" w:sz="4" w:color="D5DADD"/>
-              <w:left w:val="single" w:sz="4" w:color="D5DADD"/>
-              <w:right w:val="single" w:sz="4" w:color="D5DADD"/>
-            </w:tcBorders>
-          </w:tcPr>
-          <w:p>
-            <w:pPr>
-              <w:spacing w:after="60" w:line="245" w:lineRule="auto"/>
+            <w:tcW w:type="dxa" w:w="2376"/>
+            <w:vAlign w:val="center"/>
+            <w:tcMar>
+              <w:top w:w="95" w:type="dxa"/>
+              <w:bottom w:w="95" w:type="dxa"/>
+              <w:left w:w="95" w:type="dxa"/>
+              <w:right w:w="95" w:type="dxa"/>
+            </w:tcMar>
+            <w:tcBorders>
+              <w:top w:val="single" w:sz="4" w:color="D9D9D9"/>
+              <w:bottom w:val="single" w:sz="4" w:color="D9D9D9"/>
+              <w:left w:val="single" w:sz="4" w:color="D9D9D9"/>
+              <w:right w:val="single" w:sz="4" w:color="D9D9D9"/>
+            </w:tcBorders>
+          </w:tcPr>
+          <w:p>
+            <w:pPr>
+              <w:spacing w:after="60" w:line="247" w:lineRule="auto"/>
             </w:pPr>
             <w:r>
               <w:rPr>
@@ -7938,30 +8170,30 @@
                 <w:b w:val="0"/>
                 <w:sz w:val="20"/>
               </w:rPr>
-              <w:t>cowtest</w:t>
-            </w:r>
-          </w:p>
-        </w:tc>
-        <w:tc>
-          <w:tcPr>
-            <w:tcW w:type="dxa" w:w="1512"/>
-            <w:vAlign w:val="top"/>
-            <w:tcMar>
-              <w:top w:w="85" w:type="dxa"/>
-              <w:bottom w:w="85" w:type="dxa"/>
-              <w:left w:w="85" w:type="dxa"/>
-              <w:right w:w="85" w:type="dxa"/>
-            </w:tcMar>
-            <w:tcBorders>
-              <w:top w:val="single" w:sz="4" w:color="D5DADD"/>
-              <w:bottom w:val="single" w:sz="4" w:color="D5DADD"/>
-              <w:left w:val="single" w:sz="4" w:color="D5DADD"/>
-              <w:right w:val="single" w:sz="4" w:color="D5DADD"/>
-            </w:tcBorders>
-          </w:tcPr>
-          <w:p>
-            <w:pPr>
-              <w:spacing w:after="60" w:line="245" w:lineRule="auto"/>
+              <w:t>user/lazytest.c</w:t>
+            </w:r>
+          </w:p>
+        </w:tc>
+        <w:tc>
+          <w:tcPr>
+            <w:tcW w:type="dxa" w:w="1555"/>
+            <w:vAlign w:val="center"/>
+            <w:tcMar>
+              <w:top w:w="95" w:type="dxa"/>
+              <w:bottom w:w="95" w:type="dxa"/>
+              <w:left w:w="95" w:type="dxa"/>
+              <w:right w:w="95" w:type="dxa"/>
+            </w:tcMar>
+            <w:tcBorders>
+              <w:top w:val="single" w:sz="4" w:color="D9D9D9"/>
+              <w:bottom w:val="single" w:sz="4" w:color="D9D9D9"/>
+              <w:left w:val="single" w:sz="4" w:color="D9D9D9"/>
+              <w:right w:val="single" w:sz="4" w:color="D9D9D9"/>
+            </w:tcBorders>
+          </w:tcPr>
+          <w:p>
+            <w:pPr>
+              <w:spacing w:after="60" w:line="247" w:lineRule="auto"/>
             </w:pPr>
             <w:r>
               <w:rPr>
@@ -7969,30 +8201,30 @@
                 <w:b w:val="0"/>
                 <w:sz w:val="20"/>
               </w:rPr>
-              <w:t>Added test</w:t>
-            </w:r>
-          </w:p>
-        </w:tc>
-        <w:tc>
-          <w:tcPr>
-            <w:tcW w:type="dxa" w:w="7214"/>
-            <w:vAlign w:val="top"/>
-            <w:tcMar>
-              <w:top w:w="85" w:type="dxa"/>
-              <w:bottom w:w="85" w:type="dxa"/>
-              <w:left w:w="85" w:type="dxa"/>
-              <w:right w:w="85" w:type="dxa"/>
-            </w:tcMar>
-            <w:tcBorders>
-              <w:top w:val="single" w:sz="4" w:color="D5DADD"/>
-              <w:bottom w:val="single" w:sz="4" w:color="D5DADD"/>
-              <w:left w:val="single" w:sz="4" w:color="D5DADD"/>
-              <w:right w:val="single" w:sz="4" w:color="D5DADD"/>
-            </w:tcBorders>
-          </w:tcPr>
-          <w:p>
-            <w:pPr>
-              <w:spacing w:after="60" w:line="245" w:lineRule="auto"/>
+              <w:t>v0.1</w:t>
+            </w:r>
+          </w:p>
+        </w:tc>
+        <w:tc>
+          <w:tcPr>
+            <w:tcW w:type="dxa" w:w="6235"/>
+            <w:vAlign w:val="center"/>
+            <w:tcMar>
+              <w:top w:w="95" w:type="dxa"/>
+              <w:bottom w:w="95" w:type="dxa"/>
+              <w:left w:w="95" w:type="dxa"/>
+              <w:right w:w="95" w:type="dxa"/>
+            </w:tcMar>
+            <w:tcBorders>
+              <w:top w:val="single" w:sz="4" w:color="D9D9D9"/>
+              <w:bottom w:val="single" w:sz="4" w:color="D9D9D9"/>
+              <w:left w:val="single" w:sz="4" w:color="D9D9D9"/>
+              <w:right w:val="single" w:sz="4" w:color="D9D9D9"/>
+            </w:tcBorders>
+          </w:tcPr>
+          <w:p>
+            <w:pPr>
+              <w:spacing w:after="60" w:line="247" w:lineRule="auto"/>
             </w:pPr>
             <w:r>
               <w:rPr>
@@ -8000,7 +8232,7 @@
                 <w:b w:val="0"/>
                 <w:sz w:val="20"/>
               </w:rPr>
-              <w:t>Allocates and touches 80 MiB, forks, verifies inherited values, changes every thousandth page in the child, and checks that parent contents remain unchanged.</w:t>
+              <w:t>Reserves 256 MiB, writes and verifies every hundredth page, checks a fresh page reads as zero, and reads README into an untouched user buffer. It reports 656 sparse write-touched pages.</w:t>
             </w:r>
           </w:p>
         </w:tc>
@@ -8011,24 +8243,24 @@
         </w:trPr>
         <w:tc>
           <w:tcPr>
-            <w:tcW w:type="dxa" w:w="1440"/>
-            <w:vAlign w:val="top"/>
-            <w:tcMar>
-              <w:top w:w="85" w:type="dxa"/>
-              <w:bottom w:w="85" w:type="dxa"/>
-              <w:left w:w="85" w:type="dxa"/>
-              <w:right w:w="85" w:type="dxa"/>
-            </w:tcMar>
-            <w:tcBorders>
-              <w:top w:val="single" w:sz="4" w:color="D5DADD"/>
-              <w:bottom w:val="single" w:sz="4" w:color="D5DADD"/>
-              <w:left w:val="single" w:sz="4" w:color="D5DADD"/>
-              <w:right w:val="single" w:sz="4" w:color="D5DADD"/>
-            </w:tcBorders>
-          </w:tcPr>
-          <w:p>
-            <w:pPr>
-              <w:spacing w:after="60" w:line="245" w:lineRule="auto"/>
+            <w:tcW w:type="dxa" w:w="2376"/>
+            <w:vAlign w:val="center"/>
+            <w:tcMar>
+              <w:top w:w="95" w:type="dxa"/>
+              <w:bottom w:w="95" w:type="dxa"/>
+              <w:left w:w="95" w:type="dxa"/>
+              <w:right w:w="95" w:type="dxa"/>
+            </w:tcMar>
+            <w:tcBorders>
+              <w:top w:val="single" w:sz="4" w:color="D9D9D9"/>
+              <w:bottom w:val="single" w:sz="4" w:color="D9D9D9"/>
+              <w:left w:val="single" w:sz="4" w:color="D9D9D9"/>
+              <w:right w:val="single" w:sz="4" w:color="D9D9D9"/>
+            </w:tcBorders>
+          </w:tcPr>
+          <w:p>
+            <w:pPr>
+              <w:spacing w:after="60" w:line="247" w:lineRule="auto"/>
             </w:pPr>
             <w:r>
               <w:rPr>
@@ -8036,30 +8268,30 @@
                 <w:b w:val="0"/>
                 <w:sz w:val="20"/>
               </w:rPr>
-              <w:t>forkbench</w:t>
-            </w:r>
-          </w:p>
-        </w:tc>
-        <w:tc>
-          <w:tcPr>
-            <w:tcW w:type="dxa" w:w="1512"/>
-            <w:vAlign w:val="top"/>
-            <w:tcMar>
-              <w:top w:w="85" w:type="dxa"/>
-              <w:bottom w:w="85" w:type="dxa"/>
-              <w:left w:w="85" w:type="dxa"/>
-              <w:right w:w="85" w:type="dxa"/>
-            </w:tcMar>
-            <w:tcBorders>
-              <w:top w:val="single" w:sz="4" w:color="D5DADD"/>
-              <w:bottom w:val="single" w:sz="4" w:color="D5DADD"/>
-              <w:left w:val="single" w:sz="4" w:color="D5DADD"/>
-              <w:right w:val="single" w:sz="4" w:color="D5DADD"/>
-            </w:tcBorders>
-          </w:tcPr>
-          <w:p>
-            <w:pPr>
-              <w:spacing w:after="60" w:line="245" w:lineRule="auto"/>
+              <w:t>user/cowtest.c</w:t>
+            </w:r>
+          </w:p>
+        </w:tc>
+        <w:tc>
+          <w:tcPr>
+            <w:tcW w:type="dxa" w:w="1555"/>
+            <w:vAlign w:val="center"/>
+            <w:tcMar>
+              <w:top w:w="95" w:type="dxa"/>
+              <w:bottom w:w="95" w:type="dxa"/>
+              <w:left w:w="95" w:type="dxa"/>
+              <w:right w:w="95" w:type="dxa"/>
+            </w:tcMar>
+            <w:tcBorders>
+              <w:top w:val="single" w:sz="4" w:color="D9D9D9"/>
+              <w:bottom w:val="single" w:sz="4" w:color="D9D9D9"/>
+              <w:left w:val="single" w:sz="4" w:color="D9D9D9"/>
+              <w:right w:val="single" w:sz="4" w:color="D9D9D9"/>
+            </w:tcBorders>
+          </w:tcPr>
+          <w:p>
+            <w:pPr>
+              <w:spacing w:after="60" w:line="247" w:lineRule="auto"/>
             </w:pPr>
             <w:r>
               <w:rPr>
@@ -8067,30 +8299,30 @@
                 <w:b w:val="0"/>
                 <w:sz w:val="20"/>
               </w:rPr>
-              <w:t>Added benchmark</w:t>
-            </w:r>
-          </w:p>
-        </w:tc>
-        <w:tc>
-          <w:tcPr>
-            <w:tcW w:type="dxa" w:w="7214"/>
-            <w:vAlign w:val="top"/>
-            <w:tcMar>
-              <w:top w:w="85" w:type="dxa"/>
-              <w:bottom w:w="85" w:type="dxa"/>
-              <w:left w:w="85" w:type="dxa"/>
-              <w:right w:w="85" w:type="dxa"/>
-            </w:tcMar>
-            <w:tcBorders>
-              <w:top w:val="single" w:sz="4" w:color="D5DADD"/>
-              <w:bottom w:val="single" w:sz="4" w:color="D5DADD"/>
-              <w:left w:val="single" w:sz="4" w:color="D5DADD"/>
-              <w:right w:val="single" w:sz="4" w:color="D5DADD"/>
-            </w:tcBorders>
-          </w:tcPr>
-          <w:p>
-            <w:pPr>
-              <w:spacing w:after="60" w:line="245" w:lineRule="auto"/>
+              <w:t>Before v0.2 COW</w:t>
+            </w:r>
+          </w:p>
+        </w:tc>
+        <w:tc>
+          <w:tcPr>
+            <w:tcW w:type="dxa" w:w="6235"/>
+            <w:vAlign w:val="center"/>
+            <w:tcMar>
+              <w:top w:w="95" w:type="dxa"/>
+              <w:bottom w:w="95" w:type="dxa"/>
+              <w:left w:w="95" w:type="dxa"/>
+              <w:right w:w="95" w:type="dxa"/>
+            </w:tcMar>
+            <w:tcBorders>
+              <w:top w:val="single" w:sz="4" w:color="D9D9D9"/>
+              <w:bottom w:val="single" w:sz="4" w:color="D9D9D9"/>
+              <w:left w:val="single" w:sz="4" w:color="D9D9D9"/>
+              <w:right w:val="single" w:sz="4" w:color="D9D9D9"/>
+            </w:tcBorders>
+          </w:tcPr>
+          <w:p>
+            <w:pPr>
+              <w:spacing w:after="60" w:line="247" w:lineRule="auto"/>
             </w:pPr>
             <w:r>
               <w:rPr>
@@ -8098,7 +8330,7 @@
                 <w:b w:val="0"/>
                 <w:sz w:val="20"/>
               </w:rPr>
-              <w:t>Touches 20 MiB, times 50 sequential fork/wait cycles with uptime ticks, and checks child status. It measures a complete loop rather than an isolated kernel instruction.</w:t>
+              <w:t>Allocates and touches 80 MiB, forks, checks inherited contents, changes every thousandth page in the child, and verifies the parent data remains unchanged.</w:t>
             </w:r>
           </w:p>
         </w:tc>
@@ -8109,24 +8341,24 @@
         </w:trPr>
         <w:tc>
           <w:tcPr>
-            <w:tcW w:type="dxa" w:w="1440"/>
-            <w:vAlign w:val="top"/>
-            <w:tcMar>
-              <w:top w:w="85" w:type="dxa"/>
-              <w:bottom w:w="85" w:type="dxa"/>
-              <w:left w:w="85" w:type="dxa"/>
-              <w:right w:w="85" w:type="dxa"/>
-            </w:tcMar>
-            <w:tcBorders>
-              <w:top w:val="single" w:sz="4" w:color="D5DADD"/>
-              <w:bottom w:val="single" w:sz="4" w:color="D5DADD"/>
-              <w:left w:val="single" w:sz="4" w:color="D5DADD"/>
-              <w:right w:val="single" w:sz="4" w:color="D5DADD"/>
-            </w:tcBorders>
-          </w:tcPr>
-          <w:p>
-            <w:pPr>
-              <w:spacing w:after="60" w:line="245" w:lineRule="auto"/>
+            <w:tcW w:type="dxa" w:w="2376"/>
+            <w:vAlign w:val="center"/>
+            <w:tcMar>
+              <w:top w:w="95" w:type="dxa"/>
+              <w:bottom w:w="95" w:type="dxa"/>
+              <w:left w:w="95" w:type="dxa"/>
+              <w:right w:w="95" w:type="dxa"/>
+            </w:tcMar>
+            <w:tcBorders>
+              <w:top w:val="single" w:sz="4" w:color="D9D9D9"/>
+              <w:bottom w:val="single" w:sz="4" w:color="D9D9D9"/>
+              <w:left w:val="single" w:sz="4" w:color="D9D9D9"/>
+              <w:right w:val="single" w:sz="4" w:color="D9D9D9"/>
+            </w:tcBorders>
+          </w:tcPr>
+          <w:p>
+            <w:pPr>
+              <w:spacing w:after="60" w:line="247" w:lineRule="auto"/>
             </w:pPr>
             <w:r>
               <w:rPr>
@@ -8134,30 +8366,30 @@
                 <w:b w:val="0"/>
                 <w:sz w:val="20"/>
               </w:rPr>
-              <w:t>memstat</w:t>
-            </w:r>
-          </w:p>
-        </w:tc>
-        <w:tc>
-          <w:tcPr>
-            <w:tcW w:type="dxa" w:w="1512"/>
-            <w:vAlign w:val="top"/>
-            <w:tcMar>
-              <w:top w:w="85" w:type="dxa"/>
-              <w:bottom w:w="85" w:type="dxa"/>
-              <w:left w:w="85" w:type="dxa"/>
-              <w:right w:w="85" w:type="dxa"/>
-            </w:tcMar>
-            <w:tcBorders>
-              <w:top w:val="single" w:sz="4" w:color="D5DADD"/>
-              <w:bottom w:val="single" w:sz="4" w:color="D5DADD"/>
-              <w:left w:val="single" w:sz="4" w:color="D5DADD"/>
-              <w:right w:val="single" w:sz="4" w:color="D5DADD"/>
-            </w:tcBorders>
-          </w:tcPr>
-          <w:p>
-            <w:pPr>
-              <w:spacing w:after="60" w:line="245" w:lineRule="auto"/>
+              <w:t>user/forkbench.c</w:t>
+            </w:r>
+          </w:p>
+        </w:tc>
+        <w:tc>
+          <w:tcPr>
+            <w:tcW w:type="dxa" w:w="1555"/>
+            <w:vAlign w:val="center"/>
+            <w:tcMar>
+              <w:top w:w="95" w:type="dxa"/>
+              <w:bottom w:w="95" w:type="dxa"/>
+              <w:left w:w="95" w:type="dxa"/>
+              <w:right w:w="95" w:type="dxa"/>
+            </w:tcMar>
+            <w:tcBorders>
+              <w:top w:val="single" w:sz="4" w:color="D9D9D9"/>
+              <w:bottom w:val="single" w:sz="4" w:color="D9D9D9"/>
+              <w:left w:val="single" w:sz="4" w:color="D9D9D9"/>
+              <w:right w:val="single" w:sz="4" w:color="D9D9D9"/>
+            </w:tcBorders>
+          </w:tcPr>
+          <w:p>
+            <w:pPr>
+              <w:spacing w:after="60" w:line="247" w:lineRule="auto"/>
             </w:pPr>
             <w:r>
               <w:rPr>
@@ -8165,30 +8397,30 @@
                 <w:b w:val="0"/>
                 <w:sz w:val="20"/>
               </w:rPr>
-              <w:t>Added command and syscall</w:t>
-            </w:r>
-          </w:p>
-        </w:tc>
-        <w:tc>
-          <w:tcPr>
-            <w:tcW w:type="dxa" w:w="7214"/>
-            <w:vAlign w:val="top"/>
-            <w:tcMar>
-              <w:top w:w="85" w:type="dxa"/>
-              <w:bottom w:w="85" w:type="dxa"/>
-              <w:left w:w="85" w:type="dxa"/>
-              <w:right w:w="85" w:type="dxa"/>
-            </w:tcMar>
-            <w:tcBorders>
-              <w:top w:val="single" w:sz="4" w:color="D5DADD"/>
-              <w:bottom w:val="single" w:sz="4" w:color="D5DADD"/>
-              <w:left w:val="single" w:sz="4" w:color="D5DADD"/>
-              <w:right w:val="single" w:sz="4" w:color="D5DADD"/>
-            </w:tcBorders>
-          </w:tcPr>
-          <w:p>
-            <w:pPr>
-              <w:spacing w:after="60" w:line="245" w:lineRule="auto"/>
+              <w:t>Before v0.2 COW</w:t>
+            </w:r>
+          </w:p>
+        </w:tc>
+        <w:tc>
+          <w:tcPr>
+            <w:tcW w:type="dxa" w:w="6235"/>
+            <w:vAlign w:val="center"/>
+            <w:tcMar>
+              <w:top w:w="95" w:type="dxa"/>
+              <w:bottom w:w="95" w:type="dxa"/>
+              <w:left w:w="95" w:type="dxa"/>
+              <w:right w:w="95" w:type="dxa"/>
+            </w:tcMar>
+            <w:tcBorders>
+              <w:top w:val="single" w:sz="4" w:color="D9D9D9"/>
+              <w:bottom w:val="single" w:sz="4" w:color="D9D9D9"/>
+              <w:left w:val="single" w:sz="4" w:color="D9D9D9"/>
+              <w:right w:val="single" w:sz="4" w:color="D9D9D9"/>
+            </w:tcBorders>
+          </w:tcPr>
+          <w:p>
+            <w:pPr>
+              <w:spacing w:after="60" w:line="247" w:lineRule="auto"/>
             </w:pPr>
             <w:r>
               <w:rPr>
@@ -8196,7 +8428,261 @@
                 <w:b w:val="0"/>
                 <w:sz w:val="20"/>
               </w:rPr>
-              <w:t>Requests the seven-field kernel structure and prints it. It observes counters/resources; it does not allocate the test workload or reset counters.</w:t>
+              <w:t>Touches 20 MiB and times 50 sequential fork/wait cycles using uptime ticks. It checks child exit status and prints the complete loop duration.</w:t>
+            </w:r>
+          </w:p>
+        </w:tc>
+      </w:tr>
+    </w:tbl>
+    <w:p>
+      <w:pPr>
+        <w:spacing w:after="120" w:line="247" w:lineRule="auto"/>
+      </w:pPr>
+    </w:p>
+    <w:p>
+      <w:pPr>
+        <w:pStyle w:val="Heading2"/>
+      </w:pPr>
+      <w:r>
+        <w:t>The baseline program was code we added</w:t>
+      </w:r>
+    </w:p>
+    <w:p>
+      <w:pPr>
+        <w:spacing w:after="120" w:line="247" w:lineRule="auto"/>
+      </w:pPr>
+      <w:r>
+        <w:rPr>
+          <w:rFonts w:ascii="Calibri" w:hAnsi="Calibri"/>
+          <w:sz w:val="22"/>
+        </w:rPr>
+        <w:t>This is the actual request and result check from user/baseline.c. The historical output says MB; the expression requests 200 MiB.</w:t>
+      </w:r>
+    </w:p>
+    <w:p>
+      <w:pPr>
+        <w:spacing w:after="120" w:line="245" w:lineRule="auto"/>
+      </w:pPr>
+      <w:r>
+        <w:rPr>
+          <w:rFonts w:ascii="Consolas" w:hAnsi="Consolas"/>
+          <w:sz w:val="19"/>
+        </w:rPr>
+        <w:t xml:space="preserve">  char *p = sbrk(200 * 1024 * 1024);</w:t>
+      </w:r>
+      <w:r>
+        <w:br/>
+      </w:r>
+      <w:r>
+        <w:rPr>
+          <w:rFonts w:ascii="Consolas" w:hAnsi="Consolas"/>
+          <w:sz w:val="19"/>
+        </w:rPr>
+      </w:r>
+      <w:r>
+        <w:br/>
+      </w:r>
+      <w:r>
+        <w:rPr>
+          <w:rFonts w:ascii="Consolas" w:hAnsi="Consolas"/>
+          <w:sz w:val="19"/>
+        </w:rPr>
+        <w:t xml:space="preserve">  if(p == (char*)-1)</w:t>
+      </w:r>
+      <w:r>
+        <w:br/>
+      </w:r>
+      <w:r>
+        <w:rPr>
+          <w:rFonts w:ascii="Consolas" w:hAnsi="Consolas"/>
+          <w:sz w:val="19"/>
+        </w:rPr>
+        <w:t xml:space="preserve">    printf("baseline: sbrk(200MB) failed (expected on stock xv6)\n");</w:t>
+      </w:r>
+      <w:r>
+        <w:br/>
+      </w:r>
+      <w:r>
+        <w:rPr>
+          <w:rFonts w:ascii="Consolas" w:hAnsi="Consolas"/>
+          <w:sz w:val="19"/>
+        </w:rPr>
+        <w:t xml:space="preserve">  else</w:t>
+      </w:r>
+      <w:r>
+        <w:br/>
+      </w:r>
+      <w:r>
+        <w:rPr>
+          <w:rFonts w:ascii="Consolas" w:hAnsi="Consolas"/>
+          <w:sz w:val="19"/>
+        </w:rPr>
+        <w:t xml:space="preserve">    printf("baseline: sbrk(200MB) succeeded\n");</w:t>
+      </w:r>
+    </w:p>
+    <w:p>
+      <w:pPr>
+        <w:spacing w:after="120" w:line="247" w:lineRule="auto"/>
+      </w:pPr>
+      <w:r>
+        <w:rPr>
+          <w:rFonts w:ascii="Calibri" w:hAnsi="Calibri"/>
+          <w:sz w:val="22"/>
+        </w:rPr>
+        <w:t>At v0.0, this program reached sys_sbrk, then growproc and eager uvmalloc; insufficient physical memory caused sbrk to return -1. After lazy allocation, the same request was accepted as a virtual reservation because sys_sbrk no longer allocated all frames immediately. The added fault handler supplies frames when the range is accessed.</w:t>
+      </w:r>
+    </w:p>
+    <w:p>
+      <w:pPr>
+        <w:pStyle w:val="Heading2"/>
+      </w:pPr>
+      <w:r>
+        <w:t>What the COW test demonstrates</w:t>
+      </w:r>
+    </w:p>
+    <w:p>
+      <w:pPr>
+        <w:spacing w:after="120" w:line="247" w:lineRule="auto"/>
+      </w:pPr>
+      <w:r>
+        <w:rPr>
+          <w:rFonts w:ascii="Calibri" w:hAnsi="Calibri"/>
+          <w:sz w:val="22"/>
+        </w:rPr>
+        <w:t>We added cowtest.c as a custom capacity and isolation check. Touching 80 MiB makes the later fork demanding for eager copying. With COW, the initial frames can be shared; child writes require private copies. The parent checks its original pattern after wait. This is our test program, separate from the official MIT lab grader.</w:t>
+      </w:r>
+    </w:p>
+    <w:p>
+      <w:pPr>
+        <w:pStyle w:val="Heading1"/>
+        <w:pageBreakBefore/>
+      </w:pPr>
+      <w:r>
+        <w:t>Test files we created for swapping and observation</w:t>
+      </w:r>
+    </w:p>
+    <w:p>
+      <w:pPr>
+        <w:spacing w:after="120" w:line="247" w:lineRule="auto"/>
+      </w:pPr>
+      <w:r>
+        <w:rPr>
+          <w:rFonts w:ascii="Calibri" w:hAnsi="Calibri"/>
+          <w:sz w:val="22"/>
+        </w:rPr>
+        <w:t>We added three further workload/test files and the memstat monitoring command. The existing usertests.c suite supplies broader regression coverage and was retained unchanged in the v0.0 to v0.4 memory comparison.</w:t>
+      </w:r>
+    </w:p>
+    <w:tbl>
+      <w:tblPr>
+        <w:tblW w:type="dxa" w:w="10166"/>
+        <w:jc w:val="center"/>
+        <w:tblLayout w:type="fixed"/>
+        <w:tblLook w:firstColumn="1" w:firstRow="1" w:lastColumn="0" w:lastRow="0" w:noHBand="0" w:noVBand="1" w:val="04A0"/>
+      </w:tblPr>
+      <w:tblGrid>
+        <w:gridCol w:w="2592"/>
+        <w:gridCol w:w="1224"/>
+        <w:gridCol w:w="6350"/>
+      </w:tblGrid>
+      <w:tr>
+        <w:trPr>
+          <w:cantSplit/>
+          <w:tblHeader/>
+        </w:trPr>
+        <w:tc>
+          <w:tcPr>
+            <w:tcW w:type="dxa" w:w="2592"/>
+            <w:vAlign w:val="center"/>
+            <w:tcMar>
+              <w:top w:w="95" w:type="dxa"/>
+              <w:bottom w:w="95" w:type="dxa"/>
+              <w:left w:w="95" w:type="dxa"/>
+              <w:right w:w="95" w:type="dxa"/>
+            </w:tcMar>
+            <w:tcBorders>
+              <w:top w:val="single" w:sz="4" w:color="D9D9D9"/>
+              <w:bottom w:val="single" w:sz="4" w:color="D9D9D9"/>
+              <w:left w:val="single" w:sz="4" w:color="D9D9D9"/>
+              <w:right w:val="single" w:sz="4" w:color="D9D9D9"/>
+            </w:tcBorders>
+            <w:shd w:fill="EDF1F4"/>
+          </w:tcPr>
+          <w:p>
+            <w:pPr>
+              <w:spacing w:after="60" w:line="247" w:lineRule="auto"/>
+            </w:pPr>
+            <w:r>
+              <w:rPr>
+                <w:rFonts w:ascii="Calibri" w:hAnsi="Calibri"/>
+                <w:b/>
+                <w:sz w:val="20"/>
+              </w:rPr>
+              <w:t>Source file and origin</w:t>
+            </w:r>
+          </w:p>
+        </w:tc>
+        <w:tc>
+          <w:tcPr>
+            <w:tcW w:type="dxa" w:w="1224"/>
+            <w:vAlign w:val="center"/>
+            <w:tcMar>
+              <w:top w:w="95" w:type="dxa"/>
+              <w:bottom w:w="95" w:type="dxa"/>
+              <w:left w:w="95" w:type="dxa"/>
+              <w:right w:w="95" w:type="dxa"/>
+            </w:tcMar>
+            <w:tcBorders>
+              <w:top w:val="single" w:sz="4" w:color="D9D9D9"/>
+              <w:bottom w:val="single" w:sz="4" w:color="D9D9D9"/>
+              <w:left w:val="single" w:sz="4" w:color="D9D9D9"/>
+              <w:right w:val="single" w:sz="4" w:color="D9D9D9"/>
+            </w:tcBorders>
+            <w:shd w:fill="EDF1F4"/>
+          </w:tcPr>
+          <w:p>
+            <w:pPr>
+              <w:spacing w:after="60" w:line="247" w:lineRule="auto"/>
+            </w:pPr>
+            <w:r>
+              <w:rPr>
+                <w:rFonts w:ascii="Calibri" w:hAnsi="Calibri"/>
+                <w:b/>
+                <w:sz w:val="20"/>
+              </w:rPr>
+              <w:t>Introduced</w:t>
+            </w:r>
+          </w:p>
+        </w:tc>
+        <w:tc>
+          <w:tcPr>
+            <w:tcW w:type="dxa" w:w="6350"/>
+            <w:vAlign w:val="center"/>
+            <w:tcMar>
+              <w:top w:w="95" w:type="dxa"/>
+              <w:bottom w:w="95" w:type="dxa"/>
+              <w:left w:w="95" w:type="dxa"/>
+              <w:right w:w="95" w:type="dxa"/>
+            </w:tcMar>
+            <w:tcBorders>
+              <w:top w:val="single" w:sz="4" w:color="D9D9D9"/>
+              <w:bottom w:val="single" w:sz="4" w:color="D9D9D9"/>
+              <w:left w:val="single" w:sz="4" w:color="D9D9D9"/>
+              <w:right w:val="single" w:sz="4" w:color="D9D9D9"/>
+            </w:tcBorders>
+            <w:shd w:fill="EDF1F4"/>
+          </w:tcPr>
+          <w:p>
+            <w:pPr>
+              <w:spacing w:after="60" w:line="247" w:lineRule="auto"/>
+            </w:pPr>
+            <w:r>
+              <w:rPr>
+                <w:rFonts w:ascii="Calibri" w:hAnsi="Calibri"/>
+                <w:b/>
+                <w:sz w:val="20"/>
+              </w:rPr>
+              <w:t>What it exercises or observes</w:t>
             </w:r>
           </w:p>
         </w:tc>
@@ -8207,24 +8693,24 @@
         </w:trPr>
         <w:tc>
           <w:tcPr>
-            <w:tcW w:type="dxa" w:w="1440"/>
-            <w:vAlign w:val="top"/>
-            <w:tcMar>
-              <w:top w:w="85" w:type="dxa"/>
-              <w:bottom w:w="85" w:type="dxa"/>
-              <w:left w:w="85" w:type="dxa"/>
-              <w:right w:w="85" w:type="dxa"/>
-            </w:tcMar>
-            <w:tcBorders>
-              <w:top w:val="single" w:sz="4" w:color="D5DADD"/>
-              <w:bottom w:val="single" w:sz="4" w:color="D5DADD"/>
-              <w:left w:val="single" w:sz="4" w:color="D5DADD"/>
-              <w:right w:val="single" w:sz="4" w:color="D5DADD"/>
-            </w:tcBorders>
-          </w:tcPr>
-          <w:p>
-            <w:pPr>
-              <w:spacing w:after="60" w:line="245" w:lineRule="auto"/>
+            <w:tcW w:type="dxa" w:w="2592"/>
+            <w:vAlign w:val="center"/>
+            <w:tcMar>
+              <w:top w:w="95" w:type="dxa"/>
+              <w:bottom w:w="95" w:type="dxa"/>
+              <w:left w:w="95" w:type="dxa"/>
+              <w:right w:w="95" w:type="dxa"/>
+            </w:tcMar>
+            <w:tcBorders>
+              <w:top w:val="single" w:sz="4" w:color="D9D9D9"/>
+              <w:bottom w:val="single" w:sz="4" w:color="D9D9D9"/>
+              <w:left w:val="single" w:sz="4" w:color="D9D9D9"/>
+              <w:right w:val="single" w:sz="4" w:color="D9D9D9"/>
+            </w:tcBorders>
+          </w:tcPr>
+          <w:p>
+            <w:pPr>
+              <w:spacing w:after="60" w:line="247" w:lineRule="auto"/>
             </w:pPr>
             <w:r>
               <w:rPr>
@@ -8232,61 +8718,41 @@
                 <w:b w:val="0"/>
                 <w:sz w:val="20"/>
               </w:rPr>
-              <w:t>memhog</w:t>
-            </w:r>
-          </w:p>
-        </w:tc>
-        <w:tc>
-          <w:tcPr>
-            <w:tcW w:type="dxa" w:w="1512"/>
-            <w:vAlign w:val="top"/>
-            <w:tcMar>
-              <w:top w:w="85" w:type="dxa"/>
-              <w:bottom w:w="85" w:type="dxa"/>
-              <w:left w:w="85" w:type="dxa"/>
-              <w:right w:w="85" w:type="dxa"/>
-            </w:tcMar>
-            <w:tcBorders>
-              <w:top w:val="single" w:sz="4" w:color="D5DADD"/>
-              <w:bottom w:val="single" w:sz="4" w:color="D5DADD"/>
-              <w:left w:val="single" w:sz="4" w:color="D5DADD"/>
-              <w:right w:val="single" w:sz="4" w:color="D5DADD"/>
-            </w:tcBorders>
-          </w:tcPr>
-          <w:p>
-            <w:pPr>
-              <w:spacing w:after="60" w:line="245" w:lineRule="auto"/>
-            </w:pPr>
+              <w:t>user/memhog.c</w:t>
+            </w:r>
+            <w:r>
+              <w:br/>
+            </w:r>
             <w:r>
               <w:rPr>
                 <w:rFonts w:ascii="Calibri" w:hAnsi="Calibri"/>
                 <w:b w:val="0"/>
                 <w:sz w:val="20"/>
               </w:rPr>
-              <w:t>Added pressure test</w:t>
-            </w:r>
-          </w:p>
-        </w:tc>
-        <w:tc>
-          <w:tcPr>
-            <w:tcW w:type="dxa" w:w="7214"/>
-            <w:vAlign w:val="top"/>
-            <w:tcMar>
-              <w:top w:w="85" w:type="dxa"/>
-              <w:bottom w:w="85" w:type="dxa"/>
-              <w:left w:w="85" w:type="dxa"/>
-              <w:right w:w="85" w:type="dxa"/>
-            </w:tcMar>
-            <w:tcBorders>
-              <w:top w:val="single" w:sz="4" w:color="D5DADD"/>
-              <w:bottom w:val="single" w:sz="4" w:color="D5DADD"/>
-              <w:left w:val="single" w:sz="4" w:color="D5DADD"/>
-              <w:right w:val="single" w:sz="4" w:color="D5DADD"/>
-            </w:tcBorders>
-          </w:tcPr>
-          <w:p>
-            <w:pPr>
-              <w:spacing w:after="60" w:line="245" w:lineRule="auto"/>
+              <w:t>We added this test</w:t>
+            </w:r>
+          </w:p>
+        </w:tc>
+        <w:tc>
+          <w:tcPr>
+            <w:tcW w:type="dxa" w:w="1224"/>
+            <w:vAlign w:val="center"/>
+            <w:tcMar>
+              <w:top w:w="95" w:type="dxa"/>
+              <w:bottom w:w="95" w:type="dxa"/>
+              <w:left w:w="95" w:type="dxa"/>
+              <w:right w:w="95" w:type="dxa"/>
+            </w:tcMar>
+            <w:tcBorders>
+              <w:top w:val="single" w:sz="4" w:color="D9D9D9"/>
+              <w:bottom w:val="single" w:sz="4" w:color="D9D9D9"/>
+              <w:left w:val="single" w:sz="4" w:color="D9D9D9"/>
+              <w:right w:val="single" w:sz="4" w:color="D9D9D9"/>
+            </w:tcBorders>
+          </w:tcPr>
+          <w:p>
+            <w:pPr>
+              <w:spacing w:after="60" w:line="247" w:lineRule="auto"/>
             </w:pPr>
             <w:r>
               <w:rPr>
@@ -8294,7 +8760,38 @@
                 <w:b w:val="0"/>
                 <w:sz w:val="20"/>
               </w:rPr>
-              <w:t>Runs the requested MiB workload in a child. Writes and verifies the first and last byte of each page, prints swap counters, and reports child exit status. Zero bad pages means those positions matched.</w:t>
+              <w:t>Before swap</w:t>
+            </w:r>
+          </w:p>
+        </w:tc>
+        <w:tc>
+          <w:tcPr>
+            <w:tcW w:type="dxa" w:w="6350"/>
+            <w:vAlign w:val="center"/>
+            <w:tcMar>
+              <w:top w:w="95" w:type="dxa"/>
+              <w:bottom w:w="95" w:type="dxa"/>
+              <w:left w:w="95" w:type="dxa"/>
+              <w:right w:w="95" w:type="dxa"/>
+            </w:tcMar>
+            <w:tcBorders>
+              <w:top w:val="single" w:sz="4" w:color="D9D9D9"/>
+              <w:bottom w:val="single" w:sz="4" w:color="D9D9D9"/>
+              <w:left w:val="single" w:sz="4" w:color="D9D9D9"/>
+              <w:right w:val="single" w:sz="4" w:color="D9D9D9"/>
+            </w:tcBorders>
+          </w:tcPr>
+          <w:p>
+            <w:pPr>
+              <w:spacing w:after="60" w:line="247" w:lineRule="auto"/>
+            </w:pPr>
+            <w:r>
+              <w:rPr>
+                <w:rFonts w:ascii="Calibri" w:hAnsi="Calibri"/>
+                <w:b w:val="0"/>
+                <w:sz w:val="20"/>
+              </w:rPr>
+              <w:t>Runs a requested MiB workload in a child, writes and verifies the first and last byte of every page, and reports child status and cumulative swap counters. Zero bad pages covers those checked positions.</w:t>
             </w:r>
           </w:p>
         </w:tc>
@@ -8305,24 +8802,24 @@
         </w:trPr>
         <w:tc>
           <w:tcPr>
-            <w:tcW w:type="dxa" w:w="1440"/>
-            <w:vAlign w:val="top"/>
-            <w:tcMar>
-              <w:top w:w="85" w:type="dxa"/>
-              <w:bottom w:w="85" w:type="dxa"/>
-              <w:left w:w="85" w:type="dxa"/>
-              <w:right w:w="85" w:type="dxa"/>
-            </w:tcMar>
-            <w:tcBorders>
-              <w:top w:val="single" w:sz="4" w:color="D5DADD"/>
-              <w:bottom w:val="single" w:sz="4" w:color="D5DADD"/>
-              <w:left w:val="single" w:sz="4" w:color="D5DADD"/>
-              <w:right w:val="single" w:sz="4" w:color="D5DADD"/>
-            </w:tcBorders>
-          </w:tcPr>
-          <w:p>
-            <w:pPr>
-              <w:spacing w:after="60" w:line="245" w:lineRule="auto"/>
+            <w:tcW w:type="dxa" w:w="2592"/>
+            <w:vAlign w:val="center"/>
+            <w:tcMar>
+              <w:top w:w="95" w:type="dxa"/>
+              <w:bottom w:w="95" w:type="dxa"/>
+              <w:left w:w="95" w:type="dxa"/>
+              <w:right w:w="95" w:type="dxa"/>
+            </w:tcMar>
+            <w:tcBorders>
+              <w:top w:val="single" w:sz="4" w:color="D9D9D9"/>
+              <w:bottom w:val="single" w:sz="4" w:color="D9D9D9"/>
+              <w:left w:val="single" w:sz="4" w:color="D9D9D9"/>
+              <w:right w:val="single" w:sz="4" w:color="D9D9D9"/>
+            </w:tcBorders>
+          </w:tcPr>
+          <w:p>
+            <w:pPr>
+              <w:spacing w:after="60" w:line="247" w:lineRule="auto"/>
             </w:pPr>
             <w:r>
               <w:rPr>
@@ -8330,61 +8827,41 @@
                 <w:b w:val="0"/>
                 <w:sz w:val="20"/>
               </w:rPr>
-              <w:t>hotcold</w:t>
-            </w:r>
-          </w:p>
-        </w:tc>
-        <w:tc>
-          <w:tcPr>
-            <w:tcW w:type="dxa" w:w="1512"/>
-            <w:vAlign w:val="top"/>
-            <w:tcMar>
-              <w:top w:w="85" w:type="dxa"/>
-              <w:bottom w:w="85" w:type="dxa"/>
-              <w:left w:w="85" w:type="dxa"/>
-              <w:right w:w="85" w:type="dxa"/>
-            </w:tcMar>
-            <w:tcBorders>
-              <w:top w:val="single" w:sz="4" w:color="D5DADD"/>
-              <w:bottom w:val="single" w:sz="4" w:color="D5DADD"/>
-              <w:left w:val="single" w:sz="4" w:color="D5DADD"/>
-              <w:right w:val="single" w:sz="4" w:color="D5DADD"/>
-            </w:tcBorders>
-          </w:tcPr>
-          <w:p>
-            <w:pPr>
-              <w:spacing w:after="60" w:line="245" w:lineRule="auto"/>
-            </w:pPr>
+              <w:t>user/swapfork.c</w:t>
+            </w:r>
+            <w:r>
+              <w:br/>
+            </w:r>
             <w:r>
               <w:rPr>
                 <w:rFonts w:ascii="Calibri" w:hAnsi="Calibri"/>
                 <w:b w:val="0"/>
                 <w:sz w:val="20"/>
               </w:rPr>
-              <w:t>Added policy workload</w:t>
-            </w:r>
-          </w:p>
-        </w:tc>
-        <w:tc>
-          <w:tcPr>
-            <w:tcW w:type="dxa" w:w="7214"/>
-            <w:vAlign w:val="top"/>
-            <w:tcMar>
-              <w:top w:w="85" w:type="dxa"/>
-              <w:bottom w:w="85" w:type="dxa"/>
-              <w:left w:w="85" w:type="dxa"/>
-              <w:right w:w="85" w:type="dxa"/>
-            </w:tcMar>
-            <w:tcBorders>
-              <w:top w:val="single" w:sz="4" w:color="D5DADD"/>
-              <w:bottom w:val="single" w:sz="4" w:color="D5DADD"/>
-              <w:left w:val="single" w:sz="4" w:color="D5DADD"/>
-              <w:right w:val="single" w:sz="4" w:color="D5DADD"/>
-            </w:tcBorders>
-          </w:tcPr>
-          <w:p>
-            <w:pPr>
-              <w:spacing w:after="60" w:line="245" w:lineRule="auto"/>
+              <w:t>We added this test</w:t>
+            </w:r>
+          </w:p>
+        </w:tc>
+        <w:tc>
+          <w:tcPr>
+            <w:tcW w:type="dxa" w:w="1224"/>
+            <w:vAlign w:val="center"/>
+            <w:tcMar>
+              <w:top w:w="95" w:type="dxa"/>
+              <w:bottom w:w="95" w:type="dxa"/>
+              <w:left w:w="95" w:type="dxa"/>
+              <w:right w:w="95" w:type="dxa"/>
+            </w:tcMar>
+            <w:tcBorders>
+              <w:top w:val="single" w:sz="4" w:color="D9D9D9"/>
+              <w:bottom w:val="single" w:sz="4" w:color="D9D9D9"/>
+              <w:left w:val="single" w:sz="4" w:color="D9D9D9"/>
+              <w:right w:val="single" w:sz="4" w:color="D9D9D9"/>
+            </w:tcBorders>
+          </w:tcPr>
+          <w:p>
+            <w:pPr>
+              <w:spacing w:after="60" w:line="247" w:lineRule="auto"/>
             </w:pPr>
             <w:r>
               <w:rPr>
@@ -8392,7 +8869,38 @@
                 <w:b w:val="0"/>
                 <w:sz w:val="20"/>
               </w:rPr>
-              <w:t>Initializes 12 MiB, then measures three rounds of cold scans with selected hot-region revisits. It prints differences between internal memstat snapshots after initialization. It is not a full data-integrity test.</w:t>
+              <w:t>v0.4</w:t>
+            </w:r>
+          </w:p>
+        </w:tc>
+        <w:tc>
+          <w:tcPr>
+            <w:tcW w:type="dxa" w:w="6350"/>
+            <w:vAlign w:val="center"/>
+            <w:tcMar>
+              <w:top w:w="95" w:type="dxa"/>
+              <w:bottom w:w="95" w:type="dxa"/>
+              <w:left w:w="95" w:type="dxa"/>
+              <w:right w:w="95" w:type="dxa"/>
+            </w:tcMar>
+            <w:tcBorders>
+              <w:top w:val="single" w:sz="4" w:color="D9D9D9"/>
+              <w:bottom w:val="single" w:sz="4" w:color="D9D9D9"/>
+              <w:left w:val="single" w:sz="4" w:color="D9D9D9"/>
+              <w:right w:val="single" w:sz="4" w:color="D9D9D9"/>
+            </w:tcBorders>
+          </w:tcPr>
+          <w:p>
+            <w:pPr>
+              <w:spacing w:after="60" w:line="247" w:lineRule="auto"/>
+            </w:pPr>
+            <w:r>
+              <w:rPr>
+                <w:rFonts w:ascii="Calibri" w:hAnsi="Calibri"/>
+                <w:b w:val="0"/>
+                <w:sz w:val="20"/>
+              </w:rPr>
+              <w:t>Fills 6 MiB, forks, and checks inherited data. The child writes 77 into the second byte of every page; the parent verifies its own second bytes remain zero. It exercises fork isolation together with paging.</w:t>
             </w:r>
           </w:p>
         </w:tc>
@@ -8403,24 +8911,24 @@
         </w:trPr>
         <w:tc>
           <w:tcPr>
-            <w:tcW w:type="dxa" w:w="1440"/>
-            <w:vAlign w:val="top"/>
-            <w:tcMar>
-              <w:top w:w="85" w:type="dxa"/>
-              <w:bottom w:w="85" w:type="dxa"/>
-              <w:left w:w="85" w:type="dxa"/>
-              <w:right w:w="85" w:type="dxa"/>
-            </w:tcMar>
-            <w:tcBorders>
-              <w:top w:val="single" w:sz="4" w:color="D5DADD"/>
-              <w:bottom w:val="single" w:sz="4" w:color="D5DADD"/>
-              <w:left w:val="single" w:sz="4" w:color="D5DADD"/>
-              <w:right w:val="single" w:sz="4" w:color="D5DADD"/>
-            </w:tcBorders>
-          </w:tcPr>
-          <w:p>
-            <w:pPr>
-              <w:spacing w:after="60" w:line="245" w:lineRule="auto"/>
+            <w:tcW w:type="dxa" w:w="2592"/>
+            <w:vAlign w:val="center"/>
+            <w:tcMar>
+              <w:top w:w="95" w:type="dxa"/>
+              <w:bottom w:w="95" w:type="dxa"/>
+              <w:left w:w="95" w:type="dxa"/>
+              <w:right w:w="95" w:type="dxa"/>
+            </w:tcMar>
+            <w:tcBorders>
+              <w:top w:val="single" w:sz="4" w:color="D9D9D9"/>
+              <w:bottom w:val="single" w:sz="4" w:color="D9D9D9"/>
+              <w:left w:val="single" w:sz="4" w:color="D9D9D9"/>
+              <w:right w:val="single" w:sz="4" w:color="D9D9D9"/>
+            </w:tcBorders>
+          </w:tcPr>
+          <w:p>
+            <w:pPr>
+              <w:spacing w:after="60" w:line="247" w:lineRule="auto"/>
             </w:pPr>
             <w:r>
               <w:rPr>
@@ -8428,61 +8936,41 @@
                 <w:b w:val="0"/>
                 <w:sz w:val="20"/>
               </w:rPr>
-              <w:t>swapfork</w:t>
-            </w:r>
-          </w:p>
-        </w:tc>
-        <w:tc>
-          <w:tcPr>
-            <w:tcW w:type="dxa" w:w="1512"/>
-            <w:vAlign w:val="top"/>
-            <w:tcMar>
-              <w:top w:w="85" w:type="dxa"/>
-              <w:bottom w:w="85" w:type="dxa"/>
-              <w:left w:w="85" w:type="dxa"/>
-              <w:right w:w="85" w:type="dxa"/>
-            </w:tcMar>
-            <w:tcBorders>
-              <w:top w:val="single" w:sz="4" w:color="D5DADD"/>
-              <w:bottom w:val="single" w:sz="4" w:color="D5DADD"/>
-              <w:left w:val="single" w:sz="4" w:color="D5DADD"/>
-              <w:right w:val="single" w:sz="4" w:color="D5DADD"/>
-            </w:tcBorders>
-          </w:tcPr>
-          <w:p>
-            <w:pPr>
-              <w:spacing w:after="60" w:line="245" w:lineRule="auto"/>
-            </w:pPr>
+              <w:t>user/hotcold.c</w:t>
+            </w:r>
+            <w:r>
+              <w:br/>
+            </w:r>
             <w:r>
               <w:rPr>
                 <w:rFonts w:ascii="Calibri" w:hAnsi="Calibri"/>
                 <w:b w:val="0"/>
                 <w:sz w:val="20"/>
               </w:rPr>
-              <w:t>Added interaction test</w:t>
-            </w:r>
-          </w:p>
-        </w:tc>
-        <w:tc>
-          <w:tcPr>
-            <w:tcW w:type="dxa" w:w="7214"/>
-            <w:vAlign w:val="top"/>
-            <w:tcMar>
-              <w:top w:w="85" w:type="dxa"/>
-              <w:bottom w:w="85" w:type="dxa"/>
-              <w:left w:w="85" w:type="dxa"/>
-              <w:right w:w="85" w:type="dxa"/>
-            </w:tcMar>
-            <w:tcBorders>
-              <w:top w:val="single" w:sz="4" w:color="D5DADD"/>
-              <w:bottom w:val="single" w:sz="4" w:color="D5DADD"/>
-              <w:left w:val="single" w:sz="4" w:color="D5DADD"/>
-              <w:right w:val="single" w:sz="4" w:color="D5DADD"/>
-            </w:tcBorders>
-          </w:tcPr>
-          <w:p>
-            <w:pPr>
-              <w:spacing w:after="60" w:line="245" w:lineRule="auto"/>
+              <w:t>We added this workload</w:t>
+            </w:r>
+          </w:p>
+        </w:tc>
+        <w:tc>
+          <w:tcPr>
+            <w:tcW w:type="dxa" w:w="1224"/>
+            <w:vAlign w:val="center"/>
+            <w:tcMar>
+              <w:top w:w="95" w:type="dxa"/>
+              <w:bottom w:w="95" w:type="dxa"/>
+              <w:left w:w="95" w:type="dxa"/>
+              <w:right w:w="95" w:type="dxa"/>
+            </w:tcMar>
+            <w:tcBorders>
+              <w:top w:val="single" w:sz="4" w:color="D9D9D9"/>
+              <w:bottom w:val="single" w:sz="4" w:color="D9D9D9"/>
+              <w:left w:val="single" w:sz="4" w:color="D9D9D9"/>
+              <w:right w:val="single" w:sz="4" w:color="D9D9D9"/>
+            </w:tcBorders>
+          </w:tcPr>
+          <w:p>
+            <w:pPr>
+              <w:spacing w:after="60" w:line="247" w:lineRule="auto"/>
             </w:pPr>
             <w:r>
               <w:rPr>
@@ -8490,7 +8978,38 @@
                 <w:b w:val="0"/>
                 <w:sz w:val="20"/>
               </w:rPr>
-              <w:t>Fills 6 MiB and forks. The child verifies inherited data, writes 77 into the second byte of every page and checks its private contents. The parent verifies its own second bytes remain zero.</w:t>
+              <w:t>v0.4</w:t>
+            </w:r>
+          </w:p>
+        </w:tc>
+        <w:tc>
+          <w:tcPr>
+            <w:tcW w:type="dxa" w:w="6350"/>
+            <w:vAlign w:val="center"/>
+            <w:tcMar>
+              <w:top w:w="95" w:type="dxa"/>
+              <w:bottom w:w="95" w:type="dxa"/>
+              <w:left w:w="95" w:type="dxa"/>
+              <w:right w:w="95" w:type="dxa"/>
+            </w:tcMar>
+            <w:tcBorders>
+              <w:top w:val="single" w:sz="4" w:color="D9D9D9"/>
+              <w:bottom w:val="single" w:sz="4" w:color="D9D9D9"/>
+              <w:left w:val="single" w:sz="4" w:color="D9D9D9"/>
+              <w:right w:val="single" w:sz="4" w:color="D9D9D9"/>
+            </w:tcBorders>
+          </w:tcPr>
+          <w:p>
+            <w:pPr>
+              <w:spacing w:after="60" w:line="247" w:lineRule="auto"/>
+            </w:pPr>
+            <w:r>
+              <w:rPr>
+                <w:rFonts w:ascii="Calibri" w:hAnsi="Calibri"/>
+                <w:b w:val="0"/>
+                <w:sz w:val="20"/>
+              </w:rPr>
+              <w:t>Initializes 12 MiB, then measures three rounds of cold scans and hot-region revisits. It prints swap-count differences between internal snapshots. It compares policies for that access pattern, rather than checking every stored value.</w:t>
             </w:r>
           </w:p>
         </w:tc>
@@ -8501,24 +9020,24 @@
         </w:trPr>
         <w:tc>
           <w:tcPr>
-            <w:tcW w:type="dxa" w:w="1440"/>
-            <w:vAlign w:val="top"/>
-            <w:tcMar>
-              <w:top w:w="85" w:type="dxa"/>
-              <w:bottom w:w="85" w:type="dxa"/>
-              <w:left w:w="85" w:type="dxa"/>
-              <w:right w:w="85" w:type="dxa"/>
-            </w:tcMar>
-            <w:tcBorders>
-              <w:top w:val="single" w:sz="4" w:color="D5DADD"/>
-              <w:bottom w:val="single" w:sz="4" w:color="D5DADD"/>
-              <w:left w:val="single" w:sz="4" w:color="D5DADD"/>
-              <w:right w:val="single" w:sz="4" w:color="D5DADD"/>
-            </w:tcBorders>
-          </w:tcPr>
-          <w:p>
-            <w:pPr>
-              <w:spacing w:after="60" w:line="245" w:lineRule="auto"/>
+            <w:tcW w:type="dxa" w:w="2592"/>
+            <w:vAlign w:val="center"/>
+            <w:tcMar>
+              <w:top w:w="95" w:type="dxa"/>
+              <w:bottom w:w="95" w:type="dxa"/>
+              <w:left w:w="95" w:type="dxa"/>
+              <w:right w:w="95" w:type="dxa"/>
+            </w:tcMar>
+            <w:tcBorders>
+              <w:top w:val="single" w:sz="4" w:color="D9D9D9"/>
+              <w:bottom w:val="single" w:sz="4" w:color="D9D9D9"/>
+              <w:left w:val="single" w:sz="4" w:color="D9D9D9"/>
+              <w:right w:val="single" w:sz="4" w:color="D9D9D9"/>
+            </w:tcBorders>
+          </w:tcPr>
+          <w:p>
+            <w:pPr>
+              <w:spacing w:after="60" w:line="247" w:lineRule="auto"/>
             </w:pPr>
             <w:r>
               <w:rPr>
@@ -8526,61 +9045,41 @@
                 <w:b w:val="0"/>
                 <w:sz w:val="20"/>
               </w:rPr>
-              <w:t>usertests</w:t>
-            </w:r>
-          </w:p>
-        </w:tc>
-        <w:tc>
-          <w:tcPr>
-            <w:tcW w:type="dxa" w:w="1512"/>
-            <w:vAlign w:val="top"/>
-            <w:tcMar>
-              <w:top w:w="85" w:type="dxa"/>
-              <w:bottom w:w="85" w:type="dxa"/>
-              <w:left w:w="85" w:type="dxa"/>
-              <w:right w:w="85" w:type="dxa"/>
-            </w:tcMar>
-            <w:tcBorders>
-              <w:top w:val="single" w:sz="4" w:color="D5DADD"/>
-              <w:bottom w:val="single" w:sz="4" w:color="D5DADD"/>
-              <w:left w:val="single" w:sz="4" w:color="D5DADD"/>
-              <w:right w:val="single" w:sz="4" w:color="D5DADD"/>
-            </w:tcBorders>
-          </w:tcPr>
-          <w:p>
-            <w:pPr>
-              <w:spacing w:after="60" w:line="245" w:lineRule="auto"/>
-            </w:pPr>
+              <w:t>user/memstat.c</w:t>
+            </w:r>
+            <w:r>
+              <w:br/>
+            </w:r>
             <w:r>
               <w:rPr>
                 <w:rFonts w:ascii="Calibri" w:hAnsi="Calibri"/>
                 <w:b w:val="0"/>
                 <w:sz w:val="20"/>
               </w:rPr>
-              <w:t>Existing xv6 suite</w:t>
-            </w:r>
-          </w:p>
-        </w:tc>
-        <w:tc>
-          <w:tcPr>
-            <w:tcW w:type="dxa" w:w="7214"/>
-            <w:vAlign w:val="top"/>
-            <w:tcMar>
-              <w:top w:w="85" w:type="dxa"/>
-              <w:bottom w:w="85" w:type="dxa"/>
-              <w:left w:w="85" w:type="dxa"/>
-              <w:right w:w="85" w:type="dxa"/>
-            </w:tcMar>
-            <w:tcBorders>
-              <w:top w:val="single" w:sz="4" w:color="D5DADD"/>
-              <w:bottom w:val="single" w:sz="4" w:color="D5DADD"/>
-              <w:left w:val="single" w:sz="4" w:color="D5DADD"/>
-              <w:right w:val="single" w:sz="4" w:color="D5DADD"/>
-            </w:tcBorders>
-          </w:tcPr>
-          <w:p>
-            <w:pPr>
-              <w:spacing w:after="60" w:line="245" w:lineRule="auto"/>
+              <w:t>We added this command</w:t>
+            </w:r>
+          </w:p>
+        </w:tc>
+        <w:tc>
+          <w:tcPr>
+            <w:tcW w:type="dxa" w:w="1224"/>
+            <w:vAlign w:val="center"/>
+            <w:tcMar>
+              <w:top w:w="95" w:type="dxa"/>
+              <w:bottom w:w="95" w:type="dxa"/>
+              <w:left w:w="95" w:type="dxa"/>
+              <w:right w:w="95" w:type="dxa"/>
+            </w:tcMar>
+            <w:tcBorders>
+              <w:top w:val="single" w:sz="4" w:color="D9D9D9"/>
+              <w:bottom w:val="single" w:sz="4" w:color="D9D9D9"/>
+              <w:left w:val="single" w:sz="4" w:color="D9D9D9"/>
+              <w:right w:val="single" w:sz="4" w:color="D9D9D9"/>
+            </w:tcBorders>
+          </w:tcPr>
+          <w:p>
+            <w:pPr>
+              <w:spacing w:after="60" w:line="247" w:lineRule="auto"/>
             </w:pPr>
             <w:r>
               <w:rPr>
@@ -8588,7 +9087,147 @@
                 <w:b w:val="0"/>
                 <w:sz w:val="20"/>
               </w:rPr>
-              <w:t>Exercises user copies, processes, heap growth, pipes, files, invalid accesses and exhaustion. We ran the inherited suite unchanged between v0.0 and v0.4 to detect regressions.</w:t>
+              <w:t>v0.3</w:t>
+            </w:r>
+          </w:p>
+        </w:tc>
+        <w:tc>
+          <w:tcPr>
+            <w:tcW w:type="dxa" w:w="6350"/>
+            <w:vAlign w:val="center"/>
+            <w:tcMar>
+              <w:top w:w="95" w:type="dxa"/>
+              <w:bottom w:w="95" w:type="dxa"/>
+              <w:left w:w="95" w:type="dxa"/>
+              <w:right w:w="95" w:type="dxa"/>
+            </w:tcMar>
+            <w:tcBorders>
+              <w:top w:val="single" w:sz="4" w:color="D9D9D9"/>
+              <w:bottom w:val="single" w:sz="4" w:color="D9D9D9"/>
+              <w:left w:val="single" w:sz="4" w:color="D9D9D9"/>
+              <w:right w:val="single" w:sz="4" w:color="D9D9D9"/>
+            </w:tcBorders>
+          </w:tcPr>
+          <w:p>
+            <w:pPr>
+              <w:spacing w:after="60" w:line="247" w:lineRule="auto"/>
+            </w:pPr>
+            <w:r>
+              <w:rPr>
+                <w:rFonts w:ascii="Calibri" w:hAnsi="Calibri"/>
+                <w:b w:val="0"/>
+                <w:sz w:val="20"/>
+              </w:rPr>
+              <w:t>Calls the new memstat syscall and prints seven counters/resource fields. It is an observation tool, not a memory-pressure workload, and does not reset the counters.</w:t>
+            </w:r>
+          </w:p>
+        </w:tc>
+      </w:tr>
+      <w:tr>
+        <w:trPr>
+          <w:cantSplit/>
+        </w:trPr>
+        <w:tc>
+          <w:tcPr>
+            <w:tcW w:type="dxa" w:w="2592"/>
+            <w:vAlign w:val="center"/>
+            <w:tcMar>
+              <w:top w:w="95" w:type="dxa"/>
+              <w:bottom w:w="95" w:type="dxa"/>
+              <w:left w:w="95" w:type="dxa"/>
+              <w:right w:w="95" w:type="dxa"/>
+            </w:tcMar>
+            <w:tcBorders>
+              <w:top w:val="single" w:sz="4" w:color="D9D9D9"/>
+              <w:bottom w:val="single" w:sz="4" w:color="D9D9D9"/>
+              <w:left w:val="single" w:sz="4" w:color="D9D9D9"/>
+              <w:right w:val="single" w:sz="4" w:color="D9D9D9"/>
+            </w:tcBorders>
+          </w:tcPr>
+          <w:p>
+            <w:pPr>
+              <w:spacing w:after="60" w:line="247" w:lineRule="auto"/>
+            </w:pPr>
+            <w:r>
+              <w:rPr>
+                <w:rFonts w:ascii="Calibri" w:hAnsi="Calibri"/>
+                <w:b w:val="0"/>
+                <w:sz w:val="20"/>
+              </w:rPr>
+              <w:t>user/usertests.c</w:t>
+            </w:r>
+            <w:r>
+              <w:br/>
+            </w:r>
+            <w:r>
+              <w:rPr>
+                <w:rFonts w:ascii="Calibri" w:hAnsi="Calibri"/>
+                <w:b w:val="0"/>
+                <w:sz w:val="20"/>
+              </w:rPr>
+              <w:t>Existing xv6 file</w:t>
+            </w:r>
+          </w:p>
+        </w:tc>
+        <w:tc>
+          <w:tcPr>
+            <w:tcW w:type="dxa" w:w="1224"/>
+            <w:vAlign w:val="center"/>
+            <w:tcMar>
+              <w:top w:w="95" w:type="dxa"/>
+              <w:bottom w:w="95" w:type="dxa"/>
+              <w:left w:w="95" w:type="dxa"/>
+              <w:right w:w="95" w:type="dxa"/>
+            </w:tcMar>
+            <w:tcBorders>
+              <w:top w:val="single" w:sz="4" w:color="D9D9D9"/>
+              <w:bottom w:val="single" w:sz="4" w:color="D9D9D9"/>
+              <w:left w:val="single" w:sz="4" w:color="D9D9D9"/>
+              <w:right w:val="single" w:sz="4" w:color="D9D9D9"/>
+            </w:tcBorders>
+          </w:tcPr>
+          <w:p>
+            <w:pPr>
+              <w:spacing w:after="60" w:line="247" w:lineRule="auto"/>
+            </w:pPr>
+            <w:r>
+              <w:rPr>
+                <w:rFonts w:ascii="Calibri" w:hAnsi="Calibri"/>
+                <w:b w:val="0"/>
+                <w:sz w:val="20"/>
+              </w:rPr>
+              <w:t>Inherited</w:t>
+            </w:r>
+          </w:p>
+        </w:tc>
+        <w:tc>
+          <w:tcPr>
+            <w:tcW w:type="dxa" w:w="6350"/>
+            <w:vAlign w:val="center"/>
+            <w:tcMar>
+              <w:top w:w="95" w:type="dxa"/>
+              <w:bottom w:w="95" w:type="dxa"/>
+              <w:left w:w="95" w:type="dxa"/>
+              <w:right w:w="95" w:type="dxa"/>
+            </w:tcMar>
+            <w:tcBorders>
+              <w:top w:val="single" w:sz="4" w:color="D9D9D9"/>
+              <w:bottom w:val="single" w:sz="4" w:color="D9D9D9"/>
+              <w:left w:val="single" w:sz="4" w:color="D9D9D9"/>
+              <w:right w:val="single" w:sz="4" w:color="D9D9D9"/>
+            </w:tcBorders>
+          </w:tcPr>
+          <w:p>
+            <w:pPr>
+              <w:spacing w:after="60" w:line="247" w:lineRule="auto"/>
+            </w:pPr>
+            <w:r>
+              <w:rPr>
+                <w:rFonts w:ascii="Calibri" w:hAnsi="Calibri"/>
+                <w:b w:val="0"/>
+                <w:sz w:val="20"/>
+              </w:rPr>
+              <w:t>Exercises processes, copies, heap growth, pipes, files, invalid accesses and exhaustion. We used the unchanged suite to check that the new memory mechanisms did not break its tested behavior.</w:t>
             </w:r>
           </w:p>
         </w:tc>
@@ -8596,8 +9235,122 @@
     </w:tbl>
     <w:p>
       <w:pPr>
-        <w:spacing w:after="60" w:line="20" w:lineRule="exact"/>
-      </w:pPr>
+        <w:spacing w:after="120" w:line="247" w:lineRule="auto"/>
+      </w:pPr>
+    </w:p>
+    <w:p>
+      <w:pPr>
+        <w:pStyle w:val="Heading2"/>
+      </w:pPr>
+      <w:r>
+        <w:t>Kernel code behind the memstat command</w:t>
+      </w:r>
+    </w:p>
+    <w:p>
+      <w:pPr>
+        <w:spacing w:after="120" w:line="247" w:lineRule="auto"/>
+      </w:pPr>
+      <w:r>
+        <w:rPr>
+          <w:rFonts w:ascii="Calibri" w:hAnsi="Calibri"/>
+          <w:sz w:val="22"/>
+        </w:rPr>
+        <w:t>The monitoring command required a new kernel interface as well as a new user file. The following is the added sys_memstat body in kernel/sysproc.c; memstat_fill gathers the fields and copyout returns the structure to user space.</w:t>
+      </w:r>
+    </w:p>
+    <w:p>
+      <w:pPr>
+        <w:spacing w:after="120" w:line="245" w:lineRule="auto"/>
+      </w:pPr>
+      <w:r>
+        <w:rPr>
+          <w:rFonts w:ascii="Consolas" w:hAnsi="Consolas"/>
+          <w:sz w:val="19"/>
+        </w:rPr>
+        <w:t xml:space="preserve">  uint64 addr;</w:t>
+      </w:r>
+      <w:r>
+        <w:br/>
+      </w:r>
+      <w:r>
+        <w:rPr>
+          <w:rFonts w:ascii="Consolas" w:hAnsi="Consolas"/>
+          <w:sz w:val="19"/>
+        </w:rPr>
+        <w:t xml:space="preserve">  struct memstat ms;</w:t>
+      </w:r>
+      <w:r>
+        <w:br/>
+      </w:r>
+      <w:r>
+        <w:rPr>
+          <w:rFonts w:ascii="Consolas" w:hAnsi="Consolas"/>
+          <w:sz w:val="19"/>
+        </w:rPr>
+        <w:t xml:space="preserve">  argaddr(0, &amp;addr);</w:t>
+      </w:r>
+      <w:r>
+        <w:br/>
+      </w:r>
+      <w:r>
+        <w:rPr>
+          <w:rFonts w:ascii="Consolas" w:hAnsi="Consolas"/>
+          <w:sz w:val="19"/>
+        </w:rPr>
+        <w:t xml:space="preserve">  memstat_fill(&amp;ms);</w:t>
+      </w:r>
+      <w:r>
+        <w:br/>
+      </w:r>
+      <w:r>
+        <w:rPr>
+          <w:rFonts w:ascii="Consolas" w:hAnsi="Consolas"/>
+          <w:sz w:val="19"/>
+        </w:rPr>
+        <w:t xml:space="preserve">  if(copyout(myproc()-&gt;pagetable, addr,</w:t>
+      </w:r>
+      <w:r>
+        <w:br/>
+      </w:r>
+      <w:r>
+        <w:rPr>
+          <w:rFonts w:ascii="Consolas" w:hAnsi="Consolas"/>
+          <w:sz w:val="19"/>
+        </w:rPr>
+        <w:t xml:space="preserve">             (char*)&amp;ms, sizeof(ms)) &lt; 0)</w:t>
+      </w:r>
+      <w:r>
+        <w:br/>
+      </w:r>
+      <w:r>
+        <w:rPr>
+          <w:rFonts w:ascii="Consolas" w:hAnsi="Consolas"/>
+          <w:sz w:val="19"/>
+        </w:rPr>
+        <w:t xml:space="preserve">    return -1;</w:t>
+      </w:r>
+      <w:r>
+        <w:br/>
+      </w:r>
+      <w:r>
+        <w:rPr>
+          <w:rFonts w:ascii="Consolas" w:hAnsi="Consolas"/>
+          <w:sz w:val="19"/>
+        </w:rPr>
+        <w:t xml:space="preserve">  return 0;</w:t>
+      </w:r>
+    </w:p>
+    <w:p>
+      <w:pPr>
+        <w:spacing w:after="120" w:line="247" w:lineRule="auto"/>
+      </w:pPr>
+      <w:r>
+        <w:rPr>
+          <w:rFonts w:ascii="Calibri" w:hAnsi="Calibri"/>
+          <w:sz w:val="22"/>
+        </w:rPr>
+        <w:t>We added kernel/memstat.h for the shared structure and registered the call through the syscall table and user stub. The printed results, pressure tests and full-suite captures are embedded in the evidence pages that follow; they are preserved observations, not new executions during this document edit. Resource [4] explains the related syscall and sysinfo exercise.</w:t>
+      </w:r>
     </w:p>
     <w:p>
       <w:pPr>

</xml_diff>

<commit_message>
docs: list every memory file change and individual test purpose
</commit_message>
<xml_diff>
--- a/docs/presentation/memory-implementation-walkthrough.docx
+++ b/docs/presentation/memory-implementation-walkthrough.docx
@@ -3465,7 +3465,33 @@
         <w:pageBreakBefore/>
       </w:pPr>
       <w:r>
-        <w:t>Files we created and references</w:t>
+        <w:t>Files changed created and extended</w:t>
+      </w:r>
+    </w:p>
+    <w:p>
+      <w:pPr>
+        <w:spacing w:after="60" w:line="240" w:lineRule="auto"/>
+      </w:pPr>
+      <w:r>
+        <w:rPr>
+          <w:rFonts w:ascii="Calibri" w:hAnsi="Calibri"/>
+          <w:b w:val="0"/>
+          <w:sz w:val="19"/>
+        </w:rPr>
+        <w:t>Memory work through v0.4: 17 original xv6 files modified and 11 created; two new files were extended later. user/usertests.c is inherited and unchanged.</w:t>
+      </w:r>
+    </w:p>
+    <w:p>
+      <w:pPr>
+        <w:spacing w:after="60" w:line="240" w:lineRule="auto"/>
+      </w:pPr>
+      <w:r>
+        <w:rPr>
+          <w:rFonts w:ascii="Calibri" w:hAnsi="Calibri"/>
+          <w:b/>
+          <w:sz w:val="20"/>
+        </w:rPr>
+        <w:t>Modified original xv6 files</w:t>
       </w:r>
     </w:p>
     <w:tbl>
@@ -3476,8 +3502,9 @@
         <w:tblLook w:firstColumn="1" w:firstRow="1" w:lastColumn="0" w:lastRow="0" w:noHBand="0" w:noVBand="1" w:val="04A0"/>
       </w:tblPr>
       <w:tblGrid>
-        <w:gridCol w:w="3528"/>
-        <w:gridCol w:w="6552"/>
+        <w:gridCol w:w="2477"/>
+        <w:gridCol w:w="2376"/>
+        <w:gridCol w:w="5227"/>
       </w:tblGrid>
       <w:tr>
         <w:trPr>
@@ -3486,13 +3513,13 @@
         </w:trPr>
         <w:tc>
           <w:tcPr>
-            <w:tcW w:type="dxa" w:w="3528"/>
+            <w:tcW w:type="dxa" w:w="2477"/>
             <w:vAlign w:val="center"/>
             <w:tcMar>
-              <w:top w:w="85" w:type="dxa"/>
-              <w:bottom w:w="85" w:type="dxa"/>
-              <w:left w:w="85" w:type="dxa"/>
-              <w:right w:w="85" w:type="dxa"/>
+              <w:top w:w="55" w:type="dxa"/>
+              <w:bottom w:w="55" w:type="dxa"/>
+              <w:left w:w="75" w:type="dxa"/>
+              <w:right w:w="75" w:type="dxa"/>
             </w:tcMar>
             <w:tcBorders>
               <w:top w:val="single" w:sz="4" w:color="D9D9D9"/>
@@ -3504,27 +3531,27 @@
           </w:tcPr>
           <w:p>
             <w:pPr>
-              <w:spacing w:after="40" w:line="245" w:lineRule="auto"/>
+              <w:spacing w:after="20" w:line="240" w:lineRule="auto"/>
             </w:pPr>
             <w:r>
               <w:rPr>
                 <w:rFonts w:ascii="Calibri" w:hAnsi="Calibri"/>
                 <w:b/>
-                <w:sz w:val="19"/>
+                <w:sz w:val="18"/>
               </w:rPr>
-              <w:t>New files</w:t>
+              <w:t>Original file</w:t>
             </w:r>
           </w:p>
         </w:tc>
         <w:tc>
           <w:tcPr>
-            <w:tcW w:type="dxa" w:w="6552"/>
+            <w:tcW w:type="dxa" w:w="2376"/>
             <w:vAlign w:val="center"/>
             <w:tcMar>
-              <w:top w:w="85" w:type="dxa"/>
-              <w:bottom w:w="85" w:type="dxa"/>
-              <w:left w:w="85" w:type="dxa"/>
-              <w:right w:w="85" w:type="dxa"/>
+              <w:top w:w="55" w:type="dxa"/>
+              <w:bottom w:w="55" w:type="dxa"/>
+              <w:left w:w="75" w:type="dxa"/>
+              <w:right w:w="75" w:type="dxa"/>
             </w:tcMar>
             <w:tcBorders>
               <w:top w:val="single" w:sz="4" w:color="D9D9D9"/>
@@ -3536,15 +3563,47 @@
           </w:tcPr>
           <w:p>
             <w:pPr>
-              <w:spacing w:after="40" w:line="245" w:lineRule="auto"/>
+              <w:spacing w:after="20" w:line="240" w:lineRule="auto"/>
             </w:pPr>
             <w:r>
               <w:rPr>
                 <w:rFonts w:ascii="Calibri" w:hAnsi="Calibri"/>
                 <w:b/>
-                <w:sz w:val="19"/>
+                <w:sz w:val="18"/>
               </w:rPr>
-              <w:t>Purpose and test coverage</w:t>
+              <w:t>Earlier role</w:t>
+            </w:r>
+          </w:p>
+        </w:tc>
+        <w:tc>
+          <w:tcPr>
+            <w:tcW w:type="dxa" w:w="5227"/>
+            <w:vAlign w:val="center"/>
+            <w:tcMar>
+              <w:top w:w="55" w:type="dxa"/>
+              <w:bottom w:w="55" w:type="dxa"/>
+              <w:left w:w="75" w:type="dxa"/>
+              <w:right w:w="75" w:type="dxa"/>
+            </w:tcMar>
+            <w:tcBorders>
+              <w:top w:val="single" w:sz="4" w:color="D9D9D9"/>
+              <w:bottom w:val="single" w:sz="4" w:color="D9D9D9"/>
+              <w:left w:val="single" w:sz="4" w:color="D9D9D9"/>
+              <w:right w:val="single" w:sz="4" w:color="D9D9D9"/>
+            </w:tcBorders>
+            <w:shd w:fill="EAF0F5"/>
+          </w:tcPr>
+          <w:p>
+            <w:pPr>
+              <w:spacing w:after="20" w:line="240" w:lineRule="auto"/>
+            </w:pPr>
+            <w:r>
+              <w:rPr>
+                <w:rFonts w:ascii="Calibri" w:hAnsi="Calibri"/>
+                <w:b/>
+                <w:sz w:val="18"/>
+              </w:rPr>
+              <w:t>What we changed</w:t>
             </w:r>
           </w:p>
         </w:tc>
@@ -3555,13 +3614,13 @@
         </w:trPr>
         <w:tc>
           <w:tcPr>
-            <w:tcW w:type="dxa" w:w="3528"/>
+            <w:tcW w:type="dxa" w:w="2477"/>
             <w:vAlign w:val="center"/>
             <w:tcMar>
-              <w:top w:w="85" w:type="dxa"/>
-              <w:bottom w:w="85" w:type="dxa"/>
-              <w:left w:w="85" w:type="dxa"/>
-              <w:right w:w="85" w:type="dxa"/>
+              <w:top w:w="55" w:type="dxa"/>
+              <w:bottom w:w="55" w:type="dxa"/>
+              <w:left w:w="75" w:type="dxa"/>
+              <w:right w:w="75" w:type="dxa"/>
             </w:tcMar>
             <w:tcBorders>
               <w:top w:val="single" w:sz="4" w:color="D9D9D9"/>
@@ -3572,49 +3631,27 @@
           </w:tcPr>
           <w:p>
             <w:pPr>
-              <w:spacing w:after="40" w:line="245" w:lineRule="auto"/>
+              <w:spacing w:after="20" w:line="240" w:lineRule="auto"/>
             </w:pPr>
             <w:r>
               <w:rPr>
                 <w:rFonts w:ascii="Calibri" w:hAnsi="Calibri"/>
                 <w:b w:val="0"/>
-                <w:sz w:val="19"/>
+                <w:sz w:val="18"/>
               </w:rPr>
-              <w:t>kernel/pgfault.c</w:t>
-            </w:r>
-            <w:r>
-              <w:br/>
-            </w:r>
-            <w:r>
-              <w:rPr>
-                <w:rFonts w:ascii="Calibri" w:hAnsi="Calibri"/>
-                <w:b w:val="0"/>
-                <w:sz w:val="19"/>
-              </w:rPr>
-              <w:t>kernel/swap.c</w:t>
-            </w:r>
-            <w:r>
-              <w:br/>
-            </w:r>
-            <w:r>
-              <w:rPr>
-                <w:rFonts w:ascii="Calibri" w:hAnsi="Calibri"/>
-                <w:b w:val="0"/>
-                <w:sz w:val="19"/>
-              </w:rPr>
-              <w:t>kernel/memstat.h</w:t>
+              <w:t>Makefile</w:t>
             </w:r>
           </w:p>
         </w:tc>
         <w:tc>
           <w:tcPr>
-            <w:tcW w:type="dxa" w:w="6552"/>
+            <w:tcW w:type="dxa" w:w="2376"/>
             <w:vAlign w:val="center"/>
             <w:tcMar>
-              <w:top w:w="85" w:type="dxa"/>
-              <w:bottom w:w="85" w:type="dxa"/>
-              <w:left w:w="85" w:type="dxa"/>
-              <w:right w:w="85" w:type="dxa"/>
+              <w:top w:w="55" w:type="dxa"/>
+              <w:bottom w:w="55" w:type="dxa"/>
+              <w:left w:w="75" w:type="dxa"/>
+              <w:right w:w="75" w:type="dxa"/>
             </w:tcMar>
             <w:tcBorders>
               <w:top w:val="single" w:sz="4" w:color="D9D9D9"/>
@@ -3625,15 +3662,46 @@
           </w:tcPr>
           <w:p>
             <w:pPr>
-              <w:spacing w:after="40" w:line="245" w:lineRule="auto"/>
+              <w:spacing w:after="20" w:line="240" w:lineRule="auto"/>
             </w:pPr>
             <w:r>
               <w:rPr>
                 <w:rFonts w:ascii="Calibri" w:hAnsi="Calibri"/>
                 <w:b w:val="0"/>
-                <w:sz w:val="19"/>
+                <w:sz w:val="18"/>
               </w:rPr>
-              <w:t>Fault recovery; statistics then swap/policy engine; shared statistics structure.</w:t>
+              <w:t>Kernel and user build</w:t>
+            </w:r>
+          </w:p>
+        </w:tc>
+        <w:tc>
+          <w:tcPr>
+            <w:tcW w:type="dxa" w:w="5227"/>
+            <w:vAlign w:val="center"/>
+            <w:tcMar>
+              <w:top w:w="55" w:type="dxa"/>
+              <w:bottom w:w="55" w:type="dxa"/>
+              <w:left w:w="75" w:type="dxa"/>
+              <w:right w:w="75" w:type="dxa"/>
+            </w:tcMar>
+            <w:tcBorders>
+              <w:top w:val="single" w:sz="4" w:color="D9D9D9"/>
+              <w:bottom w:val="single" w:sz="4" w:color="D9D9D9"/>
+              <w:left w:val="single" w:sz="4" w:color="D9D9D9"/>
+              <w:right w:val="single" w:sz="4" w:color="D9D9D9"/>
+            </w:tcBorders>
+          </w:tcPr>
+          <w:p>
+            <w:pPr>
+              <w:spacing w:after="20" w:line="240" w:lineRule="auto"/>
+            </w:pPr>
+            <w:r>
+              <w:rPr>
+                <w:rFonts w:ascii="Calibri" w:hAnsi="Calibri"/>
+                <w:b w:val="0"/>
+                <w:sz w:val="18"/>
+              </w:rPr>
+              <w:t>Add objects/commands, RAM/policy settings, ISA flags and swap image space.</w:t>
             </w:r>
           </w:p>
         </w:tc>
@@ -3644,13 +3712,13 @@
         </w:trPr>
         <w:tc>
           <w:tcPr>
-            <w:tcW w:type="dxa" w:w="3528"/>
+            <w:tcW w:type="dxa" w:w="2477"/>
             <w:vAlign w:val="center"/>
             <w:tcMar>
-              <w:top w:w="85" w:type="dxa"/>
-              <w:bottom w:w="85" w:type="dxa"/>
-              <w:left w:w="85" w:type="dxa"/>
-              <w:right w:w="85" w:type="dxa"/>
+              <w:top w:w="55" w:type="dxa"/>
+              <w:bottom w:w="55" w:type="dxa"/>
+              <w:left w:w="75" w:type="dxa"/>
+              <w:right w:w="75" w:type="dxa"/>
             </w:tcMar>
             <w:tcBorders>
               <w:top w:val="single" w:sz="4" w:color="D9D9D9"/>
@@ -3661,38 +3729,27 @@
           </w:tcPr>
           <w:p>
             <w:pPr>
-              <w:spacing w:after="40" w:line="245" w:lineRule="auto"/>
+              <w:spacing w:after="20" w:line="240" w:lineRule="auto"/>
             </w:pPr>
             <w:r>
               <w:rPr>
                 <w:rFonts w:ascii="Calibri" w:hAnsi="Calibri"/>
                 <w:b w:val="0"/>
-                <w:sz w:val="19"/>
+                <w:sz w:val="18"/>
               </w:rPr>
-              <w:t>user/baseline.c</w:t>
-            </w:r>
-            <w:r>
-              <w:br/>
-            </w:r>
-            <w:r>
-              <w:rPr>
-                <w:rFonts w:ascii="Calibri" w:hAnsi="Calibri"/>
-                <w:b w:val="0"/>
-                <w:sz w:val="19"/>
-              </w:rPr>
-              <w:t>user/lazytest.c</w:t>
+              <w:t>kernel/defs.h</w:t>
             </w:r>
           </w:p>
         </w:tc>
         <w:tc>
           <w:tcPr>
-            <w:tcW w:type="dxa" w:w="6552"/>
+            <w:tcW w:type="dxa" w:w="2376"/>
             <w:vAlign w:val="center"/>
             <w:tcMar>
-              <w:top w:w="85" w:type="dxa"/>
-              <w:bottom w:w="85" w:type="dxa"/>
-              <w:left w:w="85" w:type="dxa"/>
-              <w:right w:w="85" w:type="dxa"/>
+              <w:top w:w="55" w:type="dxa"/>
+              <w:bottom w:w="55" w:type="dxa"/>
+              <w:left w:w="75" w:type="dxa"/>
+              <w:right w:w="75" w:type="dxa"/>
             </w:tcMar>
             <w:tcBorders>
               <w:top w:val="single" w:sz="4" w:color="D9D9D9"/>
@@ -3703,15 +3760,46 @@
           </w:tcPr>
           <w:p>
             <w:pPr>
-              <w:spacing w:after="40" w:line="245" w:lineRule="auto"/>
+              <w:spacing w:after="20" w:line="240" w:lineRule="auto"/>
             </w:pPr>
             <w:r>
               <w:rPr>
                 <w:rFonts w:ascii="Calibri" w:hAnsi="Calibri"/>
                 <w:b w:val="0"/>
-                <w:sz w:val="19"/>
+                <w:sz w:val="18"/>
               </w:rPr>
-              <w:t>Added at v0.0 and v0.1: reservation comparison, sparse demand-zero allocation and syscall buffer checks. Results on page 1.</w:t>
+              <w:t>Kernel declarations</w:t>
+            </w:r>
+          </w:p>
+        </w:tc>
+        <w:tc>
+          <w:tcPr>
+            <w:tcW w:type="dxa" w:w="5227"/>
+            <w:vAlign w:val="center"/>
+            <w:tcMar>
+              <w:top w:w="55" w:type="dxa"/>
+              <w:bottom w:w="55" w:type="dxa"/>
+              <w:left w:w="75" w:type="dxa"/>
+              <w:right w:w="75" w:type="dxa"/>
+            </w:tcMar>
+            <w:tcBorders>
+              <w:top w:val="single" w:sz="4" w:color="D9D9D9"/>
+              <w:bottom w:val="single" w:sz="4" w:color="D9D9D9"/>
+              <w:left w:val="single" w:sz="4" w:color="D9D9D9"/>
+              <w:right w:val="single" w:sz="4" w:color="D9D9D9"/>
+            </w:tcBorders>
+          </w:tcPr>
+          <w:p>
+            <w:pPr>
+              <w:spacing w:after="20" w:line="240" w:lineRule="auto"/>
+            </w:pPr>
+            <w:r>
+              <w:rPr>
+                <w:rFonts w:ascii="Calibri" w:hAnsi="Calibri"/>
+                <w:b w:val="0"/>
+                <w:sz w:val="18"/>
+              </w:rPr>
+              <w:t>Declare fault, frame-reference, swap, prefault and memstat interfaces.</w:t>
             </w:r>
           </w:p>
         </w:tc>
@@ -3722,13 +3810,13 @@
         </w:trPr>
         <w:tc>
           <w:tcPr>
-            <w:tcW w:type="dxa" w:w="3528"/>
+            <w:tcW w:type="dxa" w:w="2477"/>
             <w:vAlign w:val="center"/>
             <w:tcMar>
-              <w:top w:w="85" w:type="dxa"/>
-              <w:bottom w:w="85" w:type="dxa"/>
-              <w:left w:w="85" w:type="dxa"/>
-              <w:right w:w="85" w:type="dxa"/>
+              <w:top w:w="55" w:type="dxa"/>
+              <w:bottom w:w="55" w:type="dxa"/>
+              <w:left w:w="75" w:type="dxa"/>
+              <w:right w:w="75" w:type="dxa"/>
             </w:tcMar>
             <w:tcBorders>
               <w:top w:val="single" w:sz="4" w:color="D9D9D9"/>
@@ -3739,38 +3827,27 @@
           </w:tcPr>
           <w:p>
             <w:pPr>
-              <w:spacing w:after="40" w:line="245" w:lineRule="auto"/>
+              <w:spacing w:after="20" w:line="240" w:lineRule="auto"/>
             </w:pPr>
             <w:r>
               <w:rPr>
                 <w:rFonts w:ascii="Calibri" w:hAnsi="Calibri"/>
                 <w:b w:val="0"/>
-                <w:sz w:val="19"/>
+                <w:sz w:val="18"/>
               </w:rPr>
-              <w:t>user/cowtest.c</w:t>
-            </w:r>
-            <w:r>
-              <w:br/>
-            </w:r>
-            <w:r>
-              <w:rPr>
-                <w:rFonts w:ascii="Calibri" w:hAnsi="Calibri"/>
-                <w:b w:val="0"/>
-                <w:sz w:val="19"/>
-              </w:rPr>
-              <w:t>user/forkbench.c</w:t>
+              <w:t>kernel/sysproc.c</w:t>
             </w:r>
           </w:p>
         </w:tc>
         <w:tc>
           <w:tcPr>
-            <w:tcW w:type="dxa" w:w="6552"/>
+            <w:tcW w:type="dxa" w:w="2376"/>
             <w:vAlign w:val="center"/>
             <w:tcMar>
-              <w:top w:w="85" w:type="dxa"/>
-              <w:bottom w:w="85" w:type="dxa"/>
-              <w:left w:w="85" w:type="dxa"/>
-              <w:right w:w="85" w:type="dxa"/>
+              <w:top w:w="55" w:type="dxa"/>
+              <w:bottom w:w="55" w:type="dxa"/>
+              <w:left w:w="75" w:type="dxa"/>
+              <w:right w:w="75" w:type="dxa"/>
             </w:tcMar>
             <w:tcBorders>
               <w:top w:val="single" w:sz="4" w:color="D9D9D9"/>
@@ -3781,15 +3858,46 @@
           </w:tcPr>
           <w:p>
             <w:pPr>
-              <w:spacing w:after="40" w:line="245" w:lineRule="auto"/>
+              <w:spacing w:after="20" w:line="240" w:lineRule="auto"/>
             </w:pPr>
             <w:r>
               <w:rPr>
                 <w:rFonts w:ascii="Calibri" w:hAnsi="Calibri"/>
                 <w:b w:val="0"/>
-                <w:sz w:val="19"/>
+                <w:sz w:val="18"/>
               </w:rPr>
-              <w:t>Added before COW: fork capacity, inherited contents, isolation and fork/wait timing. Results on page 2.</w:t>
+              <w:t>Process syscalls; eager heap</w:t>
+            </w:r>
+          </w:p>
+        </w:tc>
+        <w:tc>
+          <w:tcPr>
+            <w:tcW w:type="dxa" w:w="5227"/>
+            <w:vAlign w:val="center"/>
+            <w:tcMar>
+              <w:top w:w="55" w:type="dxa"/>
+              <w:bottom w:w="55" w:type="dxa"/>
+              <w:left w:w="75" w:type="dxa"/>
+              <w:right w:w="75" w:type="dxa"/>
+            </w:tcMar>
+            <w:tcBorders>
+              <w:top w:val="single" w:sz="4" w:color="D9D9D9"/>
+              <w:bottom w:val="single" w:sz="4" w:color="D9D9D9"/>
+              <w:left w:val="single" w:sz="4" w:color="D9D9D9"/>
+              <w:right w:val="single" w:sz="4" w:color="D9D9D9"/>
+            </w:tcBorders>
+          </w:tcPr>
+          <w:p>
+            <w:pPr>
+              <w:spacing w:after="20" w:line="240" w:lineRule="auto"/>
+            </w:pPr>
+            <w:r>
+              <w:rPr>
+                <w:rFonts w:ascii="Calibri" w:hAnsi="Calibri"/>
+                <w:b w:val="0"/>
+                <w:sz w:val="18"/>
+              </w:rPr>
+              <w:t>Reserve positive sbrk growth; add sys_memstat.</w:t>
             </w:r>
           </w:p>
         </w:tc>
@@ -3800,13 +3908,13 @@
         </w:trPr>
         <w:tc>
           <w:tcPr>
-            <w:tcW w:type="dxa" w:w="3528"/>
+            <w:tcW w:type="dxa" w:w="2477"/>
             <w:vAlign w:val="center"/>
             <w:tcMar>
-              <w:top w:w="85" w:type="dxa"/>
-              <w:bottom w:w="85" w:type="dxa"/>
-              <w:left w:w="85" w:type="dxa"/>
-              <w:right w:w="85" w:type="dxa"/>
+              <w:top w:w="55" w:type="dxa"/>
+              <w:bottom w:w="55" w:type="dxa"/>
+              <w:left w:w="75" w:type="dxa"/>
+              <w:right w:w="75" w:type="dxa"/>
             </w:tcMar>
             <w:tcBorders>
               <w:top w:val="single" w:sz="4" w:color="D9D9D9"/>
@@ -3817,49 +3925,27 @@
           </w:tcPr>
           <w:p>
             <w:pPr>
-              <w:spacing w:after="40" w:line="245" w:lineRule="auto"/>
+              <w:spacing w:after="20" w:line="240" w:lineRule="auto"/>
             </w:pPr>
             <w:r>
               <w:rPr>
                 <w:rFonts w:ascii="Calibri" w:hAnsi="Calibri"/>
                 <w:b w:val="0"/>
-                <w:sz w:val="19"/>
+                <w:sz w:val="18"/>
               </w:rPr>
-              <w:t>user/memhog.c</w:t>
-            </w:r>
-            <w:r>
-              <w:br/>
-            </w:r>
-            <w:r>
-              <w:rPr>
-                <w:rFonts w:ascii="Calibri" w:hAnsi="Calibri"/>
-                <w:b w:val="0"/>
-                <w:sz w:val="19"/>
-              </w:rPr>
-              <w:t>user/swapfork.c</w:t>
-            </w:r>
-            <w:r>
-              <w:br/>
-            </w:r>
-            <w:r>
-              <w:rPr>
-                <w:rFonts w:ascii="Calibri" w:hAnsi="Calibri"/>
-                <w:b w:val="0"/>
-                <w:sz w:val="19"/>
-              </w:rPr>
-              <w:t>user/hotcold.c</w:t>
+              <w:t>kernel/trap.c</w:t>
             </w:r>
           </w:p>
         </w:tc>
         <w:tc>
           <w:tcPr>
-            <w:tcW w:type="dxa" w:w="6552"/>
+            <w:tcW w:type="dxa" w:w="2376"/>
             <w:vAlign w:val="center"/>
             <w:tcMar>
-              <w:top w:w="85" w:type="dxa"/>
-              <w:bottom w:w="85" w:type="dxa"/>
-              <w:left w:w="85" w:type="dxa"/>
-              <w:right w:w="85" w:type="dxa"/>
+              <w:top w:w="55" w:type="dxa"/>
+              <w:bottom w:w="55" w:type="dxa"/>
+              <w:left w:w="75" w:type="dxa"/>
+              <w:right w:w="75" w:type="dxa"/>
             </w:tcMar>
             <w:tcBorders>
               <w:top w:val="single" w:sz="4" w:color="D9D9D9"/>
@@ -3870,15 +3956,46 @@
           </w:tcPr>
           <w:p>
             <w:pPr>
-              <w:spacing w:after="40" w:line="245" w:lineRule="auto"/>
+              <w:spacing w:after="20" w:line="240" w:lineRule="auto"/>
             </w:pPr>
             <w:r>
               <w:rPr>
                 <w:rFonts w:ascii="Calibri" w:hAnsi="Calibri"/>
                 <w:b w:val="0"/>
-                <w:sz w:val="19"/>
+                <w:sz w:val="18"/>
               </w:rPr>
-              <w:t>Pressure/data checks, COW with paging, and FIFO/Clock workload. Results on pages 3 and 4.</w:t>
+              <w:t>Trap handling</w:t>
+            </w:r>
+          </w:p>
+        </w:tc>
+        <w:tc>
+          <w:tcPr>
+            <w:tcW w:type="dxa" w:w="5227"/>
+            <w:vAlign w:val="center"/>
+            <w:tcMar>
+              <w:top w:w="55" w:type="dxa"/>
+              <w:bottom w:w="55" w:type="dxa"/>
+              <w:left w:w="75" w:type="dxa"/>
+              <w:right w:w="75" w:type="dxa"/>
+            </w:tcMar>
+            <w:tcBorders>
+              <w:top w:val="single" w:sz="4" w:color="D9D9D9"/>
+              <w:bottom w:val="single" w:sz="4" w:color="D9D9D9"/>
+              <w:left w:val="single" w:sz="4" w:color="D9D9D9"/>
+              <w:right w:val="single" w:sz="4" w:color="D9D9D9"/>
+            </w:tcBorders>
+          </w:tcPr>
+          <w:p>
+            <w:pPr>
+              <w:spacing w:after="20" w:line="240" w:lineRule="auto"/>
+            </w:pPr>
+            <w:r>
+              <w:rPr>
+                <w:rFonts w:ascii="Calibri" w:hAnsi="Calibri"/>
+                <w:b w:val="0"/>
+                <w:sz w:val="18"/>
+              </w:rPr>
+              <w:t>Dispatch memory faults to handle_page_fault.</w:t>
             </w:r>
           </w:p>
         </w:tc>
@@ -3889,13 +4006,13 @@
         </w:trPr>
         <w:tc>
           <w:tcPr>
-            <w:tcW w:type="dxa" w:w="3528"/>
+            <w:tcW w:type="dxa" w:w="2477"/>
             <w:vAlign w:val="center"/>
             <w:tcMar>
-              <w:top w:w="85" w:type="dxa"/>
-              <w:bottom w:w="85" w:type="dxa"/>
-              <w:left w:w="85" w:type="dxa"/>
-              <w:right w:w="85" w:type="dxa"/>
+              <w:top w:w="55" w:type="dxa"/>
+              <w:bottom w:w="55" w:type="dxa"/>
+              <w:left w:w="75" w:type="dxa"/>
+              <w:right w:w="75" w:type="dxa"/>
             </w:tcMar>
             <w:tcBorders>
               <w:top w:val="single" w:sz="4" w:color="D9D9D9"/>
@@ -3906,27 +4023,27 @@
           </w:tcPr>
           <w:p>
             <w:pPr>
-              <w:spacing w:after="40" w:line="245" w:lineRule="auto"/>
+              <w:spacing w:after="20" w:line="240" w:lineRule="auto"/>
             </w:pPr>
             <w:r>
               <w:rPr>
                 <w:rFonts w:ascii="Calibri" w:hAnsi="Calibri"/>
                 <w:b w:val="0"/>
-                <w:sz w:val="19"/>
+                <w:sz w:val="18"/>
               </w:rPr>
-              <w:t>user/memstat.c</w:t>
+              <w:t>kernel/vm.c</w:t>
             </w:r>
           </w:p>
         </w:tc>
         <w:tc>
           <w:tcPr>
-            <w:tcW w:type="dxa" w:w="6552"/>
+            <w:tcW w:type="dxa" w:w="2376"/>
             <w:vAlign w:val="center"/>
             <w:tcMar>
-              <w:top w:w="85" w:type="dxa"/>
-              <w:bottom w:w="85" w:type="dxa"/>
-              <w:left w:w="85" w:type="dxa"/>
-              <w:right w:w="85" w:type="dxa"/>
+              <w:top w:w="55" w:type="dxa"/>
+              <w:bottom w:w="55" w:type="dxa"/>
+              <w:left w:w="75" w:type="dxa"/>
+              <w:right w:w="75" w:type="dxa"/>
             </w:tcMar>
             <w:tcBorders>
               <w:top w:val="single" w:sz="4" w:color="D9D9D9"/>
@@ -3937,15 +4054,1048 @@
           </w:tcPr>
           <w:p>
             <w:pPr>
-              <w:spacing w:after="40" w:line="245" w:lineRule="auto"/>
+              <w:spacing w:after="20" w:line="240" w:lineRule="auto"/>
             </w:pPr>
             <w:r>
               <w:rPr>
                 <w:rFonts w:ascii="Calibri" w:hAnsi="Calibri"/>
                 <w:b w:val="0"/>
-                <w:sz w:val="19"/>
+                <w:sz w:val="18"/>
               </w:rPr>
-              <w:t>New observation command behind the new syscall. Output on page 5.</w:t>
+              <w:t>Page tables, fork and copies</w:t>
+            </w:r>
+          </w:p>
+        </w:tc>
+        <w:tc>
+          <w:tcPr>
+            <w:tcW w:type="dxa" w:w="5227"/>
+            <w:vAlign w:val="center"/>
+            <w:tcMar>
+              <w:top w:w="55" w:type="dxa"/>
+              <w:bottom w:w="55" w:type="dxa"/>
+              <w:left w:w="75" w:type="dxa"/>
+              <w:right w:w="75" w:type="dxa"/>
+            </w:tcMar>
+            <w:tcBorders>
+              <w:top w:val="single" w:sz="4" w:color="D9D9D9"/>
+              <w:bottom w:val="single" w:sz="4" w:color="D9D9D9"/>
+              <w:left w:val="single" w:sz="4" w:color="D9D9D9"/>
+              <w:right w:val="single" w:sz="4" w:color="D9D9D9"/>
+            </w:tcBorders>
+          </w:tcPr>
+          <w:p>
+            <w:pPr>
+              <w:spacing w:after="20" w:line="240" w:lineRule="auto"/>
+            </w:pPr>
+            <w:r>
+              <w:rPr>
+                <w:rFonts w:ascii="Calibri" w:hAnsi="Calibri"/>
+                <w:b w:val="0"/>
+                <w:sz w:val="18"/>
+              </w:rPr>
+              <w:t>Handle lazy holes, COW sharing, swapped pages and fault-aware user copies.</w:t>
+            </w:r>
+          </w:p>
+        </w:tc>
+      </w:tr>
+      <w:tr>
+        <w:trPr>
+          <w:cantSplit/>
+        </w:trPr>
+        <w:tc>
+          <w:tcPr>
+            <w:tcW w:type="dxa" w:w="2477"/>
+            <w:vAlign w:val="center"/>
+            <w:tcMar>
+              <w:top w:w="55" w:type="dxa"/>
+              <w:bottom w:w="55" w:type="dxa"/>
+              <w:left w:w="75" w:type="dxa"/>
+              <w:right w:w="75" w:type="dxa"/>
+            </w:tcMar>
+            <w:tcBorders>
+              <w:top w:val="single" w:sz="4" w:color="D9D9D9"/>
+              <w:bottom w:val="single" w:sz="4" w:color="D9D9D9"/>
+              <w:left w:val="single" w:sz="4" w:color="D9D9D9"/>
+              <w:right w:val="single" w:sz="4" w:color="D9D9D9"/>
+            </w:tcBorders>
+          </w:tcPr>
+          <w:p>
+            <w:pPr>
+              <w:spacing w:after="20" w:line="240" w:lineRule="auto"/>
+            </w:pPr>
+            <w:r>
+              <w:rPr>
+                <w:rFonts w:ascii="Calibri" w:hAnsi="Calibri"/>
+                <w:b w:val="0"/>
+                <w:sz w:val="18"/>
+              </w:rPr>
+              <w:t>kernel/kalloc.c</w:t>
+            </w:r>
+          </w:p>
+        </w:tc>
+        <w:tc>
+          <w:tcPr>
+            <w:tcW w:type="dxa" w:w="2376"/>
+            <w:vAlign w:val="center"/>
+            <w:tcMar>
+              <w:top w:w="55" w:type="dxa"/>
+              <w:bottom w:w="55" w:type="dxa"/>
+              <w:left w:w="75" w:type="dxa"/>
+              <w:right w:w="75" w:type="dxa"/>
+            </w:tcMar>
+            <w:tcBorders>
+              <w:top w:val="single" w:sz="4" w:color="D9D9D9"/>
+              <w:bottom w:val="single" w:sz="4" w:color="D9D9D9"/>
+              <w:left w:val="single" w:sz="4" w:color="D9D9D9"/>
+              <w:right w:val="single" w:sz="4" w:color="D9D9D9"/>
+            </w:tcBorders>
+          </w:tcPr>
+          <w:p>
+            <w:pPr>
+              <w:spacing w:after="20" w:line="240" w:lineRule="auto"/>
+            </w:pPr>
+            <w:r>
+              <w:rPr>
+                <w:rFonts w:ascii="Calibri" w:hAnsi="Calibri"/>
+                <w:b w:val="0"/>
+                <w:sz w:val="18"/>
+              </w:rPr>
+              <w:t>Physical free-list allocator</w:t>
+            </w:r>
+          </w:p>
+        </w:tc>
+        <w:tc>
+          <w:tcPr>
+            <w:tcW w:type="dxa" w:w="5227"/>
+            <w:vAlign w:val="center"/>
+            <w:tcMar>
+              <w:top w:w="55" w:type="dxa"/>
+              <w:bottom w:w="55" w:type="dxa"/>
+              <w:left w:w="75" w:type="dxa"/>
+              <w:right w:w="75" w:type="dxa"/>
+            </w:tcMar>
+            <w:tcBorders>
+              <w:top w:val="single" w:sz="4" w:color="D9D9D9"/>
+              <w:bottom w:val="single" w:sz="4" w:color="D9D9D9"/>
+              <w:left w:val="single" w:sz="4" w:color="D9D9D9"/>
+              <w:right w:val="single" w:sz="4" w:color="D9D9D9"/>
+            </w:tcBorders>
+          </w:tcPr>
+          <w:p>
+            <w:pPr>
+              <w:spacing w:after="20" w:line="240" w:lineRule="auto"/>
+            </w:pPr>
+            <w:r>
+              <w:rPr>
+                <w:rFonts w:ascii="Calibri" w:hAnsi="Calibri"/>
+                <w:b w:val="0"/>
+                <w:sz w:val="18"/>
+              </w:rPr>
+              <w:t>Add frame references, final-owner release and free-page counting.</w:t>
+            </w:r>
+          </w:p>
+        </w:tc>
+      </w:tr>
+      <w:tr>
+        <w:trPr>
+          <w:cantSplit/>
+        </w:trPr>
+        <w:tc>
+          <w:tcPr>
+            <w:tcW w:type="dxa" w:w="2477"/>
+            <w:vAlign w:val="center"/>
+            <w:tcMar>
+              <w:top w:w="55" w:type="dxa"/>
+              <w:bottom w:w="55" w:type="dxa"/>
+              <w:left w:w="75" w:type="dxa"/>
+              <w:right w:w="75" w:type="dxa"/>
+            </w:tcMar>
+            <w:tcBorders>
+              <w:top w:val="single" w:sz="4" w:color="D9D9D9"/>
+              <w:bottom w:val="single" w:sz="4" w:color="D9D9D9"/>
+              <w:left w:val="single" w:sz="4" w:color="D9D9D9"/>
+              <w:right w:val="single" w:sz="4" w:color="D9D9D9"/>
+            </w:tcBorders>
+          </w:tcPr>
+          <w:p>
+            <w:pPr>
+              <w:spacing w:after="20" w:line="240" w:lineRule="auto"/>
+            </w:pPr>
+            <w:r>
+              <w:rPr>
+                <w:rFonts w:ascii="Calibri" w:hAnsi="Calibri"/>
+                <w:b w:val="0"/>
+                <w:sz w:val="18"/>
+              </w:rPr>
+              <w:t>kernel/riscv.h</w:t>
+            </w:r>
+          </w:p>
+        </w:tc>
+        <w:tc>
+          <w:tcPr>
+            <w:tcW w:type="dxa" w:w="2376"/>
+            <w:vAlign w:val="center"/>
+            <w:tcMar>
+              <w:top w:w="55" w:type="dxa"/>
+              <w:bottom w:w="55" w:type="dxa"/>
+              <w:left w:w="75" w:type="dxa"/>
+              <w:right w:w="75" w:type="dxa"/>
+            </w:tcMar>
+            <w:tcBorders>
+              <w:top w:val="single" w:sz="4" w:color="D9D9D9"/>
+              <w:bottom w:val="single" w:sz="4" w:color="D9D9D9"/>
+              <w:left w:val="single" w:sz="4" w:color="D9D9D9"/>
+              <w:right w:val="single" w:sz="4" w:color="D9D9D9"/>
+            </w:tcBorders>
+          </w:tcPr>
+          <w:p>
+            <w:pPr>
+              <w:spacing w:after="20" w:line="240" w:lineRule="auto"/>
+            </w:pPr>
+            <w:r>
+              <w:rPr>
+                <w:rFonts w:ascii="Calibri" w:hAnsi="Calibri"/>
+                <w:b w:val="0"/>
+                <w:sz w:val="18"/>
+              </w:rPr>
+              <w:t>ISA and PTE definitions</w:t>
+            </w:r>
+          </w:p>
+        </w:tc>
+        <w:tc>
+          <w:tcPr>
+            <w:tcW w:type="dxa" w:w="5227"/>
+            <w:vAlign w:val="center"/>
+            <w:tcMar>
+              <w:top w:w="55" w:type="dxa"/>
+              <w:bottom w:w="55" w:type="dxa"/>
+              <w:left w:w="75" w:type="dxa"/>
+              <w:right w:w="75" w:type="dxa"/>
+            </w:tcMar>
+            <w:tcBorders>
+              <w:top w:val="single" w:sz="4" w:color="D9D9D9"/>
+              <w:bottom w:val="single" w:sz="4" w:color="D9D9D9"/>
+              <w:left w:val="single" w:sz="4" w:color="D9D9D9"/>
+              <w:right w:val="single" w:sz="4" w:color="D9D9D9"/>
+            </w:tcBorders>
+          </w:tcPr>
+          <w:p>
+            <w:pPr>
+              <w:spacing w:after="20" w:line="240" w:lineRule="auto"/>
+            </w:pPr>
+            <w:r>
+              <w:rPr>
+                <w:rFonts w:ascii="Calibri" w:hAnsi="Calibri"/>
+                <w:b w:val="0"/>
+                <w:sz w:val="18"/>
+              </w:rPr>
+              <w:t>Add COW/SWAP/accessed flags and swap-slot encoding macros.</w:t>
+            </w:r>
+          </w:p>
+        </w:tc>
+      </w:tr>
+      <w:tr>
+        <w:trPr>
+          <w:cantSplit/>
+        </w:trPr>
+        <w:tc>
+          <w:tcPr>
+            <w:tcW w:type="dxa" w:w="2477"/>
+            <w:vAlign w:val="center"/>
+            <w:tcMar>
+              <w:top w:w="55" w:type="dxa"/>
+              <w:bottom w:w="55" w:type="dxa"/>
+              <w:left w:w="75" w:type="dxa"/>
+              <w:right w:w="75" w:type="dxa"/>
+            </w:tcMar>
+            <w:tcBorders>
+              <w:top w:val="single" w:sz="4" w:color="D9D9D9"/>
+              <w:bottom w:val="single" w:sz="4" w:color="D9D9D9"/>
+              <w:left w:val="single" w:sz="4" w:color="D9D9D9"/>
+              <w:right w:val="single" w:sz="4" w:color="D9D9D9"/>
+            </w:tcBorders>
+          </w:tcPr>
+          <w:p>
+            <w:pPr>
+              <w:spacing w:after="20" w:line="240" w:lineRule="auto"/>
+            </w:pPr>
+            <w:r>
+              <w:rPr>
+                <w:rFonts w:ascii="Calibri" w:hAnsi="Calibri"/>
+                <w:b w:val="0"/>
+                <w:sz w:val="18"/>
+              </w:rPr>
+              <w:t>kernel/memlayout.h</w:t>
+            </w:r>
+          </w:p>
+        </w:tc>
+        <w:tc>
+          <w:tcPr>
+            <w:tcW w:type="dxa" w:w="2376"/>
+            <w:vAlign w:val="center"/>
+            <w:tcMar>
+              <w:top w:w="55" w:type="dxa"/>
+              <w:bottom w:w="55" w:type="dxa"/>
+              <w:left w:w="75" w:type="dxa"/>
+              <w:right w:w="75" w:type="dxa"/>
+            </w:tcMar>
+            <w:tcBorders>
+              <w:top w:val="single" w:sz="4" w:color="D9D9D9"/>
+              <w:bottom w:val="single" w:sz="4" w:color="D9D9D9"/>
+              <w:left w:val="single" w:sz="4" w:color="D9D9D9"/>
+              <w:right w:val="single" w:sz="4" w:color="D9D9D9"/>
+            </w:tcBorders>
+          </w:tcPr>
+          <w:p>
+            <w:pPr>
+              <w:spacing w:after="20" w:line="240" w:lineRule="auto"/>
+            </w:pPr>
+            <w:r>
+              <w:rPr>
+                <w:rFonts w:ascii="Calibri" w:hAnsi="Calibri"/>
+                <w:b w:val="0"/>
+                <w:sz w:val="18"/>
+              </w:rPr>
+              <w:t>Fixed 128 MiB boundary</w:t>
+            </w:r>
+          </w:p>
+        </w:tc>
+        <w:tc>
+          <w:tcPr>
+            <w:tcW w:type="dxa" w:w="5227"/>
+            <w:vAlign w:val="center"/>
+            <w:tcMar>
+              <w:top w:w="55" w:type="dxa"/>
+              <w:bottom w:w="55" w:type="dxa"/>
+              <w:left w:w="75" w:type="dxa"/>
+              <w:right w:w="75" w:type="dxa"/>
+            </w:tcMar>
+            <w:tcBorders>
+              <w:top w:val="single" w:sz="4" w:color="D9D9D9"/>
+              <w:bottom w:val="single" w:sz="4" w:color="D9D9D9"/>
+              <w:left w:val="single" w:sz="4" w:color="D9D9D9"/>
+              <w:right w:val="single" w:sz="4" w:color="D9D9D9"/>
+            </w:tcBorders>
+          </w:tcPr>
+          <w:p>
+            <w:pPr>
+              <w:spacing w:after="20" w:line="240" w:lineRule="auto"/>
+            </w:pPr>
+            <w:r>
+              <w:rPr>
+                <w:rFonts w:ascii="Calibri" w:hAnsi="Calibri"/>
+                <w:b w:val="0"/>
+                <w:sz w:val="18"/>
+              </w:rPr>
+              <w:t>Make PHYSTOP depend on RAM_MB for constrained-memory tests.</w:t>
+            </w:r>
+          </w:p>
+        </w:tc>
+      </w:tr>
+      <w:tr>
+        <w:trPr>
+          <w:cantSplit/>
+        </w:trPr>
+        <w:tc>
+          <w:tcPr>
+            <w:tcW w:type="dxa" w:w="2477"/>
+            <w:vAlign w:val="center"/>
+            <w:tcMar>
+              <w:top w:w="55" w:type="dxa"/>
+              <w:bottom w:w="55" w:type="dxa"/>
+              <w:left w:w="75" w:type="dxa"/>
+              <w:right w:w="75" w:type="dxa"/>
+            </w:tcMar>
+            <w:tcBorders>
+              <w:top w:val="single" w:sz="4" w:color="D9D9D9"/>
+              <w:bottom w:val="single" w:sz="4" w:color="D9D9D9"/>
+              <w:left w:val="single" w:sz="4" w:color="D9D9D9"/>
+              <w:right w:val="single" w:sz="4" w:color="D9D9D9"/>
+            </w:tcBorders>
+          </w:tcPr>
+          <w:p>
+            <w:pPr>
+              <w:spacing w:after="20" w:line="240" w:lineRule="auto"/>
+            </w:pPr>
+            <w:r>
+              <w:rPr>
+                <w:rFonts w:ascii="Calibri" w:hAnsi="Calibri"/>
+                <w:b w:val="0"/>
+                <w:sz w:val="18"/>
+              </w:rPr>
+              <w:t>kernel/main.c</w:t>
+            </w:r>
+          </w:p>
+        </w:tc>
+        <w:tc>
+          <w:tcPr>
+            <w:tcW w:type="dxa" w:w="2376"/>
+            <w:vAlign w:val="center"/>
+            <w:tcMar>
+              <w:top w:w="55" w:type="dxa"/>
+              <w:bottom w:w="55" w:type="dxa"/>
+              <w:left w:w="75" w:type="dxa"/>
+              <w:right w:w="75" w:type="dxa"/>
+            </w:tcMar>
+            <w:tcBorders>
+              <w:top w:val="single" w:sz="4" w:color="D9D9D9"/>
+              <w:bottom w:val="single" w:sz="4" w:color="D9D9D9"/>
+              <w:left w:val="single" w:sz="4" w:color="D9D9D9"/>
+              <w:right w:val="single" w:sz="4" w:color="D9D9D9"/>
+            </w:tcBorders>
+          </w:tcPr>
+          <w:p>
+            <w:pPr>
+              <w:spacing w:after="20" w:line="240" w:lineRule="auto"/>
+            </w:pPr>
+            <w:r>
+              <w:rPr>
+                <w:rFonts w:ascii="Calibri" w:hAnsi="Calibri"/>
+                <w:b w:val="0"/>
+                <w:sz w:val="18"/>
+              </w:rPr>
+              <w:t>Boot initialization</w:t>
+            </w:r>
+          </w:p>
+        </w:tc>
+        <w:tc>
+          <w:tcPr>
+            <w:tcW w:type="dxa" w:w="5227"/>
+            <w:vAlign w:val="center"/>
+            <w:tcMar>
+              <w:top w:w="55" w:type="dxa"/>
+              <w:bottom w:w="55" w:type="dxa"/>
+              <w:left w:w="75" w:type="dxa"/>
+              <w:right w:w="75" w:type="dxa"/>
+            </w:tcMar>
+            <w:tcBorders>
+              <w:top w:val="single" w:sz="4" w:color="D9D9D9"/>
+              <w:bottom w:val="single" w:sz="4" w:color="D9D9D9"/>
+              <w:left w:val="single" w:sz="4" w:color="D9D9D9"/>
+              <w:right w:val="single" w:sz="4" w:color="D9D9D9"/>
+            </w:tcBorders>
+          </w:tcPr>
+          <w:p>
+            <w:pPr>
+              <w:spacing w:after="20" w:line="240" w:lineRule="auto"/>
+            </w:pPr>
+            <w:r>
+              <w:rPr>
+                <w:rFonts w:ascii="Calibri" w:hAnsi="Calibri"/>
+                <w:b w:val="0"/>
+                <w:sz w:val="18"/>
+              </w:rPr>
+              <w:t>Call swap_init during initialization.</w:t>
+            </w:r>
+          </w:p>
+        </w:tc>
+      </w:tr>
+      <w:tr>
+        <w:trPr>
+          <w:cantSplit/>
+        </w:trPr>
+        <w:tc>
+          <w:tcPr>
+            <w:tcW w:type="dxa" w:w="2477"/>
+            <w:vAlign w:val="center"/>
+            <w:tcMar>
+              <w:top w:w="55" w:type="dxa"/>
+              <w:bottom w:w="55" w:type="dxa"/>
+              <w:left w:w="75" w:type="dxa"/>
+              <w:right w:w="75" w:type="dxa"/>
+            </w:tcMar>
+            <w:tcBorders>
+              <w:top w:val="single" w:sz="4" w:color="D9D9D9"/>
+              <w:bottom w:val="single" w:sz="4" w:color="D9D9D9"/>
+              <w:left w:val="single" w:sz="4" w:color="D9D9D9"/>
+              <w:right w:val="single" w:sz="4" w:color="D9D9D9"/>
+            </w:tcBorders>
+          </w:tcPr>
+          <w:p>
+            <w:pPr>
+              <w:spacing w:after="20" w:line="240" w:lineRule="auto"/>
+            </w:pPr>
+            <w:r>
+              <w:rPr>
+                <w:rFonts w:ascii="Calibri" w:hAnsi="Calibri"/>
+                <w:b w:val="0"/>
+                <w:sz w:val="18"/>
+              </w:rPr>
+              <w:t>kernel/proc.c</w:t>
+            </w:r>
+          </w:p>
+        </w:tc>
+        <w:tc>
+          <w:tcPr>
+            <w:tcW w:type="dxa" w:w="2376"/>
+            <w:vAlign w:val="center"/>
+            <w:tcMar>
+              <w:top w:w="55" w:type="dxa"/>
+              <w:bottom w:w="55" w:type="dxa"/>
+              <w:left w:w="75" w:type="dxa"/>
+              <w:right w:w="75" w:type="dxa"/>
+            </w:tcMar>
+            <w:tcBorders>
+              <w:top w:val="single" w:sz="4" w:color="D9D9D9"/>
+              <w:bottom w:val="single" w:sz="4" w:color="D9D9D9"/>
+              <w:left w:val="single" w:sz="4" w:color="D9D9D9"/>
+              <w:right w:val="single" w:sz="4" w:color="D9D9D9"/>
+            </w:tcBorders>
+          </w:tcPr>
+          <w:p>
+            <w:pPr>
+              <w:spacing w:after="20" w:line="240" w:lineRule="auto"/>
+            </w:pPr>
+            <w:r>
+              <w:rPr>
+                <w:rFonts w:ascii="Calibri" w:hAnsi="Calibri"/>
+                <w:b w:val="0"/>
+                <w:sz w:val="18"/>
+              </w:rPr>
+              <w:t>Process lifecycle and wait</w:t>
+            </w:r>
+          </w:p>
+        </w:tc>
+        <w:tc>
+          <w:tcPr>
+            <w:tcW w:type="dxa" w:w="5227"/>
+            <w:vAlign w:val="center"/>
+            <w:tcMar>
+              <w:top w:w="55" w:type="dxa"/>
+              <w:bottom w:w="55" w:type="dxa"/>
+              <w:left w:w="75" w:type="dxa"/>
+              <w:right w:w="75" w:type="dxa"/>
+            </w:tcMar>
+            <w:tcBorders>
+              <w:top w:val="single" w:sz="4" w:color="D9D9D9"/>
+              <w:bottom w:val="single" w:sz="4" w:color="D9D9D9"/>
+              <w:left w:val="single" w:sz="4" w:color="D9D9D9"/>
+              <w:right w:val="single" w:sz="4" w:color="D9D9D9"/>
+            </w:tcBorders>
+          </w:tcPr>
+          <w:p>
+            <w:pPr>
+              <w:spacing w:after="20" w:line="240" w:lineRule="auto"/>
+            </w:pPr>
+            <w:r>
+              <w:rPr>
+                <w:rFonts w:ascii="Calibri" w:hAnsi="Calibri"/>
+                <w:b w:val="0"/>
+                <w:sz w:val="18"/>
+              </w:rPr>
+              <w:t>Reap child and release locks before copying its exit status.</w:t>
+            </w:r>
+          </w:p>
+        </w:tc>
+      </w:tr>
+      <w:tr>
+        <w:trPr>
+          <w:cantSplit/>
+        </w:trPr>
+        <w:tc>
+          <w:tcPr>
+            <w:tcW w:type="dxa" w:w="2477"/>
+            <w:vAlign w:val="center"/>
+            <w:tcMar>
+              <w:top w:w="55" w:type="dxa"/>
+              <w:bottom w:w="55" w:type="dxa"/>
+              <w:left w:w="75" w:type="dxa"/>
+              <w:right w:w="75" w:type="dxa"/>
+            </w:tcMar>
+            <w:tcBorders>
+              <w:top w:val="single" w:sz="4" w:color="D9D9D9"/>
+              <w:bottom w:val="single" w:sz="4" w:color="D9D9D9"/>
+              <w:left w:val="single" w:sz="4" w:color="D9D9D9"/>
+              <w:right w:val="single" w:sz="4" w:color="D9D9D9"/>
+            </w:tcBorders>
+          </w:tcPr>
+          <w:p>
+            <w:pPr>
+              <w:spacing w:after="20" w:line="240" w:lineRule="auto"/>
+            </w:pPr>
+            <w:r>
+              <w:rPr>
+                <w:rFonts w:ascii="Calibri" w:hAnsi="Calibri"/>
+                <w:b w:val="0"/>
+                <w:sz w:val="18"/>
+              </w:rPr>
+              <w:t>kernel/pipe.c</w:t>
+            </w:r>
+          </w:p>
+        </w:tc>
+        <w:tc>
+          <w:tcPr>
+            <w:tcW w:type="dxa" w:w="2376"/>
+            <w:vAlign w:val="center"/>
+            <w:tcMar>
+              <w:top w:w="55" w:type="dxa"/>
+              <w:bottom w:w="55" w:type="dxa"/>
+              <w:left w:w="75" w:type="dxa"/>
+              <w:right w:w="75" w:type="dxa"/>
+            </w:tcMar>
+            <w:tcBorders>
+              <w:top w:val="single" w:sz="4" w:color="D9D9D9"/>
+              <w:bottom w:val="single" w:sz="4" w:color="D9D9D9"/>
+              <w:left w:val="single" w:sz="4" w:color="D9D9D9"/>
+              <w:right w:val="single" w:sz="4" w:color="D9D9D9"/>
+            </w:tcBorders>
+          </w:tcPr>
+          <w:p>
+            <w:pPr>
+              <w:spacing w:after="20" w:line="240" w:lineRule="auto"/>
+            </w:pPr>
+            <w:r>
+              <w:rPr>
+                <w:rFonts w:ascii="Calibri" w:hAnsi="Calibri"/>
+                <w:b w:val="0"/>
+                <w:sz w:val="18"/>
+              </w:rPr>
+              <w:t>Pipe I/O and buffering</w:t>
+            </w:r>
+          </w:p>
+        </w:tc>
+        <w:tc>
+          <w:tcPr>
+            <w:tcW w:type="dxa" w:w="5227"/>
+            <w:vAlign w:val="center"/>
+            <w:tcMar>
+              <w:top w:w="55" w:type="dxa"/>
+              <w:bottom w:w="55" w:type="dxa"/>
+              <w:left w:w="75" w:type="dxa"/>
+              <w:right w:w="75" w:type="dxa"/>
+            </w:tcMar>
+            <w:tcBorders>
+              <w:top w:val="single" w:sz="4" w:color="D9D9D9"/>
+              <w:bottom w:val="single" w:sz="4" w:color="D9D9D9"/>
+              <w:left w:val="single" w:sz="4" w:color="D9D9D9"/>
+              <w:right w:val="single" w:sz="4" w:color="D9D9D9"/>
+            </w:tcBorders>
+          </w:tcPr>
+          <w:p>
+            <w:pPr>
+              <w:spacing w:after="20" w:line="240" w:lineRule="auto"/>
+            </w:pPr>
+            <w:r>
+              <w:rPr>
+                <w:rFonts w:ascii="Calibri" w:hAnsi="Calibri"/>
+                <w:b w:val="0"/>
+                <w:sz w:val="18"/>
+              </w:rPr>
+              <w:t>Stage writes; perform user copies outside the pipe spinlock.</w:t>
+            </w:r>
+          </w:p>
+        </w:tc>
+      </w:tr>
+      <w:tr>
+        <w:trPr>
+          <w:cantSplit/>
+        </w:trPr>
+        <w:tc>
+          <w:tcPr>
+            <w:tcW w:type="dxa" w:w="2477"/>
+            <w:vAlign w:val="center"/>
+            <w:tcMar>
+              <w:top w:w="55" w:type="dxa"/>
+              <w:bottom w:w="55" w:type="dxa"/>
+              <w:left w:w="75" w:type="dxa"/>
+              <w:right w:w="75" w:type="dxa"/>
+            </w:tcMar>
+            <w:tcBorders>
+              <w:top w:val="single" w:sz="4" w:color="D9D9D9"/>
+              <w:bottom w:val="single" w:sz="4" w:color="D9D9D9"/>
+              <w:left w:val="single" w:sz="4" w:color="D9D9D9"/>
+              <w:right w:val="single" w:sz="4" w:color="D9D9D9"/>
+            </w:tcBorders>
+          </w:tcPr>
+          <w:p>
+            <w:pPr>
+              <w:spacing w:after="20" w:line="240" w:lineRule="auto"/>
+            </w:pPr>
+            <w:r>
+              <w:rPr>
+                <w:rFonts w:ascii="Calibri" w:hAnsi="Calibri"/>
+                <w:b w:val="0"/>
+                <w:sz w:val="18"/>
+              </w:rPr>
+              <w:t>kernel/sysfile.c</w:t>
+            </w:r>
+          </w:p>
+        </w:tc>
+        <w:tc>
+          <w:tcPr>
+            <w:tcW w:type="dxa" w:w="2376"/>
+            <w:vAlign w:val="center"/>
+            <w:tcMar>
+              <w:top w:w="55" w:type="dxa"/>
+              <w:bottom w:w="55" w:type="dxa"/>
+              <w:left w:w="75" w:type="dxa"/>
+              <w:right w:w="75" w:type="dxa"/>
+            </w:tcMar>
+            <w:tcBorders>
+              <w:top w:val="single" w:sz="4" w:color="D9D9D9"/>
+              <w:bottom w:val="single" w:sz="4" w:color="D9D9D9"/>
+              <w:left w:val="single" w:sz="4" w:color="D9D9D9"/>
+              <w:right w:val="single" w:sz="4" w:color="D9D9D9"/>
+            </w:tcBorders>
+          </w:tcPr>
+          <w:p>
+            <w:pPr>
+              <w:spacing w:after="20" w:line="240" w:lineRule="auto"/>
+            </w:pPr>
+            <w:r>
+              <w:rPr>
+                <w:rFonts w:ascii="Calibri" w:hAnsi="Calibri"/>
+                <w:b w:val="0"/>
+                <w:sz w:val="18"/>
+              </w:rPr>
+              <w:t>File read/write syscalls</w:t>
+            </w:r>
+          </w:p>
+        </w:tc>
+        <w:tc>
+          <w:tcPr>
+            <w:tcW w:type="dxa" w:w="5227"/>
+            <w:vAlign w:val="center"/>
+            <w:tcMar>
+              <w:top w:w="55" w:type="dxa"/>
+              <w:bottom w:w="55" w:type="dxa"/>
+              <w:left w:w="75" w:type="dxa"/>
+              <w:right w:w="75" w:type="dxa"/>
+            </w:tcMar>
+            <w:tcBorders>
+              <w:top w:val="single" w:sz="4" w:color="D9D9D9"/>
+              <w:bottom w:val="single" w:sz="4" w:color="D9D9D9"/>
+              <w:left w:val="single" w:sz="4" w:color="D9D9D9"/>
+              <w:right w:val="single" w:sz="4" w:color="D9D9D9"/>
+            </w:tcBorders>
+          </w:tcPr>
+          <w:p>
+            <w:pPr>
+              <w:spacing w:after="20" w:line="240" w:lineRule="auto"/>
+            </w:pPr>
+            <w:r>
+              <w:rPr>
+                <w:rFonts w:ascii="Calibri" w:hAnsi="Calibri"/>
+                <w:b w:val="0"/>
+                <w:sz w:val="18"/>
+              </w:rPr>
+              <w:t>Attempt prefault preparation of user buffers before file I/O.</w:t>
+            </w:r>
+          </w:p>
+        </w:tc>
+      </w:tr>
+      <w:tr>
+        <w:trPr>
+          <w:cantSplit/>
+        </w:trPr>
+        <w:tc>
+          <w:tcPr>
+            <w:tcW w:type="dxa" w:w="2477"/>
+            <w:vAlign w:val="center"/>
+            <w:tcMar>
+              <w:top w:w="55" w:type="dxa"/>
+              <w:bottom w:w="55" w:type="dxa"/>
+              <w:left w:w="75" w:type="dxa"/>
+              <w:right w:w="75" w:type="dxa"/>
+            </w:tcMar>
+            <w:tcBorders>
+              <w:top w:val="single" w:sz="4" w:color="D9D9D9"/>
+              <w:bottom w:val="single" w:sz="4" w:color="D9D9D9"/>
+              <w:left w:val="single" w:sz="4" w:color="D9D9D9"/>
+              <w:right w:val="single" w:sz="4" w:color="D9D9D9"/>
+            </w:tcBorders>
+          </w:tcPr>
+          <w:p>
+            <w:pPr>
+              <w:spacing w:after="20" w:line="240" w:lineRule="auto"/>
+            </w:pPr>
+            <w:r>
+              <w:rPr>
+                <w:rFonts w:ascii="Calibri" w:hAnsi="Calibri"/>
+                <w:b w:val="0"/>
+                <w:sz w:val="18"/>
+              </w:rPr>
+              <w:t>kernel/spinlock.c</w:t>
+            </w:r>
+          </w:p>
+        </w:tc>
+        <w:tc>
+          <w:tcPr>
+            <w:tcW w:type="dxa" w:w="2376"/>
+            <w:vAlign w:val="center"/>
+            <w:tcMar>
+              <w:top w:w="55" w:type="dxa"/>
+              <w:bottom w:w="55" w:type="dxa"/>
+              <w:left w:w="75" w:type="dxa"/>
+              <w:right w:w="75" w:type="dxa"/>
+            </w:tcMar>
+            <w:tcBorders>
+              <w:top w:val="single" w:sz="4" w:color="D9D9D9"/>
+              <w:bottom w:val="single" w:sz="4" w:color="D9D9D9"/>
+              <w:left w:val="single" w:sz="4" w:color="D9D9D9"/>
+              <w:right w:val="single" w:sz="4" w:color="D9D9D9"/>
+            </w:tcBorders>
+          </w:tcPr>
+          <w:p>
+            <w:pPr>
+              <w:spacing w:after="20" w:line="240" w:lineRule="auto"/>
+            </w:pPr>
+            <w:r>
+              <w:rPr>
+                <w:rFonts w:ascii="Calibri" w:hAnsi="Calibri"/>
+                <w:b w:val="0"/>
+                <w:sz w:val="18"/>
+              </w:rPr>
+              <w:t>Locks and interrupt nesting</w:t>
+            </w:r>
+          </w:p>
+        </w:tc>
+        <w:tc>
+          <w:tcPr>
+            <w:tcW w:type="dxa" w:w="5227"/>
+            <w:vAlign w:val="center"/>
+            <w:tcMar>
+              <w:top w:w="55" w:type="dxa"/>
+              <w:bottom w:w="55" w:type="dxa"/>
+              <w:left w:w="75" w:type="dxa"/>
+              <w:right w:w="75" w:type="dxa"/>
+            </w:tcMar>
+            <w:tcBorders>
+              <w:top w:val="single" w:sz="4" w:color="D9D9D9"/>
+              <w:bottom w:val="single" w:sz="4" w:color="D9D9D9"/>
+              <w:left w:val="single" w:sz="4" w:color="D9D9D9"/>
+              <w:right w:val="single" w:sz="4" w:color="D9D9D9"/>
+            </w:tcBorders>
+          </w:tcPr>
+          <w:p>
+            <w:pPr>
+              <w:spacing w:after="20" w:line="240" w:lineRule="auto"/>
+            </w:pPr>
+            <w:r>
+              <w:rPr>
+                <w:rFonts w:ascii="Calibri" w:hAnsi="Calibri"/>
+                <w:b w:val="0"/>
+                <w:sz w:val="18"/>
+              </w:rPr>
+              <w:t>Add nlocks_held to expose interrupt-disable nesting for reclaim checks.</w:t>
+            </w:r>
+          </w:p>
+        </w:tc>
+      </w:tr>
+      <w:tr>
+        <w:trPr>
+          <w:cantSplit/>
+        </w:trPr>
+        <w:tc>
+          <w:tcPr>
+            <w:tcW w:type="dxa" w:w="2477"/>
+            <w:vAlign w:val="center"/>
+            <w:tcMar>
+              <w:top w:w="55" w:type="dxa"/>
+              <w:bottom w:w="55" w:type="dxa"/>
+              <w:left w:w="75" w:type="dxa"/>
+              <w:right w:w="75" w:type="dxa"/>
+            </w:tcMar>
+            <w:tcBorders>
+              <w:top w:val="single" w:sz="4" w:color="D9D9D9"/>
+              <w:bottom w:val="single" w:sz="4" w:color="D9D9D9"/>
+              <w:left w:val="single" w:sz="4" w:color="D9D9D9"/>
+              <w:right w:val="single" w:sz="4" w:color="D9D9D9"/>
+            </w:tcBorders>
+          </w:tcPr>
+          <w:p>
+            <w:pPr>
+              <w:spacing w:after="20" w:line="240" w:lineRule="auto"/>
+            </w:pPr>
+            <w:r>
+              <w:rPr>
+                <w:rFonts w:ascii="Calibri" w:hAnsi="Calibri"/>
+                <w:b w:val="0"/>
+                <w:sz w:val="18"/>
+              </w:rPr>
+              <w:t>kernel/syscall.h</w:t>
+            </w:r>
+            <w:r>
+              <w:br/>
+            </w:r>
+            <w:r>
+              <w:rPr>
+                <w:rFonts w:ascii="Calibri" w:hAnsi="Calibri"/>
+                <w:b w:val="0"/>
+                <w:sz w:val="18"/>
+              </w:rPr>
+              <w:t>kernel/syscall.c</w:t>
+            </w:r>
+          </w:p>
+        </w:tc>
+        <w:tc>
+          <w:tcPr>
+            <w:tcW w:type="dxa" w:w="2376"/>
+            <w:vAlign w:val="center"/>
+            <w:tcMar>
+              <w:top w:w="55" w:type="dxa"/>
+              <w:bottom w:w="55" w:type="dxa"/>
+              <w:left w:w="75" w:type="dxa"/>
+              <w:right w:w="75" w:type="dxa"/>
+            </w:tcMar>
+            <w:tcBorders>
+              <w:top w:val="single" w:sz="4" w:color="D9D9D9"/>
+              <w:bottom w:val="single" w:sz="4" w:color="D9D9D9"/>
+              <w:left w:val="single" w:sz="4" w:color="D9D9D9"/>
+              <w:right w:val="single" w:sz="4" w:color="D9D9D9"/>
+            </w:tcBorders>
+          </w:tcPr>
+          <w:p>
+            <w:pPr>
+              <w:spacing w:after="20" w:line="240" w:lineRule="auto"/>
+            </w:pPr>
+            <w:r>
+              <w:rPr>
+                <w:rFonts w:ascii="Calibri" w:hAnsi="Calibri"/>
+                <w:b w:val="0"/>
+                <w:sz w:val="18"/>
+              </w:rPr>
+              <w:t>Syscall numbers and dispatch</w:t>
+            </w:r>
+          </w:p>
+        </w:tc>
+        <w:tc>
+          <w:tcPr>
+            <w:tcW w:type="dxa" w:w="5227"/>
+            <w:vAlign w:val="center"/>
+            <w:tcMar>
+              <w:top w:w="55" w:type="dxa"/>
+              <w:bottom w:w="55" w:type="dxa"/>
+              <w:left w:w="75" w:type="dxa"/>
+              <w:right w:w="75" w:type="dxa"/>
+            </w:tcMar>
+            <w:tcBorders>
+              <w:top w:val="single" w:sz="4" w:color="D9D9D9"/>
+              <w:bottom w:val="single" w:sz="4" w:color="D9D9D9"/>
+              <w:left w:val="single" w:sz="4" w:color="D9D9D9"/>
+              <w:right w:val="single" w:sz="4" w:color="D9D9D9"/>
+            </w:tcBorders>
+          </w:tcPr>
+          <w:p>
+            <w:pPr>
+              <w:spacing w:after="20" w:line="240" w:lineRule="auto"/>
+            </w:pPr>
+            <w:r>
+              <w:rPr>
+                <w:rFonts w:ascii="Calibri" w:hAnsi="Calibri"/>
+                <w:b w:val="0"/>
+                <w:sz w:val="18"/>
+              </w:rPr>
+              <w:t>Define syscall 22 and dispatch it to sys_memstat.</w:t>
+            </w:r>
+          </w:p>
+        </w:tc>
+      </w:tr>
+      <w:tr>
+        <w:trPr>
+          <w:cantSplit/>
+        </w:trPr>
+        <w:tc>
+          <w:tcPr>
+            <w:tcW w:type="dxa" w:w="2477"/>
+            <w:vAlign w:val="center"/>
+            <w:tcMar>
+              <w:top w:w="55" w:type="dxa"/>
+              <w:bottom w:w="55" w:type="dxa"/>
+              <w:left w:w="75" w:type="dxa"/>
+              <w:right w:w="75" w:type="dxa"/>
+            </w:tcMar>
+            <w:tcBorders>
+              <w:top w:val="single" w:sz="4" w:color="D9D9D9"/>
+              <w:bottom w:val="single" w:sz="4" w:color="D9D9D9"/>
+              <w:left w:val="single" w:sz="4" w:color="D9D9D9"/>
+              <w:right w:val="single" w:sz="4" w:color="D9D9D9"/>
+            </w:tcBorders>
+          </w:tcPr>
+          <w:p>
+            <w:pPr>
+              <w:spacing w:after="20" w:line="240" w:lineRule="auto"/>
+            </w:pPr>
+            <w:r>
+              <w:rPr>
+                <w:rFonts w:ascii="Calibri" w:hAnsi="Calibri"/>
+                <w:b w:val="0"/>
+                <w:sz w:val="18"/>
+              </w:rPr>
+              <w:t>user/user.h</w:t>
+            </w:r>
+            <w:r>
+              <w:br/>
+            </w:r>
+            <w:r>
+              <w:rPr>
+                <w:rFonts w:ascii="Calibri" w:hAnsi="Calibri"/>
+                <w:b w:val="0"/>
+                <w:sz w:val="18"/>
+              </w:rPr>
+              <w:t>user/usys.pl</w:t>
+            </w:r>
+          </w:p>
+        </w:tc>
+        <w:tc>
+          <w:tcPr>
+            <w:tcW w:type="dxa" w:w="2376"/>
+            <w:vAlign w:val="center"/>
+            <w:tcMar>
+              <w:top w:w="55" w:type="dxa"/>
+              <w:bottom w:w="55" w:type="dxa"/>
+              <w:left w:w="75" w:type="dxa"/>
+              <w:right w:w="75" w:type="dxa"/>
+            </w:tcMar>
+            <w:tcBorders>
+              <w:top w:val="single" w:sz="4" w:color="D9D9D9"/>
+              <w:bottom w:val="single" w:sz="4" w:color="D9D9D9"/>
+              <w:left w:val="single" w:sz="4" w:color="D9D9D9"/>
+              <w:right w:val="single" w:sz="4" w:color="D9D9D9"/>
+            </w:tcBorders>
+          </w:tcPr>
+          <w:p>
+            <w:pPr>
+              <w:spacing w:after="20" w:line="240" w:lineRule="auto"/>
+            </w:pPr>
+            <w:r>
+              <w:rPr>
+                <w:rFonts w:ascii="Calibri" w:hAnsi="Calibri"/>
+                <w:b w:val="0"/>
+                <w:sz w:val="18"/>
+              </w:rPr>
+              <w:t>User API and stub generator</w:t>
+            </w:r>
+          </w:p>
+        </w:tc>
+        <w:tc>
+          <w:tcPr>
+            <w:tcW w:type="dxa" w:w="5227"/>
+            <w:vAlign w:val="center"/>
+            <w:tcMar>
+              <w:top w:w="55" w:type="dxa"/>
+              <w:bottom w:w="55" w:type="dxa"/>
+              <w:left w:w="75" w:type="dxa"/>
+              <w:right w:w="75" w:type="dxa"/>
+            </w:tcMar>
+            <w:tcBorders>
+              <w:top w:val="single" w:sz="4" w:color="D9D9D9"/>
+              <w:bottom w:val="single" w:sz="4" w:color="D9D9D9"/>
+              <w:left w:val="single" w:sz="4" w:color="D9D9D9"/>
+              <w:right w:val="single" w:sz="4" w:color="D9D9D9"/>
+            </w:tcBorders>
+          </w:tcPr>
+          <w:p>
+            <w:pPr>
+              <w:spacing w:after="20" w:line="240" w:lineRule="auto"/>
+            </w:pPr>
+            <w:r>
+              <w:rPr>
+                <w:rFonts w:ascii="Calibri" w:hAnsi="Calibri"/>
+                <w:b w:val="0"/>
+                <w:sz w:val="18"/>
+              </w:rPr>
+              <w:t>Declare memstat and generate its user syscall stub.</w:t>
             </w:r>
           </w:p>
         </w:tc>
@@ -3955,18 +5105,878 @@
       <w:pPr>
         <w:spacing w:after="40" w:line="20" w:lineRule="exact"/>
       </w:pPr>
-    </w:p>
-    <w:p>
       <w:r>
-        <w:t>We added seven workload/test files and one monitoring command. user/usertests.c is inherited, not created by us, and is unchanged between v0.0 and v0.4. Makefile UPROGS entries compile and place the new commands in fs.img.</w:t>
+        <w:rPr>
+          <w:rFonts w:ascii="Calibri" w:hAnsi="Calibri"/>
+          <w:b w:val="0"/>
+          <w:sz w:val="19"/>
+        </w:rPr>
       </w:r>
     </w:p>
     <w:p>
       <w:pPr>
-        <w:pStyle w:val="Heading2"/>
+        <w:spacing w:after="60" w:line="240" w:lineRule="auto"/>
       </w:pPr>
       <w:r>
-        <w:t>Resources and where they were used</w:t>
+        <w:rPr>
+          <w:rFonts w:ascii="Calibri" w:hAnsi="Calibri"/>
+          <w:b/>
+          <w:sz w:val="20"/>
+        </w:rPr>
+        <w:t>Files we created and what each test checks</w:t>
+      </w:r>
+    </w:p>
+    <w:tbl>
+      <w:tblPr>
+        <w:tblW w:type="dxa" w:w="10080"/>
+        <w:jc w:val="center"/>
+        <w:tblLayout w:type="fixed"/>
+        <w:tblLook w:firstColumn="1" w:firstRow="1" w:lastColumn="0" w:lastRow="0" w:noHBand="0" w:noVBand="1" w:val="04A0"/>
+      </w:tblPr>
+      <w:tblGrid>
+        <w:gridCol w:w="2477"/>
+        <w:gridCol w:w="7603"/>
+      </w:tblGrid>
+      <w:tr>
+        <w:trPr>
+          <w:cantSplit/>
+          <w:tblHeader/>
+        </w:trPr>
+        <w:tc>
+          <w:tcPr>
+            <w:tcW w:type="dxa" w:w="2477"/>
+            <w:vAlign w:val="center"/>
+            <w:tcMar>
+              <w:top w:w="55" w:type="dxa"/>
+              <w:bottom w:w="55" w:type="dxa"/>
+              <w:left w:w="75" w:type="dxa"/>
+              <w:right w:w="75" w:type="dxa"/>
+            </w:tcMar>
+            <w:tcBorders>
+              <w:top w:val="single" w:sz="4" w:color="D9D9D9"/>
+              <w:bottom w:val="single" w:sz="4" w:color="D9D9D9"/>
+              <w:left w:val="single" w:sz="4" w:color="D9D9D9"/>
+              <w:right w:val="single" w:sz="4" w:color="D9D9D9"/>
+            </w:tcBorders>
+            <w:shd w:fill="EAF0F5"/>
+          </w:tcPr>
+          <w:p>
+            <w:pPr>
+              <w:spacing w:after="20" w:line="240" w:lineRule="auto"/>
+            </w:pPr>
+            <w:r>
+              <w:rPr>
+                <w:rFonts w:ascii="Calibri" w:hAnsi="Calibri"/>
+                <w:b/>
+                <w:sz w:val="18"/>
+              </w:rPr>
+              <w:t>New file</w:t>
+            </w:r>
+          </w:p>
+        </w:tc>
+        <w:tc>
+          <w:tcPr>
+            <w:tcW w:type="dxa" w:w="7603"/>
+            <w:vAlign w:val="center"/>
+            <w:tcMar>
+              <w:top w:w="55" w:type="dxa"/>
+              <w:bottom w:w="55" w:type="dxa"/>
+              <w:left w:w="75" w:type="dxa"/>
+              <w:right w:w="75" w:type="dxa"/>
+            </w:tcMar>
+            <w:tcBorders>
+              <w:top w:val="single" w:sz="4" w:color="D9D9D9"/>
+              <w:bottom w:val="single" w:sz="4" w:color="D9D9D9"/>
+              <w:left w:val="single" w:sz="4" w:color="D9D9D9"/>
+              <w:right w:val="single" w:sz="4" w:color="D9D9D9"/>
+            </w:tcBorders>
+            <w:shd w:fill="EAF0F5"/>
+          </w:tcPr>
+          <w:p>
+            <w:pPr>
+              <w:spacing w:after="20" w:line="240" w:lineRule="auto"/>
+            </w:pPr>
+            <w:r>
+              <w:rPr>
+                <w:rFonts w:ascii="Calibri" w:hAnsi="Calibri"/>
+                <w:b/>
+                <w:sz w:val="18"/>
+              </w:rPr>
+              <w:t>Added code or test purpose</w:t>
+            </w:r>
+          </w:p>
+        </w:tc>
+      </w:tr>
+      <w:tr>
+        <w:trPr>
+          <w:cantSplit/>
+        </w:trPr>
+        <w:tc>
+          <w:tcPr>
+            <w:tcW w:type="dxa" w:w="2477"/>
+            <w:vAlign w:val="center"/>
+            <w:tcMar>
+              <w:top w:w="55" w:type="dxa"/>
+              <w:bottom w:w="55" w:type="dxa"/>
+              <w:left w:w="75" w:type="dxa"/>
+              <w:right w:w="75" w:type="dxa"/>
+            </w:tcMar>
+            <w:tcBorders>
+              <w:top w:val="single" w:sz="4" w:color="D9D9D9"/>
+              <w:bottom w:val="single" w:sz="4" w:color="D9D9D9"/>
+              <w:left w:val="single" w:sz="4" w:color="D9D9D9"/>
+              <w:right w:val="single" w:sz="4" w:color="D9D9D9"/>
+            </w:tcBorders>
+          </w:tcPr>
+          <w:p>
+            <w:pPr>
+              <w:spacing w:after="20" w:line="240" w:lineRule="auto"/>
+            </w:pPr>
+            <w:r>
+              <w:rPr>
+                <w:rFonts w:ascii="Calibri" w:hAnsi="Calibri"/>
+                <w:b w:val="0"/>
+                <w:sz w:val="18"/>
+              </w:rPr>
+              <w:t>kernel/pgfault.c</w:t>
+            </w:r>
+          </w:p>
+        </w:tc>
+        <w:tc>
+          <w:tcPr>
+            <w:tcW w:type="dxa" w:w="7603"/>
+            <w:vAlign w:val="center"/>
+            <w:tcMar>
+              <w:top w:w="55" w:type="dxa"/>
+              <w:bottom w:w="55" w:type="dxa"/>
+              <w:left w:w="75" w:type="dxa"/>
+              <w:right w:w="75" w:type="dxa"/>
+            </w:tcMar>
+            <w:tcBorders>
+              <w:top w:val="single" w:sz="4" w:color="D9D9D9"/>
+              <w:bottom w:val="single" w:sz="4" w:color="D9D9D9"/>
+              <w:left w:val="single" w:sz="4" w:color="D9D9D9"/>
+              <w:right w:val="single" w:sz="4" w:color="D9D9D9"/>
+            </w:tcBorders>
+          </w:tcPr>
+          <w:p>
+            <w:pPr>
+              <w:spacing w:after="20" w:line="240" w:lineRule="auto"/>
+            </w:pPr>
+            <w:r>
+              <w:rPr>
+                <w:rFonts w:ascii="Calibri" w:hAnsi="Calibri"/>
+                <w:b w:val="0"/>
+                <w:sz w:val="18"/>
+              </w:rPr>
+              <w:t>New lazy page-fault recovery helper at v0.1; later extended below.</w:t>
+            </w:r>
+          </w:p>
+        </w:tc>
+      </w:tr>
+      <w:tr>
+        <w:trPr>
+          <w:cantSplit/>
+        </w:trPr>
+        <w:tc>
+          <w:tcPr>
+            <w:tcW w:type="dxa" w:w="2477"/>
+            <w:vAlign w:val="center"/>
+            <w:tcMar>
+              <w:top w:w="55" w:type="dxa"/>
+              <w:bottom w:w="55" w:type="dxa"/>
+              <w:left w:w="75" w:type="dxa"/>
+              <w:right w:w="75" w:type="dxa"/>
+            </w:tcMar>
+            <w:tcBorders>
+              <w:top w:val="single" w:sz="4" w:color="D9D9D9"/>
+              <w:bottom w:val="single" w:sz="4" w:color="D9D9D9"/>
+              <w:left w:val="single" w:sz="4" w:color="D9D9D9"/>
+              <w:right w:val="single" w:sz="4" w:color="D9D9D9"/>
+            </w:tcBorders>
+          </w:tcPr>
+          <w:p>
+            <w:pPr>
+              <w:spacing w:after="20" w:line="240" w:lineRule="auto"/>
+            </w:pPr>
+            <w:r>
+              <w:rPr>
+                <w:rFonts w:ascii="Calibri" w:hAnsi="Calibri"/>
+                <w:b w:val="0"/>
+                <w:sz w:val="18"/>
+              </w:rPr>
+              <w:t>kernel/swap.c</w:t>
+            </w:r>
+          </w:p>
+        </w:tc>
+        <w:tc>
+          <w:tcPr>
+            <w:tcW w:type="dxa" w:w="7603"/>
+            <w:vAlign w:val="center"/>
+            <w:tcMar>
+              <w:top w:w="55" w:type="dxa"/>
+              <w:bottom w:w="55" w:type="dxa"/>
+              <w:left w:w="75" w:type="dxa"/>
+              <w:right w:w="75" w:type="dxa"/>
+            </w:tcMar>
+            <w:tcBorders>
+              <w:top w:val="single" w:sz="4" w:color="D9D9D9"/>
+              <w:bottom w:val="single" w:sz="4" w:color="D9D9D9"/>
+              <w:left w:val="single" w:sz="4" w:color="D9D9D9"/>
+              <w:right w:val="single" w:sz="4" w:color="D9D9D9"/>
+            </w:tcBorders>
+          </w:tcPr>
+          <w:p>
+            <w:pPr>
+              <w:spacing w:after="20" w:line="240" w:lineRule="auto"/>
+            </w:pPr>
+            <w:r>
+              <w:rPr>
+                <w:rFonts w:ascii="Calibri" w:hAnsi="Calibri"/>
+                <w:b w:val="0"/>
+                <w:sz w:val="18"/>
+              </w:rPr>
+              <w:t>New statistics stub at v0.3; later extended below.</w:t>
+            </w:r>
+          </w:p>
+        </w:tc>
+      </w:tr>
+      <w:tr>
+        <w:trPr>
+          <w:cantSplit/>
+        </w:trPr>
+        <w:tc>
+          <w:tcPr>
+            <w:tcW w:type="dxa" w:w="2477"/>
+            <w:vAlign w:val="center"/>
+            <w:tcMar>
+              <w:top w:w="55" w:type="dxa"/>
+              <w:bottom w:w="55" w:type="dxa"/>
+              <w:left w:w="75" w:type="dxa"/>
+              <w:right w:w="75" w:type="dxa"/>
+            </w:tcMar>
+            <w:tcBorders>
+              <w:top w:val="single" w:sz="4" w:color="D9D9D9"/>
+              <w:bottom w:val="single" w:sz="4" w:color="D9D9D9"/>
+              <w:left w:val="single" w:sz="4" w:color="D9D9D9"/>
+              <w:right w:val="single" w:sz="4" w:color="D9D9D9"/>
+            </w:tcBorders>
+          </w:tcPr>
+          <w:p>
+            <w:pPr>
+              <w:spacing w:after="20" w:line="240" w:lineRule="auto"/>
+            </w:pPr>
+            <w:r>
+              <w:rPr>
+                <w:rFonts w:ascii="Calibri" w:hAnsi="Calibri"/>
+                <w:b w:val="0"/>
+                <w:sz w:val="18"/>
+              </w:rPr>
+              <w:t>kernel/memstat.h</w:t>
+            </w:r>
+          </w:p>
+        </w:tc>
+        <w:tc>
+          <w:tcPr>
+            <w:tcW w:type="dxa" w:w="7603"/>
+            <w:vAlign w:val="center"/>
+            <w:tcMar>
+              <w:top w:w="55" w:type="dxa"/>
+              <w:bottom w:w="55" w:type="dxa"/>
+              <w:left w:w="75" w:type="dxa"/>
+              <w:right w:w="75" w:type="dxa"/>
+            </w:tcMar>
+            <w:tcBorders>
+              <w:top w:val="single" w:sz="4" w:color="D9D9D9"/>
+              <w:bottom w:val="single" w:sz="4" w:color="D9D9D9"/>
+              <w:left w:val="single" w:sz="4" w:color="D9D9D9"/>
+              <w:right w:val="single" w:sz="4" w:color="D9D9D9"/>
+            </w:tcBorders>
+          </w:tcPr>
+          <w:p>
+            <w:pPr>
+              <w:spacing w:after="20" w:line="240" w:lineRule="auto"/>
+            </w:pPr>
+            <w:r>
+              <w:rPr>
+                <w:rFonts w:ascii="Calibri" w:hAnsi="Calibri"/>
+                <w:b w:val="0"/>
+                <w:sz w:val="18"/>
+              </w:rPr>
+              <w:t>New shared structure containing seven memory-statistics fields.</w:t>
+            </w:r>
+          </w:p>
+        </w:tc>
+      </w:tr>
+      <w:tr>
+        <w:trPr>
+          <w:cantSplit/>
+        </w:trPr>
+        <w:tc>
+          <w:tcPr>
+            <w:tcW w:type="dxa" w:w="2477"/>
+            <w:vAlign w:val="center"/>
+            <w:tcMar>
+              <w:top w:w="55" w:type="dxa"/>
+              <w:bottom w:w="55" w:type="dxa"/>
+              <w:left w:w="75" w:type="dxa"/>
+              <w:right w:w="75" w:type="dxa"/>
+            </w:tcMar>
+            <w:tcBorders>
+              <w:top w:val="single" w:sz="4" w:color="D9D9D9"/>
+              <w:bottom w:val="single" w:sz="4" w:color="D9D9D9"/>
+              <w:left w:val="single" w:sz="4" w:color="D9D9D9"/>
+              <w:right w:val="single" w:sz="4" w:color="D9D9D9"/>
+            </w:tcBorders>
+          </w:tcPr>
+          <w:p>
+            <w:pPr>
+              <w:spacing w:after="20" w:line="240" w:lineRule="auto"/>
+            </w:pPr>
+            <w:r>
+              <w:rPr>
+                <w:rFonts w:ascii="Calibri" w:hAnsi="Calibri"/>
+                <w:b w:val="0"/>
+                <w:sz w:val="18"/>
+              </w:rPr>
+              <w:t>user/baseline.c</w:t>
+            </w:r>
+          </w:p>
+        </w:tc>
+        <w:tc>
+          <w:tcPr>
+            <w:tcW w:type="dxa" w:w="7603"/>
+            <w:vAlign w:val="center"/>
+            <w:tcMar>
+              <w:top w:w="55" w:type="dxa"/>
+              <w:bottom w:w="55" w:type="dxa"/>
+              <w:left w:w="75" w:type="dxa"/>
+              <w:right w:w="75" w:type="dxa"/>
+            </w:tcMar>
+            <w:tcBorders>
+              <w:top w:val="single" w:sz="4" w:color="D9D9D9"/>
+              <w:bottom w:val="single" w:sz="4" w:color="D9D9D9"/>
+              <w:left w:val="single" w:sz="4" w:color="D9D9D9"/>
+              <w:right w:val="single" w:sz="4" w:color="D9D9D9"/>
+            </w:tcBorders>
+          </w:tcPr>
+          <w:p>
+            <w:pPr>
+              <w:spacing w:after="20" w:line="240" w:lineRule="auto"/>
+            </w:pPr>
+            <w:r>
+              <w:rPr>
+                <w:rFonts w:ascii="Calibri" w:hAnsi="Calibri"/>
+                <w:b w:val="0"/>
+                <w:sz w:val="18"/>
+              </w:rPr>
+              <w:t>Tests acceptance of a 200 MiB sbrk reservation, without populating it.</w:t>
+            </w:r>
+          </w:p>
+        </w:tc>
+      </w:tr>
+      <w:tr>
+        <w:trPr>
+          <w:cantSplit/>
+        </w:trPr>
+        <w:tc>
+          <w:tcPr>
+            <w:tcW w:type="dxa" w:w="2477"/>
+            <w:vAlign w:val="center"/>
+            <w:tcMar>
+              <w:top w:w="55" w:type="dxa"/>
+              <w:bottom w:w="55" w:type="dxa"/>
+              <w:left w:w="75" w:type="dxa"/>
+              <w:right w:w="75" w:type="dxa"/>
+            </w:tcMar>
+            <w:tcBorders>
+              <w:top w:val="single" w:sz="4" w:color="D9D9D9"/>
+              <w:bottom w:val="single" w:sz="4" w:color="D9D9D9"/>
+              <w:left w:val="single" w:sz="4" w:color="D9D9D9"/>
+              <w:right w:val="single" w:sz="4" w:color="D9D9D9"/>
+            </w:tcBorders>
+          </w:tcPr>
+          <w:p>
+            <w:pPr>
+              <w:spacing w:after="20" w:line="240" w:lineRule="auto"/>
+            </w:pPr>
+            <w:r>
+              <w:rPr>
+                <w:rFonts w:ascii="Calibri" w:hAnsi="Calibri"/>
+                <w:b w:val="0"/>
+                <w:sz w:val="18"/>
+              </w:rPr>
+              <w:t>user/lazytest.c</w:t>
+            </w:r>
+          </w:p>
+        </w:tc>
+        <w:tc>
+          <w:tcPr>
+            <w:tcW w:type="dxa" w:w="7603"/>
+            <w:vAlign w:val="center"/>
+            <w:tcMar>
+              <w:top w:w="55" w:type="dxa"/>
+              <w:bottom w:w="55" w:type="dxa"/>
+              <w:left w:w="75" w:type="dxa"/>
+              <w:right w:w="75" w:type="dxa"/>
+            </w:tcMar>
+            <w:tcBorders>
+              <w:top w:val="single" w:sz="4" w:color="D9D9D9"/>
+              <w:bottom w:val="single" w:sz="4" w:color="D9D9D9"/>
+              <w:left w:val="single" w:sz="4" w:color="D9D9D9"/>
+              <w:right w:val="single" w:sz="4" w:color="D9D9D9"/>
+            </w:tcBorders>
+          </w:tcPr>
+          <w:p>
+            <w:pPr>
+              <w:spacing w:after="20" w:line="240" w:lineRule="auto"/>
+            </w:pPr>
+            <w:r>
+              <w:rPr>
+                <w:rFonts w:ascii="Calibri" w:hAnsi="Calibri"/>
+                <w:b w:val="0"/>
+                <w:sz w:val="18"/>
+              </w:rPr>
+              <w:t>Tests sparse writes/reads in 256 MiB, zero fill and an untouched syscall buffer.</w:t>
+            </w:r>
+          </w:p>
+        </w:tc>
+      </w:tr>
+      <w:tr>
+        <w:trPr>
+          <w:cantSplit/>
+        </w:trPr>
+        <w:tc>
+          <w:tcPr>
+            <w:tcW w:type="dxa" w:w="2477"/>
+            <w:vAlign w:val="center"/>
+            <w:tcMar>
+              <w:top w:w="55" w:type="dxa"/>
+              <w:bottom w:w="55" w:type="dxa"/>
+              <w:left w:w="75" w:type="dxa"/>
+              <w:right w:w="75" w:type="dxa"/>
+            </w:tcMar>
+            <w:tcBorders>
+              <w:top w:val="single" w:sz="4" w:color="D9D9D9"/>
+              <w:bottom w:val="single" w:sz="4" w:color="D9D9D9"/>
+              <w:left w:val="single" w:sz="4" w:color="D9D9D9"/>
+              <w:right w:val="single" w:sz="4" w:color="D9D9D9"/>
+            </w:tcBorders>
+          </w:tcPr>
+          <w:p>
+            <w:pPr>
+              <w:spacing w:after="20" w:line="240" w:lineRule="auto"/>
+            </w:pPr>
+            <w:r>
+              <w:rPr>
+                <w:rFonts w:ascii="Calibri" w:hAnsi="Calibri"/>
+                <w:b w:val="0"/>
+                <w:sz w:val="18"/>
+              </w:rPr>
+              <w:t>user/cowtest.c</w:t>
+            </w:r>
+          </w:p>
+        </w:tc>
+        <w:tc>
+          <w:tcPr>
+            <w:tcW w:type="dxa" w:w="7603"/>
+            <w:vAlign w:val="center"/>
+            <w:tcMar>
+              <w:top w:w="55" w:type="dxa"/>
+              <w:bottom w:w="55" w:type="dxa"/>
+              <w:left w:w="75" w:type="dxa"/>
+              <w:right w:w="75" w:type="dxa"/>
+            </w:tcMar>
+            <w:tcBorders>
+              <w:top w:val="single" w:sz="4" w:color="D9D9D9"/>
+              <w:bottom w:val="single" w:sz="4" w:color="D9D9D9"/>
+              <w:left w:val="single" w:sz="4" w:color="D9D9D9"/>
+              <w:right w:val="single" w:sz="4" w:color="D9D9D9"/>
+            </w:tcBorders>
+          </w:tcPr>
+          <w:p>
+            <w:pPr>
+              <w:spacing w:after="20" w:line="240" w:lineRule="auto"/>
+            </w:pPr>
+            <w:r>
+              <w:rPr>
+                <w:rFonts w:ascii="Calibri" w:hAnsi="Calibri"/>
+                <w:b w:val="0"/>
+                <w:sz w:val="18"/>
+              </w:rPr>
+              <w:t>Tests 80 MiB fork capacity, inherited contents and parent/child isolation.</w:t>
+            </w:r>
+          </w:p>
+        </w:tc>
+      </w:tr>
+      <w:tr>
+        <w:trPr>
+          <w:cantSplit/>
+        </w:trPr>
+        <w:tc>
+          <w:tcPr>
+            <w:tcW w:type="dxa" w:w="2477"/>
+            <w:vAlign w:val="center"/>
+            <w:tcMar>
+              <w:top w:w="55" w:type="dxa"/>
+              <w:bottom w:w="55" w:type="dxa"/>
+              <w:left w:w="75" w:type="dxa"/>
+              <w:right w:w="75" w:type="dxa"/>
+            </w:tcMar>
+            <w:tcBorders>
+              <w:top w:val="single" w:sz="4" w:color="D9D9D9"/>
+              <w:bottom w:val="single" w:sz="4" w:color="D9D9D9"/>
+              <w:left w:val="single" w:sz="4" w:color="D9D9D9"/>
+              <w:right w:val="single" w:sz="4" w:color="D9D9D9"/>
+            </w:tcBorders>
+          </w:tcPr>
+          <w:p>
+            <w:pPr>
+              <w:spacing w:after="20" w:line="240" w:lineRule="auto"/>
+            </w:pPr>
+            <w:r>
+              <w:rPr>
+                <w:rFonts w:ascii="Calibri" w:hAnsi="Calibri"/>
+                <w:b w:val="0"/>
+                <w:sz w:val="18"/>
+              </w:rPr>
+              <w:t>user/forkbench.c</w:t>
+            </w:r>
+          </w:p>
+        </w:tc>
+        <w:tc>
+          <w:tcPr>
+            <w:tcW w:type="dxa" w:w="7603"/>
+            <w:vAlign w:val="center"/>
+            <w:tcMar>
+              <w:top w:w="55" w:type="dxa"/>
+              <w:bottom w:w="55" w:type="dxa"/>
+              <w:left w:w="75" w:type="dxa"/>
+              <w:right w:w="75" w:type="dxa"/>
+            </w:tcMar>
+            <w:tcBorders>
+              <w:top w:val="single" w:sz="4" w:color="D9D9D9"/>
+              <w:bottom w:val="single" w:sz="4" w:color="D9D9D9"/>
+              <w:left w:val="single" w:sz="4" w:color="D9D9D9"/>
+              <w:right w:val="single" w:sz="4" w:color="D9D9D9"/>
+            </w:tcBorders>
+          </w:tcPr>
+          <w:p>
+            <w:pPr>
+              <w:spacing w:after="20" w:line="240" w:lineRule="auto"/>
+            </w:pPr>
+            <w:r>
+              <w:rPr>
+                <w:rFonts w:ascii="Calibri" w:hAnsi="Calibri"/>
+                <w:b w:val="0"/>
+                <w:sz w:val="18"/>
+              </w:rPr>
+              <w:t>Times 50 sequential fork/exit/wait cycles of a touched 20 MiB process.</w:t>
+            </w:r>
+          </w:p>
+        </w:tc>
+      </w:tr>
+      <w:tr>
+        <w:trPr>
+          <w:cantSplit/>
+        </w:trPr>
+        <w:tc>
+          <w:tcPr>
+            <w:tcW w:type="dxa" w:w="2477"/>
+            <w:vAlign w:val="center"/>
+            <w:tcMar>
+              <w:top w:w="55" w:type="dxa"/>
+              <w:bottom w:w="55" w:type="dxa"/>
+              <w:left w:w="75" w:type="dxa"/>
+              <w:right w:w="75" w:type="dxa"/>
+            </w:tcMar>
+            <w:tcBorders>
+              <w:top w:val="single" w:sz="4" w:color="D9D9D9"/>
+              <w:bottom w:val="single" w:sz="4" w:color="D9D9D9"/>
+              <w:left w:val="single" w:sz="4" w:color="D9D9D9"/>
+              <w:right w:val="single" w:sz="4" w:color="D9D9D9"/>
+            </w:tcBorders>
+          </w:tcPr>
+          <w:p>
+            <w:pPr>
+              <w:spacing w:after="20" w:line="240" w:lineRule="auto"/>
+            </w:pPr>
+            <w:r>
+              <w:rPr>
+                <w:rFonts w:ascii="Calibri" w:hAnsi="Calibri"/>
+                <w:b w:val="0"/>
+                <w:sz w:val="18"/>
+              </w:rPr>
+              <w:t>user/memhog.c</w:t>
+            </w:r>
+          </w:p>
+        </w:tc>
+        <w:tc>
+          <w:tcPr>
+            <w:tcW w:type="dxa" w:w="7603"/>
+            <w:vAlign w:val="center"/>
+            <w:tcMar>
+              <w:top w:w="55" w:type="dxa"/>
+              <w:bottom w:w="55" w:type="dxa"/>
+              <w:left w:w="75" w:type="dxa"/>
+              <w:right w:w="75" w:type="dxa"/>
+            </w:tcMar>
+            <w:tcBorders>
+              <w:top w:val="single" w:sz="4" w:color="D9D9D9"/>
+              <w:bottom w:val="single" w:sz="4" w:color="D9D9D9"/>
+              <w:left w:val="single" w:sz="4" w:color="D9D9D9"/>
+              <w:right w:val="single" w:sz="4" w:color="D9D9D9"/>
+            </w:tcBorders>
+          </w:tcPr>
+          <w:p>
+            <w:pPr>
+              <w:spacing w:after="20" w:line="240" w:lineRule="auto"/>
+            </w:pPr>
+            <w:r>
+              <w:rPr>
+                <w:rFonts w:ascii="Calibri" w:hAnsi="Calibri"/>
+                <w:b w:val="0"/>
+                <w:sz w:val="18"/>
+              </w:rPr>
+              <w:t>Tests pressure and first/last byte per page; reports child status and swap counts.</w:t>
+            </w:r>
+          </w:p>
+        </w:tc>
+      </w:tr>
+      <w:tr>
+        <w:trPr>
+          <w:cantSplit/>
+        </w:trPr>
+        <w:tc>
+          <w:tcPr>
+            <w:tcW w:type="dxa" w:w="2477"/>
+            <w:vAlign w:val="center"/>
+            <w:tcMar>
+              <w:top w:w="55" w:type="dxa"/>
+              <w:bottom w:w="55" w:type="dxa"/>
+              <w:left w:w="75" w:type="dxa"/>
+              <w:right w:w="75" w:type="dxa"/>
+            </w:tcMar>
+            <w:tcBorders>
+              <w:top w:val="single" w:sz="4" w:color="D9D9D9"/>
+              <w:bottom w:val="single" w:sz="4" w:color="D9D9D9"/>
+              <w:left w:val="single" w:sz="4" w:color="D9D9D9"/>
+              <w:right w:val="single" w:sz="4" w:color="D9D9D9"/>
+            </w:tcBorders>
+          </w:tcPr>
+          <w:p>
+            <w:pPr>
+              <w:spacing w:after="20" w:line="240" w:lineRule="auto"/>
+            </w:pPr>
+            <w:r>
+              <w:rPr>
+                <w:rFonts w:ascii="Calibri" w:hAnsi="Calibri"/>
+                <w:b w:val="0"/>
+                <w:sz w:val="18"/>
+              </w:rPr>
+              <w:t>user/swapfork.c</w:t>
+            </w:r>
+          </w:p>
+        </w:tc>
+        <w:tc>
+          <w:tcPr>
+            <w:tcW w:type="dxa" w:w="7603"/>
+            <w:vAlign w:val="center"/>
+            <w:tcMar>
+              <w:top w:w="55" w:type="dxa"/>
+              <w:bottom w:w="55" w:type="dxa"/>
+              <w:left w:w="75" w:type="dxa"/>
+              <w:right w:w="75" w:type="dxa"/>
+            </w:tcMar>
+            <w:tcBorders>
+              <w:top w:val="single" w:sz="4" w:color="D9D9D9"/>
+              <w:bottom w:val="single" w:sz="4" w:color="D9D9D9"/>
+              <w:left w:val="single" w:sz="4" w:color="D9D9D9"/>
+              <w:right w:val="single" w:sz="4" w:color="D9D9D9"/>
+            </w:tcBorders>
+          </w:tcPr>
+          <w:p>
+            <w:pPr>
+              <w:spacing w:after="20" w:line="240" w:lineRule="auto"/>
+            </w:pPr>
+            <w:r>
+              <w:rPr>
+                <w:rFonts w:ascii="Calibri" w:hAnsi="Calibri"/>
+                <w:b w:val="0"/>
+                <w:sz w:val="18"/>
+              </w:rPr>
+              <w:t>Tests inherited 6 MiB data and parent isolation during fork with paging.</w:t>
+            </w:r>
+          </w:p>
+        </w:tc>
+      </w:tr>
+      <w:tr>
+        <w:trPr>
+          <w:cantSplit/>
+        </w:trPr>
+        <w:tc>
+          <w:tcPr>
+            <w:tcW w:type="dxa" w:w="2477"/>
+            <w:vAlign w:val="center"/>
+            <w:tcMar>
+              <w:top w:w="55" w:type="dxa"/>
+              <w:bottom w:w="55" w:type="dxa"/>
+              <w:left w:w="75" w:type="dxa"/>
+              <w:right w:w="75" w:type="dxa"/>
+            </w:tcMar>
+            <w:tcBorders>
+              <w:top w:val="single" w:sz="4" w:color="D9D9D9"/>
+              <w:bottom w:val="single" w:sz="4" w:color="D9D9D9"/>
+              <w:left w:val="single" w:sz="4" w:color="D9D9D9"/>
+              <w:right w:val="single" w:sz="4" w:color="D9D9D9"/>
+            </w:tcBorders>
+          </w:tcPr>
+          <w:p>
+            <w:pPr>
+              <w:spacing w:after="20" w:line="240" w:lineRule="auto"/>
+            </w:pPr>
+            <w:r>
+              <w:rPr>
+                <w:rFonts w:ascii="Calibri" w:hAnsi="Calibri"/>
+                <w:b w:val="0"/>
+                <w:sz w:val="18"/>
+              </w:rPr>
+              <w:t>user/hotcold.c</w:t>
+            </w:r>
+          </w:p>
+        </w:tc>
+        <w:tc>
+          <w:tcPr>
+            <w:tcW w:type="dxa" w:w="7603"/>
+            <w:vAlign w:val="center"/>
+            <w:tcMar>
+              <w:top w:w="55" w:type="dxa"/>
+              <w:bottom w:w="55" w:type="dxa"/>
+              <w:left w:w="75" w:type="dxa"/>
+              <w:right w:w="75" w:type="dxa"/>
+            </w:tcMar>
+            <w:tcBorders>
+              <w:top w:val="single" w:sz="4" w:color="D9D9D9"/>
+              <w:bottom w:val="single" w:sz="4" w:color="D9D9D9"/>
+              <w:left w:val="single" w:sz="4" w:color="D9D9D9"/>
+              <w:right w:val="single" w:sz="4" w:color="D9D9D9"/>
+            </w:tcBorders>
+          </w:tcPr>
+          <w:p>
+            <w:pPr>
+              <w:spacing w:after="20" w:line="240" w:lineRule="auto"/>
+            </w:pPr>
+            <w:r>
+              <w:rPr>
+                <w:rFonts w:ascii="Calibri" w:hAnsi="Calibri"/>
+                <w:b w:val="0"/>
+                <w:sz w:val="18"/>
+              </w:rPr>
+              <w:t>Creates cold scans and hot revisits to compare FIFO/Clock swap-count changes.</w:t>
+            </w:r>
+          </w:p>
+        </w:tc>
+      </w:tr>
+      <w:tr>
+        <w:trPr>
+          <w:cantSplit/>
+        </w:trPr>
+        <w:tc>
+          <w:tcPr>
+            <w:tcW w:type="dxa" w:w="2477"/>
+            <w:vAlign w:val="center"/>
+            <w:tcMar>
+              <w:top w:w="55" w:type="dxa"/>
+              <w:bottom w:w="55" w:type="dxa"/>
+              <w:left w:w="75" w:type="dxa"/>
+              <w:right w:w="75" w:type="dxa"/>
+            </w:tcMar>
+            <w:tcBorders>
+              <w:top w:val="single" w:sz="4" w:color="D9D9D9"/>
+              <w:bottom w:val="single" w:sz="4" w:color="D9D9D9"/>
+              <w:left w:val="single" w:sz="4" w:color="D9D9D9"/>
+              <w:right w:val="single" w:sz="4" w:color="D9D9D9"/>
+            </w:tcBorders>
+          </w:tcPr>
+          <w:p>
+            <w:pPr>
+              <w:spacing w:after="20" w:line="240" w:lineRule="auto"/>
+            </w:pPr>
+            <w:r>
+              <w:rPr>
+                <w:rFonts w:ascii="Calibri" w:hAnsi="Calibri"/>
+                <w:b w:val="0"/>
+                <w:sz w:val="18"/>
+              </w:rPr>
+              <w:t>user/memstat.c</w:t>
+            </w:r>
+          </w:p>
+        </w:tc>
+        <w:tc>
+          <w:tcPr>
+            <w:tcW w:type="dxa" w:w="7603"/>
+            <w:vAlign w:val="center"/>
+            <w:tcMar>
+              <w:top w:w="55" w:type="dxa"/>
+              <w:bottom w:w="55" w:type="dxa"/>
+              <w:left w:w="75" w:type="dxa"/>
+              <w:right w:w="75" w:type="dxa"/>
+            </w:tcMar>
+            <w:tcBorders>
+              <w:top w:val="single" w:sz="4" w:color="D9D9D9"/>
+              <w:bottom w:val="single" w:sz="4" w:color="D9D9D9"/>
+              <w:left w:val="single" w:sz="4" w:color="D9D9D9"/>
+              <w:right w:val="single" w:sz="4" w:color="D9D9D9"/>
+            </w:tcBorders>
+          </w:tcPr>
+          <w:p>
+            <w:pPr>
+              <w:spacing w:after="20" w:line="240" w:lineRule="auto"/>
+            </w:pPr>
+            <w:r>
+              <w:rPr>
+                <w:rFonts w:ascii="Calibri" w:hAnsi="Calibri"/>
+                <w:b w:val="0"/>
+                <w:sz w:val="18"/>
+              </w:rPr>
+              <w:t>Monitoring command that prints statistics; it is not a pressure workload.</w:t>
+            </w:r>
+          </w:p>
+        </w:tc>
+      </w:tr>
+    </w:tbl>
+    <w:p>
+      <w:pPr>
+        <w:spacing w:after="40" w:line="20" w:lineRule="exact"/>
+      </w:pPr>
+      <w:r>
+        <w:rPr>
+          <w:rFonts w:ascii="Calibri" w:hAnsi="Calibri"/>
+          <w:b w:val="0"/>
+          <w:sz w:val="19"/>
+        </w:rPr>
+      </w:r>
+    </w:p>
+    <w:p>
+      <w:pPr>
+        <w:spacing w:after="60" w:line="240" w:lineRule="auto"/>
+      </w:pPr>
+      <w:r>
+        <w:rPr>
+          <w:rFonts w:ascii="Calibri" w:hAnsi="Calibri"/>
+          <w:b w:val="0"/>
+          <w:sz w:val="19"/>
+        </w:rPr>
+        <w:t>Extended later: kernel/pgfault.c grew from lazy allocation into COW and swap recovery. kernel/swap.c grew from statistics into frame/slot tracking, disk transfers, FIFO and Clock.</w:t>
+      </w:r>
+    </w:p>
+    <w:p>
+      <w:pPr>
+        <w:pStyle w:val="Heading1"/>
+        <w:pageBreakBefore/>
+      </w:pPr>
+      <w:r>
+        <w:t>References and where they were used</w:t>
       </w:r>
     </w:p>
     <w:p>

</xml_diff>